<commit_message>
study aws set01 (25.10.31)
</commit_message>
<xml_diff>
--- a/비전공자도_이해할_수_있는_AWS_입문_실전/section01.docx
+++ b/비전공자도_이해할_수_있는_AWS_입문_실전/section01.docx
@@ -13,10 +13,7 @@
         <w:t>배포(</w:t>
       </w:r>
       <w:r>
-        <w:t>Deployment</w:t>
-      </w:r>
-      <w:r>
-        <w:t>)</w:t>
+        <w:t>Deployment)</w:t>
       </w:r>
       <w:r>
         <w:rPr>
@@ -26,11 +23,19 @@
       </w:r>
     </w:p>
     <w:p>
-      <w:r>
-        <w:rPr>
-          <w:rFonts w:hint="eastAsia"/>
-        </w:rPr>
-        <w:t>배포란 다른 사용자들이 인터넷을 통해서 사용할 수 있게 만드는 것을 의미한다.</w:t>
+      <w:proofErr w:type="spellStart"/>
+      <w:r>
+        <w:rPr>
+          <w:rFonts w:hint="eastAsia"/>
+        </w:rPr>
+        <w:t>배포란</w:t>
+      </w:r>
+      <w:proofErr w:type="spellEnd"/>
+      <w:r>
+        <w:rPr>
+          <w:rFonts w:hint="eastAsia"/>
+        </w:rPr>
+        <w:t xml:space="preserve"> 다른 사용자들이 인터넷을 통해서 사용할 수 있게 만드는 것을 의미한다.</w:t>
       </w:r>
       <w:r>
         <w:t xml:space="preserve"> </w:t>
@@ -105,15 +110,18 @@
         <w:t>7</w:t>
       </w:r>
       <w:r>
-        <w:t>.16.2.1)나 도메인(ex. www.naver.com)과 같이 고유의 주소를 부여받게 되고, 다른 컴퓨터에서 그 주소로 접속할 수 있게 된다. 이게 바로 배포다.</w:t>
-      </w:r>
-    </w:p>
-    <w:p>
-      <w:pPr>
-        <w:rPr>
-          <w:rFonts w:hint="eastAsia"/>
-        </w:rPr>
-      </w:pPr>
+        <w:t xml:space="preserve">.16.2.1)나 도메인(ex. www.naver.com)과 같이 고유의 주소를 </w:t>
+      </w:r>
+      <w:proofErr w:type="spellStart"/>
+      <w:r>
+        <w:t>부여받게</w:t>
+      </w:r>
+      <w:proofErr w:type="spellEnd"/>
+      <w:r>
+        <w:t xml:space="preserve"> 되고, 다른 컴퓨터에서 그 주소로 접속할 수 있게 된다. 이게 바로 배포다.</w:t>
+      </w:r>
+    </w:p>
+    <w:p>
       <w:r>
         <w:rPr>
           <w:rFonts w:hint="eastAsia"/>
@@ -130,13 +138,7 @@
         <w:t>그 다음 단계로 하는 것이 배포이다.</w:t>
       </w:r>
     </w:p>
-    <w:p>
-      <w:pPr>
-        <w:rPr>
-          <w:rFonts w:hint="eastAsia"/>
-        </w:rPr>
-      </w:pPr>
-    </w:p>
+    <w:p/>
     <w:p>
       <w:pPr>
         <w:pStyle w:val="1"/>
@@ -157,7 +159,15 @@
         <w:t>란?</w:t>
       </w:r>
       <w:r>
-        <w:t xml:space="preserve"> / EC2</w:t>
+        <w:t xml:space="preserve"> </w:t>
+      </w:r>
+      <w:proofErr w:type="gramStart"/>
+      <w:r>
+        <w:t>/ EC</w:t>
+      </w:r>
+      <w:proofErr w:type="gramEnd"/>
+      <w:r>
+        <w:t>2</w:t>
       </w:r>
       <w:r>
         <w:rPr>
@@ -166,13 +176,24 @@
         <w:t>를 왜 배울까?</w:t>
       </w:r>
       <w:r>
-        <w:t xml:space="preserve"> / </w:t>
-      </w:r>
-      <w:r>
-        <w:rPr>
-          <w:rFonts w:hint="eastAsia"/>
-        </w:rPr>
-        <w:t xml:space="preserve">현업에서 </w:t>
+        <w:t xml:space="preserve"> </w:t>
+      </w:r>
+      <w:proofErr w:type="gramStart"/>
+      <w:r>
+        <w:t xml:space="preserve">/ </w:t>
+      </w:r>
+      <w:r>
+        <w:rPr>
+          <w:rFonts w:hint="eastAsia"/>
+        </w:rPr>
+        <w:t>현업에서</w:t>
+      </w:r>
+      <w:proofErr w:type="gramEnd"/>
+      <w:r>
+        <w:rPr>
+          <w:rFonts w:hint="eastAsia"/>
+        </w:rPr>
+        <w:t xml:space="preserve"> </w:t>
       </w:r>
       <w:r>
         <w:t>EC2</w:t>
@@ -233,16 +254,44 @@
         <w:rPr>
           <w:rFonts w:hint="eastAsia"/>
         </w:rPr>
-        <w:t>시간 동안 컴퓨터를 켜놔야 하고,</w:t>
-      </w:r>
-      <w:r>
-        <w:t xml:space="preserve"> </w:t>
-      </w:r>
-      <w:r>
-        <w:rPr>
-          <w:rFonts w:hint="eastAsia"/>
-        </w:rPr>
-        <w:t xml:space="preserve">인터넷을 통해 내 컴퓨터에 접근할 수 있게 만들다보니 보안적으로도 위험할 수 있다. 이러한 불편함 때문에 </w:t>
+        <w:t xml:space="preserve">시간 동안 컴퓨터를 </w:t>
+      </w:r>
+      <w:proofErr w:type="spellStart"/>
+      <w:r>
+        <w:rPr>
+          <w:rFonts w:hint="eastAsia"/>
+        </w:rPr>
+        <w:t>켜놔야</w:t>
+      </w:r>
+      <w:proofErr w:type="spellEnd"/>
+      <w:r>
+        <w:rPr>
+          <w:rFonts w:hint="eastAsia"/>
+        </w:rPr>
+        <w:t xml:space="preserve"> 하고,</w:t>
+      </w:r>
+      <w:r>
+        <w:t xml:space="preserve"> </w:t>
+      </w:r>
+      <w:r>
+        <w:rPr>
+          <w:rFonts w:hint="eastAsia"/>
+        </w:rPr>
+        <w:t xml:space="preserve">인터넷을 통해 내 컴퓨터에 접근할 수 있게 </w:t>
+      </w:r>
+      <w:proofErr w:type="spellStart"/>
+      <w:r>
+        <w:rPr>
+          <w:rFonts w:hint="eastAsia"/>
+        </w:rPr>
+        <w:t>만들다보니</w:t>
+      </w:r>
+      <w:proofErr w:type="spellEnd"/>
+      <w:r>
+        <w:rPr>
+          <w:rFonts w:hint="eastAsia"/>
+        </w:rPr>
+        <w:t xml:space="preserve"> 보안적으로도 위험할 수 있다. 이러한 불편함 때문에 </w:t>
       </w:r>
       <w:r>
         <w:t>AWS EC2</w:t>
@@ -259,7 +308,21 @@
         <w:rPr>
           <w:rFonts w:hint="eastAsia"/>
         </w:rPr>
-        <w:t xml:space="preserve">현업에서도 실제 백엔드 서버를 배포할 때 </w:t>
+        <w:t xml:space="preserve">현업에서도 실제 </w:t>
+      </w:r>
+      <w:proofErr w:type="spellStart"/>
+      <w:r>
+        <w:rPr>
+          <w:rFonts w:hint="eastAsia"/>
+        </w:rPr>
+        <w:t>백엔드</w:t>
+      </w:r>
+      <w:proofErr w:type="spellEnd"/>
+      <w:r>
+        <w:rPr>
+          <w:rFonts w:hint="eastAsia"/>
+        </w:rPr>
+        <w:t xml:space="preserve"> 서버를 배포할 때 </w:t>
       </w:r>
       <w:r>
         <w:t>EC2</w:t>
@@ -273,11 +336,19 @@
       <w:r>
         <w:t xml:space="preserve"> </w:t>
       </w:r>
-      <w:r>
-        <w:rPr>
-          <w:rFonts w:hint="eastAsia"/>
-        </w:rPr>
-        <w:t xml:space="preserve">프론트엔드 웹 페이지를 사용할 </w:t>
+      <w:proofErr w:type="spellStart"/>
+      <w:r>
+        <w:rPr>
+          <w:rFonts w:hint="eastAsia"/>
+        </w:rPr>
+        <w:t>프론트엔드</w:t>
+      </w:r>
+      <w:proofErr w:type="spellEnd"/>
+      <w:r>
+        <w:rPr>
+          <w:rFonts w:hint="eastAsia"/>
+        </w:rPr>
+        <w:t xml:space="preserve"> 웹 페이지를 사용할 </w:t>
       </w:r>
       <w:r>
         <w:rPr>
@@ -295,8 +366,21 @@
         </w:rPr>
         <w:t xml:space="preserve">주로 </w:t>
       </w:r>
-      <w:r>
-        <w:t xml:space="preserve">vercel, netlify </w:t>
+      <w:proofErr w:type="spellStart"/>
+      <w:r>
+        <w:t>vercel</w:t>
+      </w:r>
+      <w:proofErr w:type="spellEnd"/>
+      <w:r>
+        <w:t xml:space="preserve">, </w:t>
+      </w:r>
+      <w:proofErr w:type="spellStart"/>
+      <w:r>
+        <w:t>netlify</w:t>
+      </w:r>
+      <w:proofErr w:type="spellEnd"/>
+      <w:r>
+        <w:t xml:space="preserve"> </w:t>
       </w:r>
       <w:r>
         <w:rPr>
@@ -328,11 +412,19 @@
       <w:r>
         <w:t xml:space="preserve">] 1. </w:t>
       </w:r>
-      <w:r>
-        <w:rPr>
-          <w:rFonts w:hint="eastAsia"/>
-        </w:rPr>
-        <w:t>리전(</w:t>
+      <w:proofErr w:type="spellStart"/>
+      <w:r>
+        <w:rPr>
+          <w:rFonts w:hint="eastAsia"/>
+        </w:rPr>
+        <w:t>리전</w:t>
+      </w:r>
+      <w:proofErr w:type="spellEnd"/>
+      <w:r>
+        <w:rPr>
+          <w:rFonts w:hint="eastAsia"/>
+        </w:rPr>
+        <w:t>(</w:t>
       </w:r>
       <w:r>
         <w:t xml:space="preserve">Region) </w:t>
@@ -367,11 +459,28 @@
         <w:rPr>
           <w:rFonts w:hint="eastAsia"/>
         </w:rPr>
-        <w:t xml:space="preserve"> 서비스로 들어가서 리전을 선택한다.</w:t>
-      </w:r>
-    </w:p>
-    <w:p>
-      <w:r>
+        <w:t xml:space="preserve"> 서비스로 들어가서 </w:t>
+      </w:r>
+      <w:proofErr w:type="spellStart"/>
+      <w:r>
+        <w:rPr>
+          <w:rFonts w:hint="eastAsia"/>
+        </w:rPr>
+        <w:t>리전을</w:t>
+      </w:r>
+      <w:proofErr w:type="spellEnd"/>
+      <w:r>
+        <w:rPr>
+          <w:rFonts w:hint="eastAsia"/>
+        </w:rPr>
+        <w:t xml:space="preserve"> 선택한다.</w:t>
+      </w:r>
+    </w:p>
+    <w:p>
+      <w:r>
+        <w:rPr>
+          <w:noProof/>
+        </w:rPr>
         <w:drawing>
           <wp:inline distT="0" distB="0" distL="0" distR="0" wp14:anchorId="7E862543" wp14:editId="175E3FF9">
             <wp:extent cx="5731510" cy="3923665"/>
@@ -423,7 +532,21 @@
         <w:rPr>
           <w:rFonts w:hint="eastAsia"/>
         </w:rPr>
-        <w:t>를 시작하기 위해서는 우선적으로 리전을 먼저 선택해야 한다.</w:t>
+        <w:t xml:space="preserve">를 시작하기 위해서는 우선적으로 </w:t>
+      </w:r>
+      <w:proofErr w:type="spellStart"/>
+      <w:r>
+        <w:rPr>
+          <w:rFonts w:hint="eastAsia"/>
+        </w:rPr>
+        <w:t>리전을</w:t>
+      </w:r>
+      <w:proofErr w:type="spellEnd"/>
+      <w:r>
+        <w:rPr>
+          <w:rFonts w:hint="eastAsia"/>
+        </w:rPr>
+        <w:t xml:space="preserve"> 먼저 선택해야 한다.</w:t>
       </w:r>
     </w:p>
     <w:p>
@@ -477,7 +600,21 @@
         <w:rPr>
           <w:rFonts w:hint="eastAsia"/>
         </w:rPr>
-        <w:t>를 통해 빌려서 쓸 수 있는 컴퓨터들이 전 세계적으로 다양하게 분포해있다.</w:t>
+        <w:t xml:space="preserve">를 통해 빌려서 쓸 수 있는 컴퓨터들이 전 세계적으로 다양하게 </w:t>
+      </w:r>
+      <w:proofErr w:type="spellStart"/>
+      <w:r>
+        <w:rPr>
+          <w:rFonts w:hint="eastAsia"/>
+        </w:rPr>
+        <w:t>분포해있다</w:t>
+      </w:r>
+      <w:proofErr w:type="spellEnd"/>
+      <w:r>
+        <w:rPr>
+          <w:rFonts w:hint="eastAsia"/>
+        </w:rPr>
+        <w:t>.</w:t>
       </w:r>
       <w:r>
         <w:t xml:space="preserve"> </w:t>
@@ -502,11 +639,19 @@
       <w:pPr>
         <w:pStyle w:val="2"/>
       </w:pPr>
-      <w:r>
-        <w:rPr>
-          <w:rFonts w:hint="eastAsia"/>
-        </w:rPr>
-        <w:t>리전의 특징</w:t>
+      <w:proofErr w:type="spellStart"/>
+      <w:r>
+        <w:rPr>
+          <w:rFonts w:hint="eastAsia"/>
+        </w:rPr>
+        <w:t>리전의</w:t>
+      </w:r>
+      <w:proofErr w:type="spellEnd"/>
+      <w:r>
+        <w:rPr>
+          <w:rFonts w:hint="eastAsia"/>
+        </w:rPr>
+        <w:t xml:space="preserve"> 특징</w:t>
       </w:r>
     </w:p>
     <w:p>
@@ -531,7 +676,21 @@
         <w:rPr>
           <w:rFonts w:hint="eastAsia"/>
         </w:rPr>
-        <w:t>는 전 세계적으로 다양한 리전을 보유하고 있다.</w:t>
+        <w:t xml:space="preserve">는 전 세계적으로 다양한 </w:t>
+      </w:r>
+      <w:proofErr w:type="spellStart"/>
+      <w:r>
+        <w:rPr>
+          <w:rFonts w:hint="eastAsia"/>
+        </w:rPr>
+        <w:t>리전을</w:t>
+      </w:r>
+      <w:proofErr w:type="spellEnd"/>
+      <w:r>
+        <w:rPr>
+          <w:rFonts w:hint="eastAsia"/>
+        </w:rPr>
+        <w:t xml:space="preserve"> 보유하고 있다.</w:t>
       </w:r>
       <w:r>
         <w:br/>
@@ -604,7 +763,21 @@
         <w:rPr>
           <w:rFonts w:hint="eastAsia"/>
         </w:rPr>
-        <w:t>각 리전은 고유의 이름을 가지고 있다.</w:t>
+        <w:t xml:space="preserve">각 </w:t>
+      </w:r>
+      <w:proofErr w:type="spellStart"/>
+      <w:r>
+        <w:rPr>
+          <w:rFonts w:hint="eastAsia"/>
+        </w:rPr>
+        <w:t>리전은</w:t>
+      </w:r>
+      <w:proofErr w:type="spellEnd"/>
+      <w:r>
+        <w:rPr>
+          <w:rFonts w:hint="eastAsia"/>
+        </w:rPr>
+        <w:t xml:space="preserve"> 고유의 이름을 가지고 있다.</w:t>
       </w:r>
       <w:r>
         <w:br/>
@@ -620,11 +793,19 @@
         </w:numPr>
         <w:ind w:leftChars="0"/>
       </w:pPr>
-      <w:r>
-        <w:rPr>
-          <w:rFonts w:hint="eastAsia"/>
-        </w:rPr>
-        <w:t>리전은 어떤 기준으로 선택할까?</w:t>
+      <w:proofErr w:type="spellStart"/>
+      <w:r>
+        <w:rPr>
+          <w:rFonts w:hint="eastAsia"/>
+        </w:rPr>
+        <w:t>리전은</w:t>
+      </w:r>
+      <w:proofErr w:type="spellEnd"/>
+      <w:r>
+        <w:rPr>
+          <w:rFonts w:hint="eastAsia"/>
+        </w:rPr>
+        <w:t xml:space="preserve"> 어떤 기준으로 선택할까?</w:t>
       </w:r>
       <w:r>
         <w:br/>
@@ -660,7 +841,21 @@
         <w:rPr>
           <w:rFonts w:hint="eastAsia"/>
         </w:rPr>
-        <w:t>따라서 애플리케이션의 주된 사용자들의 위치와 지리적으로 가까운 리전을 사용하는 것이 유리하다.</w:t>
+        <w:t xml:space="preserve">따라서 애플리케이션의 주된 사용자들의 위치와 지리적으로 가까운 </w:t>
+      </w:r>
+      <w:proofErr w:type="spellStart"/>
+      <w:r>
+        <w:rPr>
+          <w:rFonts w:hint="eastAsia"/>
+        </w:rPr>
+        <w:t>리전을</w:t>
+      </w:r>
+      <w:proofErr w:type="spellEnd"/>
+      <w:r>
+        <w:rPr>
+          <w:rFonts w:hint="eastAsia"/>
+        </w:rPr>
+        <w:t xml:space="preserve"> 사용하는 것이 유리하다.</w:t>
       </w:r>
       <w:r>
         <w:br/>
@@ -678,7 +873,35 @@
         <w:rPr>
           <w:rFonts w:hint="eastAsia"/>
         </w:rPr>
-        <w:t>한국 유저들이 주로 사용하는 서비스를 만들거라면 리전을 아시아 태평양(서울)로 선택하면 된다.</w:t>
+        <w:t xml:space="preserve">한국 유저들이 주로 사용하는 서비스를 </w:t>
+      </w:r>
+      <w:proofErr w:type="spellStart"/>
+      <w:r>
+        <w:rPr>
+          <w:rFonts w:hint="eastAsia"/>
+        </w:rPr>
+        <w:t>만들거라면</w:t>
+      </w:r>
+      <w:proofErr w:type="spellEnd"/>
+      <w:r>
+        <w:rPr>
+          <w:rFonts w:hint="eastAsia"/>
+        </w:rPr>
+        <w:t xml:space="preserve"> </w:t>
+      </w:r>
+      <w:proofErr w:type="spellStart"/>
+      <w:r>
+        <w:rPr>
+          <w:rFonts w:hint="eastAsia"/>
+        </w:rPr>
+        <w:t>리전을</w:t>
+      </w:r>
+      <w:proofErr w:type="spellEnd"/>
+      <w:r>
+        <w:rPr>
+          <w:rFonts w:hint="eastAsia"/>
+        </w:rPr>
+        <w:t xml:space="preserve"> 아시아 태평양(서울)로 선택하면 된다.</w:t>
       </w:r>
     </w:p>
     <w:p>
@@ -721,7 +944,21 @@
         <w:rPr>
           <w:rFonts w:hint="eastAsia"/>
         </w:rPr>
-        <w:t>를 생성해놓고,</w:t>
+        <w:t xml:space="preserve">를 </w:t>
+      </w:r>
+      <w:proofErr w:type="spellStart"/>
+      <w:r>
+        <w:rPr>
+          <w:rFonts w:hint="eastAsia"/>
+        </w:rPr>
+        <w:t>생성해놓고</w:t>
+      </w:r>
+      <w:proofErr w:type="spellEnd"/>
+      <w:r>
+        <w:rPr>
+          <w:rFonts w:hint="eastAsia"/>
+        </w:rPr>
+        <w:t>,</w:t>
       </w:r>
       <w:r>
         <w:t xml:space="preserve"> </w:t>
@@ -735,11 +972,19 @@
       <w:r>
         <w:t xml:space="preserve"> </w:t>
       </w:r>
-      <w:r>
-        <w:rPr>
-          <w:rFonts w:hint="eastAsia"/>
-        </w:rPr>
-        <w:t xml:space="preserve">리전에 들어가서 생성한 </w:t>
+      <w:proofErr w:type="spellStart"/>
+      <w:r>
+        <w:rPr>
+          <w:rFonts w:hint="eastAsia"/>
+        </w:rPr>
+        <w:t>리전에</w:t>
+      </w:r>
+      <w:proofErr w:type="spellEnd"/>
+      <w:r>
+        <w:rPr>
+          <w:rFonts w:hint="eastAsia"/>
+        </w:rPr>
+        <w:t xml:space="preserve"> 들어가서 생성한 </w:t>
       </w:r>
       <w:r>
         <w:t>EC2</w:t>
@@ -792,11 +1037,19 @@
       <w:r>
         <w:t xml:space="preserve">C2 </w:t>
       </w:r>
-      <w:r>
-        <w:rPr>
-          <w:rFonts w:hint="eastAsia"/>
-        </w:rPr>
-        <w:t xml:space="preserve">셋팅하기 </w:t>
+      <w:proofErr w:type="spellStart"/>
+      <w:r>
+        <w:rPr>
+          <w:rFonts w:hint="eastAsia"/>
+        </w:rPr>
+        <w:t>셋팅하기</w:t>
+      </w:r>
+      <w:proofErr w:type="spellEnd"/>
+      <w:r>
+        <w:rPr>
+          <w:rFonts w:hint="eastAsia"/>
+        </w:rPr>
+        <w:t xml:space="preserve"> </w:t>
       </w:r>
       <w:r>
         <w:t xml:space="preserve">- </w:t>
@@ -829,12 +1082,10 @@
       </w:r>
     </w:p>
     <w:p>
-      <w:pPr>
-        <w:rPr>
-          <w:rFonts w:hint="eastAsia"/>
-        </w:rPr>
-      </w:pPr>
-      <w:r>
+      <w:r>
+        <w:rPr>
+          <w:noProof/>
+        </w:rPr>
         <w:drawing>
           <wp:inline distT="0" distB="0" distL="0" distR="0" wp14:anchorId="48F1D530" wp14:editId="008C684F">
             <wp:extent cx="5039428" cy="1714739"/>
@@ -873,11 +1124,6 @@
       </w:r>
     </w:p>
     <w:p>
-      <w:pPr>
-        <w:rPr>
-          <w:rFonts w:hint="eastAsia"/>
-        </w:rPr>
-      </w:pPr>
       <w:r>
         <w:rPr>
           <w:rFonts w:hint="eastAsia"/>
@@ -925,12 +1171,10 @@
       </w:r>
     </w:p>
     <w:p>
-      <w:pPr>
-        <w:rPr>
-          <w:rFonts w:hint="eastAsia"/>
-        </w:rPr>
-      </w:pPr>
-      <w:r>
+      <w:r>
+        <w:rPr>
+          <w:noProof/>
+        </w:rPr>
         <w:drawing>
           <wp:inline distT="0" distB="0" distL="0" distR="0" wp14:anchorId="19DB4ADA" wp14:editId="3FC2B272">
             <wp:extent cx="5731510" cy="1009650"/>
@@ -969,11 +1213,6 @@
       </w:r>
     </w:p>
     <w:p>
-      <w:pPr>
-        <w:rPr>
-          <w:rFonts w:hint="eastAsia"/>
-        </w:rPr>
-      </w:pPr>
       <w:r>
         <w:rPr>
           <w:rFonts w:hint="eastAsia"/>
@@ -1032,12 +1271,10 @@
       </w:r>
     </w:p>
     <w:p>
-      <w:pPr>
-        <w:rPr>
-          <w:rFonts w:hint="eastAsia"/>
-        </w:rPr>
-      </w:pPr>
-      <w:r>
+      <w:r>
+        <w:rPr>
+          <w:noProof/>
+        </w:rPr>
         <w:drawing>
           <wp:inline distT="0" distB="0" distL="0" distR="0" wp14:anchorId="08AFFE65" wp14:editId="16D24974">
             <wp:extent cx="5731510" cy="4451985"/>
@@ -1076,11 +1313,6 @@
       </w:r>
     </w:p>
     <w:p>
-      <w:pPr>
-        <w:rPr>
-          <w:rFonts w:hint="eastAsia"/>
-        </w:rPr>
-      </w:pPr>
       <w:r>
         <w:t>OS</w:t>
       </w:r>
@@ -1185,12 +1417,10 @@
       </w:r>
     </w:p>
     <w:p>
-      <w:pPr>
-        <w:rPr>
-          <w:rFonts w:hint="eastAsia"/>
-        </w:rPr>
-      </w:pPr>
-      <w:r>
+      <w:r>
+        <w:rPr>
+          <w:noProof/>
+        </w:rPr>
         <w:drawing>
           <wp:inline distT="0" distB="0" distL="0" distR="0" wp14:anchorId="3BD8F9D9" wp14:editId="34D4B6A4">
             <wp:extent cx="5731510" cy="1375410"/>
@@ -1238,11 +1468,19 @@
       <w:r>
         <w:t xml:space="preserve"> </w:t>
       </w:r>
-      <w:r>
-        <w:rPr>
-          <w:rFonts w:hint="eastAsia"/>
-        </w:rPr>
-        <w:t>인스턴스란,</w:t>
+      <w:proofErr w:type="spellStart"/>
+      <w:r>
+        <w:rPr>
+          <w:rFonts w:hint="eastAsia"/>
+        </w:rPr>
+        <w:t>인스턴스란</w:t>
+      </w:r>
+      <w:proofErr w:type="spellEnd"/>
+      <w:r>
+        <w:rPr>
+          <w:rFonts w:hint="eastAsia"/>
+        </w:rPr>
+        <w:t>,</w:t>
       </w:r>
       <w:r>
         <w:t xml:space="preserve"> AWS </w:t>
@@ -1308,16 +1546,25 @@
       </w:r>
     </w:p>
     <w:p>
-      <w:pPr>
-        <w:rPr>
-          <w:rFonts w:hint="eastAsia"/>
-        </w:rPr>
-      </w:pPr>
-      <w:r>
-        <w:rPr>
-          <w:rFonts w:hint="eastAsia"/>
-        </w:rPr>
-        <w:t>많이 오해하는 게 프리티어가 붙어있는 것들은 학습할 때나 테스트할 때만 쓰는 안 좋은 사양의 컴퓨터라고 생각한다.</w:t>
+      <w:r>
+        <w:rPr>
+          <w:rFonts w:hint="eastAsia"/>
+        </w:rPr>
+        <w:t xml:space="preserve">많이 오해하는 게 </w:t>
+      </w:r>
+      <w:proofErr w:type="spellStart"/>
+      <w:r>
+        <w:rPr>
+          <w:rFonts w:hint="eastAsia"/>
+        </w:rPr>
+        <w:t>프리티어가</w:t>
+      </w:r>
+      <w:proofErr w:type="spellEnd"/>
+      <w:r>
+        <w:rPr>
+          <w:rFonts w:hint="eastAsia"/>
+        </w:rPr>
+        <w:t xml:space="preserve"> 붙어있는 것들은 학습할 때나 테스트할 때만 쓰는 안 좋은 사양의 컴퓨터라고 생각한다.</w:t>
       </w:r>
       <w:r>
         <w:t xml:space="preserve"> </w:t>
@@ -1350,12 +1597,10 @@
       </w:r>
     </w:p>
     <w:p>
-      <w:pPr>
-        <w:rPr>
-          <w:rFonts w:hint="eastAsia"/>
-        </w:rPr>
-      </w:pPr>
-      <w:r>
+      <w:r>
+        <w:rPr>
+          <w:noProof/>
+        </w:rPr>
         <w:drawing>
           <wp:inline distT="0" distB="0" distL="0" distR="0" wp14:anchorId="110E52A1" wp14:editId="4D5098CC">
             <wp:extent cx="5731510" cy="1018540"/>
@@ -1394,11 +1639,6 @@
       </w:r>
     </w:p>
     <w:p>
-      <w:pPr>
-        <w:rPr>
-          <w:rFonts w:hint="eastAsia"/>
-        </w:rPr>
-      </w:pPr>
       <w:r>
         <w:rPr>
           <w:rFonts w:hint="eastAsia"/>
@@ -1435,6 +1675,9 @@
     </w:p>
     <w:p>
       <w:r>
+        <w:rPr>
+          <w:noProof/>
+        </w:rPr>
         <w:lastRenderedPageBreak/>
         <w:drawing>
           <wp:inline distT="0" distB="0" distL="0" distR="0" wp14:anchorId="2FD40095" wp14:editId="73273096">
@@ -1500,6 +1743,7 @@
       <w:r>
         <w:t>SA</w:t>
       </w:r>
+      <w:proofErr w:type="gramStart"/>
       <w:r>
         <w:rPr>
           <w:rFonts w:hint="eastAsia"/>
@@ -1507,8 +1751,14 @@
         <w:t xml:space="preserve">와 </w:t>
       </w:r>
       <w:r>
-        <w:t>.pem</w:t>
-      </w:r>
+        <w:t>.</w:t>
+      </w:r>
+      <w:proofErr w:type="spellStart"/>
+      <w:r>
+        <w:t>pem</w:t>
+      </w:r>
+      <w:proofErr w:type="spellEnd"/>
+      <w:proofErr w:type="gramEnd"/>
       <w:r>
         <w:rPr>
           <w:rFonts w:hint="eastAsia"/>
@@ -1522,16 +1772,51 @@
         <w:rPr>
           <w:rFonts w:hint="eastAsia"/>
         </w:rPr>
-        <w:t>가 뭔지,</w:t>
-      </w:r>
-      <w:r>
-        <w:t xml:space="preserve"> .ppk</w:t>
-      </w:r>
-      <w:r>
-        <w:rPr>
-          <w:rFonts w:hint="eastAsia"/>
-        </w:rPr>
-        <w:t>가 뭔지는 몰라도 된다.</w:t>
+        <w:t xml:space="preserve">가 </w:t>
+      </w:r>
+      <w:proofErr w:type="spellStart"/>
+      <w:r>
+        <w:rPr>
+          <w:rFonts w:hint="eastAsia"/>
+        </w:rPr>
+        <w:t>뭔지</w:t>
+      </w:r>
+      <w:proofErr w:type="spellEnd"/>
+      <w:proofErr w:type="gramStart"/>
+      <w:r>
+        <w:rPr>
+          <w:rFonts w:hint="eastAsia"/>
+        </w:rPr>
+        <w:t>,</w:t>
+      </w:r>
+      <w:r>
+        <w:t xml:space="preserve"> .</w:t>
+      </w:r>
+      <w:proofErr w:type="spellStart"/>
+      <w:r>
+        <w:t>ppk</w:t>
+      </w:r>
+      <w:proofErr w:type="spellEnd"/>
+      <w:proofErr w:type="gramEnd"/>
+      <w:r>
+        <w:rPr>
+          <w:rFonts w:hint="eastAsia"/>
+        </w:rPr>
+        <w:t xml:space="preserve">가 </w:t>
+      </w:r>
+      <w:proofErr w:type="spellStart"/>
+      <w:r>
+        <w:rPr>
+          <w:rFonts w:hint="eastAsia"/>
+        </w:rPr>
+        <w:t>뭔지는</w:t>
+      </w:r>
+      <w:proofErr w:type="spellEnd"/>
+      <w:r>
+        <w:rPr>
+          <w:rFonts w:hint="eastAsia"/>
+        </w:rPr>
+        <w:t xml:space="preserve"> 몰라도 된다.</w:t>
       </w:r>
       <w:r>
         <w:t xml:space="preserve"> </w:t>
@@ -1548,27 +1833,50 @@
         <w:rPr>
           <w:rFonts w:hint="eastAsia"/>
         </w:rPr>
-        <w:t>키 페어를 생성하면 파일이 하나 다운받아질텐데,</w:t>
-      </w:r>
-      <w:r>
-        <w:t xml:space="preserve"> </w:t>
-      </w:r>
-      <w:r>
-        <w:rPr>
-          <w:rFonts w:hint="eastAsia"/>
-        </w:rPr>
-        <w:t>그 파일은 잃어버리면 안 되니 잘 보관해놔야 한다.</w:t>
-      </w:r>
-      <w:r>
-        <w:t xml:space="preserve"> </w:t>
-      </w:r>
-    </w:p>
-    <w:p>
-      <w:pPr>
-        <w:rPr>
-          <w:rFonts w:hint="eastAsia"/>
-        </w:rPr>
-      </w:pPr>
+        <w:t xml:space="preserve">키 페어를 생성하면 파일이 하나 </w:t>
+      </w:r>
+      <w:proofErr w:type="spellStart"/>
+      <w:r>
+        <w:rPr>
+          <w:rFonts w:hint="eastAsia"/>
+        </w:rPr>
+        <w:t>다운받아질텐데</w:t>
+      </w:r>
+      <w:proofErr w:type="spellEnd"/>
+      <w:r>
+        <w:rPr>
+          <w:rFonts w:hint="eastAsia"/>
+        </w:rPr>
+        <w:t>,</w:t>
+      </w:r>
+      <w:r>
+        <w:t xml:space="preserve"> </w:t>
+      </w:r>
+      <w:r>
+        <w:rPr>
+          <w:rFonts w:hint="eastAsia"/>
+        </w:rPr>
+        <w:t xml:space="preserve">그 파일은 잃어버리면 안 되니 잘 </w:t>
+      </w:r>
+      <w:proofErr w:type="spellStart"/>
+      <w:r>
+        <w:rPr>
+          <w:rFonts w:hint="eastAsia"/>
+        </w:rPr>
+        <w:t>보관해놔야</w:t>
+      </w:r>
+      <w:proofErr w:type="spellEnd"/>
+      <w:r>
+        <w:rPr>
+          <w:rFonts w:hint="eastAsia"/>
+        </w:rPr>
+        <w:t xml:space="preserve"> 한다.</w:t>
+      </w:r>
+      <w:r>
+        <w:t xml:space="preserve"> </w:t>
+      </w:r>
+    </w:p>
+    <w:p>
       <w:r>
         <w:rPr>
           <w:rFonts w:hint="eastAsia"/>
@@ -1600,15 +1908,20 @@
       </w:pPr>
       <w:r>
         <w:lastRenderedPageBreak/>
-        <w:t>[실습] 3. EC2 셋팅하기 - 보안그룹 설정</w:t>
+        <w:t xml:space="preserve">[실습] 3. EC2 </w:t>
+      </w:r>
+      <w:proofErr w:type="spellStart"/>
+      <w:r>
+        <w:t>셋팅하기</w:t>
+      </w:r>
+      <w:proofErr w:type="spellEnd"/>
+      <w:r>
+        <w:t xml:space="preserve"> - 보안그룹 설정</w:t>
       </w:r>
     </w:p>
     <w:p>
       <w:pPr>
         <w:pStyle w:val="2"/>
-        <w:rPr>
-          <w:rFonts w:hint="eastAsia"/>
-        </w:rPr>
       </w:pPr>
       <w:r>
         <w:rPr>
@@ -1674,6 +1987,9 @@
     </w:p>
     <w:p>
       <w:r>
+        <w:rPr>
+          <w:noProof/>
+        </w:rPr>
         <w:drawing>
           <wp:inline distT="0" distB="0" distL="0" distR="0" wp14:anchorId="03C5DD69" wp14:editId="218AF3ED">
             <wp:extent cx="5731510" cy="3222625"/>
@@ -1713,6 +2029,9 @@
     </w:p>
     <w:p>
       <w:r>
+        <w:rPr>
+          <w:noProof/>
+        </w:rPr>
         <w:lastRenderedPageBreak/>
         <w:drawing>
           <wp:inline distT="0" distB="0" distL="0" distR="0" wp14:anchorId="134B48DD" wp14:editId="32D4BBB6">
@@ -1752,11 +2071,6 @@
       </w:r>
     </w:p>
     <w:p>
-      <w:pPr>
-        <w:rPr>
-          <w:rFonts w:hint="eastAsia"/>
-        </w:rPr>
-      </w:pPr>
       <w:r>
         <w:rPr>
           <w:rFonts w:hint="eastAsia"/>
@@ -1820,7 +2134,7 @@
     </w:p>
     <w:p>
       <w:pPr>
-        <w:pStyle w:val="1"/>
+        <w:pStyle w:val="2"/>
       </w:pPr>
       <w:r>
         <w:rPr>
@@ -1933,7 +2247,21 @@
         <w:rPr>
           <w:rFonts w:hint="eastAsia"/>
         </w:rPr>
-        <w:t>보안 그룹은 집 바깥 쪽에서 쳐져있는 울타리와 대문이라고 생각하면 된다.</w:t>
+        <w:t xml:space="preserve">보안 그룹은 집 바깥 쪽에서 </w:t>
+      </w:r>
+      <w:proofErr w:type="spellStart"/>
+      <w:r>
+        <w:rPr>
+          <w:rFonts w:hint="eastAsia"/>
+        </w:rPr>
+        <w:t>쳐져있는</w:t>
+      </w:r>
+      <w:proofErr w:type="spellEnd"/>
+      <w:r>
+        <w:rPr>
+          <w:rFonts w:hint="eastAsia"/>
+        </w:rPr>
+        <w:t xml:space="preserve"> 울타리와 대문이라고 생각하면 된다.</w:t>
       </w:r>
       <w:r>
         <w:t xml:space="preserve"> </w:t>
@@ -1986,7 +2314,21 @@
         <w:rPr>
           <w:rFonts w:hint="eastAsia"/>
         </w:rPr>
-        <w:t>이 보안 규칙에는 인바운드 트래픽(즉,</w:t>
+        <w:t xml:space="preserve">이 보안 규칙에는 </w:t>
+      </w:r>
+      <w:proofErr w:type="spellStart"/>
+      <w:r>
+        <w:rPr>
+          <w:rFonts w:hint="eastAsia"/>
+        </w:rPr>
+        <w:t>인바운드</w:t>
+      </w:r>
+      <w:proofErr w:type="spellEnd"/>
+      <w:r>
+        <w:rPr>
+          <w:rFonts w:hint="eastAsia"/>
+        </w:rPr>
+        <w:t xml:space="preserve"> 트래픽(즉,</w:t>
       </w:r>
       <w:r>
         <w:t xml:space="preserve"> </w:t>
@@ -2009,11 +2351,19 @@
       <w:r>
         <w:t xml:space="preserve"> </w:t>
       </w:r>
-      <w:r>
-        <w:rPr>
-          <w:rFonts w:hint="eastAsia"/>
-        </w:rPr>
-        <w:t>아웃바운드 트래픽(즉,</w:t>
+      <w:proofErr w:type="spellStart"/>
+      <w:r>
+        <w:rPr>
+          <w:rFonts w:hint="eastAsia"/>
+        </w:rPr>
+        <w:t>아웃바운드</w:t>
+      </w:r>
+      <w:proofErr w:type="spellEnd"/>
+      <w:r>
+        <w:rPr>
+          <w:rFonts w:hint="eastAsia"/>
+        </w:rPr>
+        <w:t xml:space="preserve"> 트래픽(즉,</w:t>
       </w:r>
       <w:r>
         <w:t xml:space="preserve"> EC2 </w:t>
@@ -2026,11 +2376,6 @@
       </w:r>
     </w:p>
     <w:p>
-      <w:pPr>
-        <w:rPr>
-          <w:rFonts w:hint="eastAsia"/>
-        </w:rPr>
-      </w:pPr>
       <w:r>
         <w:rPr>
           <w:rFonts w:hint="eastAsia"/>
@@ -2056,151 +2401,784 @@
     </w:p>
     <w:p>
       <w:pPr>
+        <w:pStyle w:val="2"/>
+      </w:pPr>
+      <w:r>
+        <w:rPr>
+          <w:rFonts w:hint="eastAsia"/>
+        </w:rPr>
+        <w:t>보안그룹 설정</w:t>
+      </w:r>
+    </w:p>
+    <w:p>
+      <w:r>
+        <w:rPr>
+          <w:rFonts w:hint="eastAsia"/>
+        </w:rPr>
+        <w:t xml:space="preserve">외부에서 </w:t>
+      </w:r>
+      <w:r>
+        <w:t>EC2</w:t>
+      </w:r>
+      <w:r>
+        <w:rPr>
+          <w:rFonts w:hint="eastAsia"/>
+        </w:rPr>
+        <w:t xml:space="preserve">로 접근할 포트는 </w:t>
+      </w:r>
+      <w:r>
+        <w:t>22</w:t>
+      </w:r>
+      <w:r>
+        <w:rPr>
+          <w:rFonts w:hint="eastAsia"/>
+        </w:rPr>
+        <w:t xml:space="preserve">번 포트와 </w:t>
+      </w:r>
+      <w:r>
+        <w:t>80</w:t>
+      </w:r>
+      <w:r>
+        <w:rPr>
+          <w:rFonts w:hint="eastAsia"/>
+        </w:rPr>
+        <w:t xml:space="preserve">번 포트라고 생각해서 </w:t>
+      </w:r>
+      <w:r>
+        <w:t>2</w:t>
+      </w:r>
+      <w:r>
+        <w:rPr>
+          <w:rFonts w:hint="eastAsia"/>
+        </w:rPr>
+        <w:t xml:space="preserve">가지에 대해 </w:t>
+      </w:r>
+      <w:proofErr w:type="spellStart"/>
+      <w:r>
+        <w:rPr>
+          <w:rFonts w:hint="eastAsia"/>
+        </w:rPr>
+        <w:t>인바운드</w:t>
+      </w:r>
+      <w:proofErr w:type="spellEnd"/>
+      <w:r>
+        <w:rPr>
+          <w:rFonts w:hint="eastAsia"/>
+        </w:rPr>
+        <w:t xml:space="preserve"> 보안 그룹 규칙을 추가했다.</w:t>
+      </w:r>
+      <w:r>
+        <w:t xml:space="preserve"> </w:t>
+      </w:r>
+      <w:r>
+        <w:rPr>
+          <w:rFonts w:hint="eastAsia"/>
+        </w:rPr>
+        <w:t xml:space="preserve">왜냐하면 </w:t>
+      </w:r>
+      <w:r>
+        <w:t>22</w:t>
+      </w:r>
+      <w:r>
+        <w:rPr>
+          <w:rFonts w:hint="eastAsia"/>
+        </w:rPr>
+        <w:t xml:space="preserve">번 포트는 우리가 </w:t>
+      </w:r>
+      <w:r>
+        <w:t>EC2</w:t>
+      </w:r>
+      <w:r>
+        <w:rPr>
+          <w:rFonts w:hint="eastAsia"/>
+        </w:rPr>
+        <w:t>에 원격 접속할 때 사용하는 포트이고,</w:t>
+      </w:r>
+      <w:r>
+        <w:t xml:space="preserve"> 80</w:t>
+      </w:r>
+      <w:r>
+        <w:rPr>
+          <w:rFonts w:hint="eastAsia"/>
+        </w:rPr>
+        <w:t xml:space="preserve">번 포트에는 </w:t>
+      </w:r>
+      <w:proofErr w:type="spellStart"/>
+      <w:r>
+        <w:rPr>
+          <w:rFonts w:hint="eastAsia"/>
+        </w:rPr>
+        <w:t>백엔드</w:t>
+      </w:r>
+      <w:proofErr w:type="spellEnd"/>
+      <w:r>
+        <w:rPr>
+          <w:rFonts w:hint="eastAsia"/>
+        </w:rPr>
+        <w:t xml:space="preserve"> 서버를 띄울 예정이기 때문이다.</w:t>
+      </w:r>
+      <w:r>
+        <w:t xml:space="preserve"> </w:t>
+      </w:r>
+      <w:r>
+        <w:rPr>
+          <w:rFonts w:hint="eastAsia"/>
+        </w:rPr>
+        <w:t xml:space="preserve">그리고 어떤 </w:t>
+      </w:r>
+      <w:r>
+        <w:t>IP</w:t>
+      </w:r>
+      <w:r>
+        <w:rPr>
+          <w:rFonts w:hint="eastAsia"/>
+        </w:rPr>
+        <w:t>에서든 전부 접근할 수 있게 만들기 위해 소스 유형은 위치 무관으로 설정했다.</w:t>
+      </w:r>
+    </w:p>
+    <w:p/>
+    <w:p>
+      <w:pPr>
         <w:pStyle w:val="1"/>
       </w:pPr>
       <w:r>
         <w:rPr>
           <w:rFonts w:hint="eastAsia"/>
         </w:rPr>
-        <w:t>보안그룹 설정</w:t>
-      </w:r>
-    </w:p>
-    <w:p>
-      <w:pPr>
-        <w:rPr>
-          <w:rFonts w:hint="eastAsia"/>
-        </w:rPr>
-      </w:pPr>
-      <w:r>
-        <w:rPr>
-          <w:rFonts w:hint="eastAsia"/>
-        </w:rPr>
-        <w:t xml:space="preserve">외부에서 </w:t>
-      </w:r>
-      <w:r>
-        <w:t>EC2</w:t>
-      </w:r>
-      <w:r>
-        <w:rPr>
-          <w:rFonts w:hint="eastAsia"/>
-        </w:rPr>
-        <w:t xml:space="preserve">로 접근할 포트는 </w:t>
-      </w:r>
-      <w:r>
-        <w:t>22</w:t>
-      </w:r>
-      <w:r>
-        <w:rPr>
-          <w:rFonts w:hint="eastAsia"/>
-        </w:rPr>
-        <w:t xml:space="preserve">번 포트와 </w:t>
-      </w:r>
-      <w:r>
-        <w:t>80</w:t>
-      </w:r>
-      <w:r>
-        <w:rPr>
-          <w:rFonts w:hint="eastAsia"/>
-        </w:rPr>
-        <w:t xml:space="preserve">번 포트라고 생각해서 </w:t>
-      </w:r>
-      <w:r>
-        <w:t>2</w:t>
-      </w:r>
-      <w:r>
-        <w:rPr>
-          <w:rFonts w:hint="eastAsia"/>
-        </w:rPr>
-        <w:t>가지에 대해 인바운드 보안 그룹 규칙을 추가했다.</w:t>
-      </w:r>
-      <w:r>
-        <w:t xml:space="preserve"> </w:t>
-      </w:r>
-      <w:r>
-        <w:rPr>
-          <w:rFonts w:hint="eastAsia"/>
-        </w:rPr>
-        <w:t xml:space="preserve">왜냐하면 </w:t>
-      </w:r>
-      <w:r>
-        <w:t>22</w:t>
-      </w:r>
-      <w:r>
-        <w:rPr>
-          <w:rFonts w:hint="eastAsia"/>
-        </w:rPr>
-        <w:t xml:space="preserve">번 포트는 우리가 </w:t>
-      </w:r>
-      <w:r>
-        <w:t>EC2</w:t>
-      </w:r>
-      <w:r>
-        <w:rPr>
-          <w:rFonts w:hint="eastAsia"/>
-        </w:rPr>
-        <w:t>에 원격 접속할 때 사용하는 포트이고,</w:t>
-      </w:r>
-      <w:r>
-        <w:t xml:space="preserve"> 80</w:t>
-      </w:r>
-      <w:r>
-        <w:rPr>
-          <w:rFonts w:hint="eastAsia"/>
-        </w:rPr>
-        <w:t>번 포트에는 백엔드 서버를 띄울 예정이기 때문이다.</w:t>
-      </w:r>
-      <w:r>
-        <w:t xml:space="preserve"> </w:t>
-      </w:r>
-      <w:r>
-        <w:rPr>
-          <w:rFonts w:hint="eastAsia"/>
-        </w:rPr>
-        <w:t xml:space="preserve">그리고 어떤 </w:t>
-      </w:r>
-      <w:r>
-        <w:t>IP</w:t>
-      </w:r>
-      <w:r>
-        <w:rPr>
-          <w:rFonts w:hint="eastAsia"/>
-        </w:rPr>
-        <w:t>에서든 전부 접근할 수 있게 만들기 위해 소스 유형은 위치 무관으로 설정했다.</w:t>
-      </w:r>
-    </w:p>
-    <w:p>
-      <w:pPr>
-        <w:rPr>
-          <w:rFonts w:hint="eastAsia"/>
-        </w:rPr>
-      </w:pPr>
+        <w:t>[보충 강의]</w:t>
+      </w:r>
+      <w:r>
+        <w:t xml:space="preserve"> IP</w:t>
+      </w:r>
+      <w:r>
+        <w:rPr>
+          <w:rFonts w:hint="eastAsia"/>
+        </w:rPr>
+        <w:t xml:space="preserve">와 </w:t>
+      </w:r>
+      <w:r>
+        <w:t xml:space="preserve">Port </w:t>
+      </w:r>
+      <w:r>
+        <w:rPr>
+          <w:rFonts w:hint="eastAsia"/>
+        </w:rPr>
+        <w:t>개념</w:t>
+      </w:r>
+    </w:p>
+    <w:p>
+      <w:pPr>
+        <w:pStyle w:val="2"/>
+      </w:pPr>
+      <w:r>
+        <w:rPr>
+          <w:rFonts w:hint="eastAsia"/>
+        </w:rPr>
+        <w:t>I</w:t>
+      </w:r>
+      <w:r>
+        <w:t>P</w:t>
+      </w:r>
+      <w:r>
+        <w:rPr>
+          <w:rFonts w:hint="eastAsia"/>
+        </w:rPr>
+        <w:t>의 개념</w:t>
+      </w:r>
+    </w:p>
+    <w:p>
+      <w:r>
+        <w:rPr>
+          <w:rFonts w:hint="eastAsia"/>
+        </w:rPr>
+        <w:t>I</w:t>
+      </w:r>
+      <w:r>
+        <w:t>P</w:t>
+      </w:r>
+      <w:r>
+        <w:rPr>
+          <w:rFonts w:hint="eastAsia"/>
+        </w:rPr>
+        <w:t>란 네트워크 상에서 특정 컴퓨터를 가리키는 주소이다.</w:t>
+      </w:r>
+    </w:p>
+    <w:p>
+      <w:r>
+        <w:rPr>
+          <w:rFonts w:hint="eastAsia"/>
+        </w:rPr>
+        <w:t xml:space="preserve">다음과 같은 값이 </w:t>
+      </w:r>
+      <w:r>
+        <w:t xml:space="preserve">IP </w:t>
+      </w:r>
+      <w:r>
+        <w:rPr>
+          <w:rFonts w:hint="eastAsia"/>
+        </w:rPr>
+        <w:t>주소이다.</w:t>
+      </w:r>
+      <w:r>
+        <w:t xml:space="preserve"> (13.250.15.132)</w:t>
+      </w:r>
+    </w:p>
+    <w:p>
+      <w:r>
+        <w:rPr>
+          <w:rFonts w:hint="eastAsia"/>
+        </w:rPr>
+        <w:t>I</w:t>
+      </w:r>
+      <w:r>
+        <w:t>P</w:t>
+      </w:r>
+      <w:r>
+        <w:rPr>
+          <w:rFonts w:hint="eastAsia"/>
+        </w:rPr>
+        <w:t>는 특정 컴퓨터의 주소를 가리킨다.</w:t>
+      </w:r>
+      <w:r>
+        <w:t xml:space="preserve"> </w:t>
+      </w:r>
+      <w:r>
+        <w:rPr>
+          <w:rFonts w:hint="eastAsia"/>
+        </w:rPr>
+        <w:t>예를 들면</w:t>
+      </w:r>
+      <w:r>
+        <w:t xml:space="preserve">, naver.com </w:t>
+      </w:r>
+      <w:r>
+        <w:rPr>
+          <w:rFonts w:hint="eastAsia"/>
+        </w:rPr>
+        <w:t xml:space="preserve">이라는 서비스도 </w:t>
+      </w:r>
+      <w:r>
+        <w:t xml:space="preserve">IP </w:t>
+      </w:r>
+      <w:r>
+        <w:rPr>
+          <w:rFonts w:hint="eastAsia"/>
+        </w:rPr>
+        <w:t>주소를 가지고 있다.</w:t>
+      </w:r>
+      <w:r>
+        <w:t xml:space="preserve"> </w:t>
+      </w:r>
+      <w:r>
+        <w:rPr>
+          <w:rFonts w:hint="eastAsia"/>
+        </w:rPr>
+        <w:t xml:space="preserve">해당 이미지의 </w:t>
+      </w:r>
+      <w:r>
+        <w:t xml:space="preserve">IP </w:t>
+      </w:r>
+      <w:r>
+        <w:rPr>
+          <w:rFonts w:hint="eastAsia"/>
+        </w:rPr>
+        <w:t>주소는 네이버가 운영하고 있는 컴퓨터의 주소이기도 하다.</w:t>
+      </w:r>
+    </w:p>
+    <w:p>
+      <w:pPr>
+        <w:rPr>
+          <w:rFonts w:hint="eastAsia"/>
+        </w:rPr>
+      </w:pPr>
+      <w:r>
+        <w:rPr>
+          <w:noProof/>
+        </w:rPr>
+        <w:drawing>
+          <wp:inline distT="0" distB="0" distL="0" distR="0" wp14:anchorId="21381920" wp14:editId="529304C1">
+            <wp:extent cx="5731510" cy="1462405"/>
+            <wp:effectExtent l="0" t="0" r="2540" b="4445"/>
+            <wp:docPr id="1022284717" name="그림 1"/>
+            <wp:cNvGraphicFramePr>
+              <a:graphicFrameLocks xmlns:a="http://schemas.openxmlformats.org/drawingml/2006/main" noChangeAspect="1"/>
+            </wp:cNvGraphicFramePr>
+            <a:graphic xmlns:a="http://schemas.openxmlformats.org/drawingml/2006/main">
+              <a:graphicData uri="http://schemas.openxmlformats.org/drawingml/2006/picture">
+                <pic:pic xmlns:pic="http://schemas.openxmlformats.org/drawingml/2006/picture">
+                  <pic:nvPicPr>
+                    <pic:cNvPr id="0" name="Picture 1"/>
+                    <pic:cNvPicPr>
+                      <a:picLocks noChangeAspect="1" noChangeArrowheads="1"/>
+                    </pic:cNvPicPr>
+                  </pic:nvPicPr>
+                  <pic:blipFill>
+                    <a:blip r:embed="rId19">
+                      <a:extLst>
+                        <a:ext uri="{28A0092B-C50C-407E-A947-70E740481C1C}">
+                          <a14:useLocalDpi xmlns:a14="http://schemas.microsoft.com/office/drawing/2010/main" val="0"/>
+                        </a:ext>
+                      </a:extLst>
+                    </a:blip>
+                    <a:srcRect/>
+                    <a:stretch>
+                      <a:fillRect/>
+                    </a:stretch>
+                  </pic:blipFill>
+                  <pic:spPr bwMode="auto">
+                    <a:xfrm>
+                      <a:off x="0" y="0"/>
+                      <a:ext cx="5731510" cy="1462405"/>
+                    </a:xfrm>
+                    <a:prstGeom prst="rect">
+                      <a:avLst/>
+                    </a:prstGeom>
+                    <a:noFill/>
+                    <a:ln>
+                      <a:noFill/>
+                    </a:ln>
+                  </pic:spPr>
+                </pic:pic>
+              </a:graphicData>
+            </a:graphic>
+          </wp:inline>
+        </w:drawing>
+      </w:r>
+    </w:p>
+    <w:p>
+      <w:pPr>
+        <w:pStyle w:val="2"/>
+      </w:pPr>
+      <w:r>
+        <w:rPr>
+          <w:rFonts w:hint="eastAsia"/>
+        </w:rPr>
+        <w:t>P</w:t>
+      </w:r>
+      <w:r>
+        <w:t>ort</w:t>
+      </w:r>
+      <w:r>
+        <w:rPr>
+          <w:rFonts w:hint="eastAsia"/>
+        </w:rPr>
+        <w:t>의 개념</w:t>
+      </w:r>
+    </w:p>
+    <w:p>
+      <w:r>
+        <w:rPr>
+          <w:rFonts w:hint="eastAsia"/>
+        </w:rPr>
+        <w:t>P</w:t>
+      </w:r>
+      <w:r>
+        <w:t>ort</w:t>
+      </w:r>
+      <w:r>
+        <w:rPr>
+          <w:rFonts w:hint="eastAsia"/>
+        </w:rPr>
+        <w:t>란 한 컴퓨터 내에서 실행되고 있는 특정 프로그램의 주소이다.</w:t>
+      </w:r>
+    </w:p>
+    <w:p>
+      <w:r>
+        <w:rPr>
+          <w:rFonts w:hint="eastAsia"/>
+        </w:rPr>
+        <w:t xml:space="preserve">다음과 같은 값에서 </w:t>
+      </w:r>
+      <w:r>
+        <w:t xml:space="preserve">:3000 </w:t>
+      </w:r>
+      <w:r>
+        <w:rPr>
+          <w:rFonts w:hint="eastAsia"/>
+        </w:rPr>
+        <w:t>부분이 포트 번호를 의미한다.</w:t>
+      </w:r>
+      <w:r>
+        <w:t xml:space="preserve"> (13.250.15.132:3000)</w:t>
+      </w:r>
+    </w:p>
+    <w:p>
+      <w:pPr>
+        <w:rPr>
+          <w:rFonts w:hint="eastAsia"/>
+        </w:rPr>
+      </w:pPr>
+      <w:r>
+        <w:rPr>
+          <w:rFonts w:hint="eastAsia"/>
+        </w:rPr>
+        <w:t>한</w:t>
+      </w:r>
+      <w:r>
+        <w:t xml:space="preserve"> 컴퓨터 내에서 여러 프로그램이 실행되고 있을 것이다. 내가 지금 사용하고 있는 노트북만 보더라도 크롬, 카카오톡, </w:t>
+      </w:r>
+      <w:proofErr w:type="spellStart"/>
+      <w:r>
+        <w:t>슬랙</w:t>
+      </w:r>
+      <w:proofErr w:type="spellEnd"/>
+      <w:r>
+        <w:t xml:space="preserve">, </w:t>
+      </w:r>
+      <w:proofErr w:type="spellStart"/>
+      <w:r>
+        <w:t>VSCode</w:t>
+      </w:r>
+      <w:proofErr w:type="spellEnd"/>
+      <w:r>
+        <w:t xml:space="preserve"> 등 여러가지 프로그램이 동시에 실행되고 있다. 실제 서버를 운영하는 컴퓨터도 동일하다. 하나의 컴퓨터에서 여러가지의 프로그램이 실행된다. </w:t>
+      </w:r>
+    </w:p>
+    <w:p>
+      <w:r>
+        <w:rPr>
+          <w:rFonts w:hint="eastAsia"/>
+        </w:rPr>
+        <w:t>그럼</w:t>
+      </w:r>
+      <w:r>
+        <w:t xml:space="preserve"> 외부에서 특정 컴퓨터 내부에 있는 Spring Boot라는 서버에 통신을 하고 싶다고 가정하자. 하지만 외부에서 IP 주소만 알아서는 실행되고 있는 여러 프로그램 중 어떤 프로그램과 통신을 해야 할 지 알 수가 없다. 그래서 특정 서버와 통신을 할 때는 IP 주소와 서버가 실행되고 있는 포트 번호까지 알고 있어야 한다.</w:t>
+      </w:r>
+    </w:p>
+    <w:p>
+      <w:pPr>
+        <w:pStyle w:val="2"/>
+      </w:pPr>
+      <w:r>
+        <w:rPr>
+          <w:rFonts w:hint="eastAsia"/>
+        </w:rPr>
+        <w:lastRenderedPageBreak/>
+        <w:t>브라우저 창에 포트 번호를 입력하지 않는 이유?</w:t>
+      </w:r>
+    </w:p>
+    <w:p>
+      <w:r>
+        <w:rPr>
+          <w:rFonts w:hint="eastAsia"/>
+        </w:rPr>
+        <w:t>위</w:t>
+      </w:r>
+      <w:r>
+        <w:t xml:space="preserve"> 설명에서 분명 특정 서버와 통신하기 위해서는 IP 주소와 포트 번호를 둘 다 알아야 된다고 했다. 도메인 주소를 통해서 알 수 있는 건 IP </w:t>
+      </w:r>
+      <w:proofErr w:type="gramStart"/>
+      <w:r>
+        <w:t>주소</w:t>
+      </w:r>
+      <w:r>
+        <w:rPr>
+          <w:rFonts w:hint="eastAsia"/>
+        </w:rPr>
+        <w:t xml:space="preserve"> </w:t>
+      </w:r>
+      <w:r>
+        <w:t>뿐이다</w:t>
+      </w:r>
+      <w:proofErr w:type="gramEnd"/>
+      <w:r>
+        <w:t>. 그럼 포트 번호를 입력해주지도 않았는데 어떻게 정상적으로 통신을 한 걸까?</w:t>
+      </w:r>
+    </w:p>
+    <w:p>
+      <w:r>
+        <w:rPr>
+          <w:noProof/>
+        </w:rPr>
+        <w:drawing>
+          <wp:inline distT="0" distB="0" distL="0" distR="0" wp14:anchorId="0C4D3015" wp14:editId="69A2AD2C">
+            <wp:extent cx="4323080" cy="987425"/>
+            <wp:effectExtent l="0" t="0" r="1270" b="3175"/>
+            <wp:docPr id="1724113319" name="그림 2"/>
+            <wp:cNvGraphicFramePr>
+              <a:graphicFrameLocks xmlns:a="http://schemas.openxmlformats.org/drawingml/2006/main" noChangeAspect="1"/>
+            </wp:cNvGraphicFramePr>
+            <a:graphic xmlns:a="http://schemas.openxmlformats.org/drawingml/2006/main">
+              <a:graphicData uri="http://schemas.openxmlformats.org/drawingml/2006/picture">
+                <pic:pic xmlns:pic="http://schemas.openxmlformats.org/drawingml/2006/picture">
+                  <pic:nvPicPr>
+                    <pic:cNvPr id="0" name="Picture 3"/>
+                    <pic:cNvPicPr>
+                      <a:picLocks noChangeAspect="1" noChangeArrowheads="1"/>
+                    </pic:cNvPicPr>
+                  </pic:nvPicPr>
+                  <pic:blipFill>
+                    <a:blip r:embed="rId20">
+                      <a:extLst>
+                        <a:ext uri="{28A0092B-C50C-407E-A947-70E740481C1C}">
+                          <a14:useLocalDpi xmlns:a14="http://schemas.microsoft.com/office/drawing/2010/main" val="0"/>
+                        </a:ext>
+                      </a:extLst>
+                    </a:blip>
+                    <a:srcRect/>
+                    <a:stretch>
+                      <a:fillRect/>
+                    </a:stretch>
+                  </pic:blipFill>
+                  <pic:spPr bwMode="auto">
+                    <a:xfrm>
+                      <a:off x="0" y="0"/>
+                      <a:ext cx="4323080" cy="987425"/>
+                    </a:xfrm>
+                    <a:prstGeom prst="rect">
+                      <a:avLst/>
+                    </a:prstGeom>
+                    <a:noFill/>
+                    <a:ln>
+                      <a:noFill/>
+                    </a:ln>
+                  </pic:spPr>
+                </pic:pic>
+              </a:graphicData>
+            </a:graphic>
+          </wp:inline>
+        </w:drawing>
+      </w:r>
+    </w:p>
+    <w:p>
+      <w:r>
+        <w:rPr>
+          <w:rFonts w:hint="eastAsia"/>
+        </w:rPr>
+        <w:t>주소창에</w:t>
+      </w:r>
+      <w:r>
+        <w:t xml:space="preserve"> 도메인 주소를 입력해서 </w:t>
+      </w:r>
+      <w:proofErr w:type="spellStart"/>
+      <w:r>
+        <w:t>엔터를</w:t>
+      </w:r>
+      <w:proofErr w:type="spellEnd"/>
+      <w:r>
+        <w:t xml:space="preserve"> 누르면, 브라우저(크롬, 익스플로러 등)는 기본적으로 80번 포트로 통신을 보내게 설정되어 있다. 그래서 포트 번호를 입력해주지 않아도 통신이 잘 됐던 것이었다. 만약 80번 포트로 통신하고 싶지 않고, 3000번 포트로 통신하고 싶다면 아래와 같이 주소창에 입력해야 한다.</w:t>
+      </w:r>
+    </w:p>
+    <w:p>
+      <w:r>
+        <w:rPr>
+          <w:noProof/>
+        </w:rPr>
+        <w:drawing>
+          <wp:inline distT="0" distB="0" distL="0" distR="0" wp14:anchorId="3EAD6B29" wp14:editId="2E45B2E8">
+            <wp:extent cx="3350260" cy="782955"/>
+            <wp:effectExtent l="0" t="0" r="2540" b="0"/>
+            <wp:docPr id="670318430" name="그림 3"/>
+            <wp:cNvGraphicFramePr>
+              <a:graphicFrameLocks xmlns:a="http://schemas.openxmlformats.org/drawingml/2006/main" noChangeAspect="1"/>
+            </wp:cNvGraphicFramePr>
+            <a:graphic xmlns:a="http://schemas.openxmlformats.org/drawingml/2006/main">
+              <a:graphicData uri="http://schemas.openxmlformats.org/drawingml/2006/picture">
+                <pic:pic xmlns:pic="http://schemas.openxmlformats.org/drawingml/2006/picture">
+                  <pic:nvPicPr>
+                    <pic:cNvPr id="0" name="Picture 5"/>
+                    <pic:cNvPicPr>
+                      <a:picLocks noChangeAspect="1" noChangeArrowheads="1"/>
+                    </pic:cNvPicPr>
+                  </pic:nvPicPr>
+                  <pic:blipFill>
+                    <a:blip r:embed="rId21">
+                      <a:extLst>
+                        <a:ext uri="{28A0092B-C50C-407E-A947-70E740481C1C}">
+                          <a14:useLocalDpi xmlns:a14="http://schemas.microsoft.com/office/drawing/2010/main" val="0"/>
+                        </a:ext>
+                      </a:extLst>
+                    </a:blip>
+                    <a:srcRect/>
+                    <a:stretch>
+                      <a:fillRect/>
+                    </a:stretch>
+                  </pic:blipFill>
+                  <pic:spPr bwMode="auto">
+                    <a:xfrm>
+                      <a:off x="0" y="0"/>
+                      <a:ext cx="3350260" cy="782955"/>
+                    </a:xfrm>
+                    <a:prstGeom prst="rect">
+                      <a:avLst/>
+                    </a:prstGeom>
+                    <a:noFill/>
+                    <a:ln>
+                      <a:noFill/>
+                    </a:ln>
+                  </pic:spPr>
+                </pic:pic>
+              </a:graphicData>
+            </a:graphic>
+          </wp:inline>
+        </w:drawing>
+      </w:r>
     </w:p>
     <w:p/>
     <w:p>
       <w:pPr>
-        <w:rPr>
-          <w:rFonts w:hint="eastAsia"/>
-        </w:rPr>
-      </w:pPr>
-    </w:p>
-    <w:p>
-      <w:pPr>
-        <w:rPr>
-          <w:rFonts w:hint="eastAsia"/>
-        </w:rPr>
-      </w:pPr>
+        <w:pStyle w:val="2"/>
+      </w:pPr>
+      <w:r>
+        <w:rPr>
+          <w:rFonts w:hint="eastAsia"/>
+        </w:rPr>
+        <w:t>잘 알려진 포트(</w:t>
+      </w:r>
+      <w:r>
+        <w:t>well-known port)</w:t>
+      </w:r>
+      <w:r>
+        <w:rPr>
+          <w:rFonts w:hint="eastAsia"/>
+        </w:rPr>
+        <w:t>란?</w:t>
+      </w:r>
+    </w:p>
+    <w:p>
+      <w:r>
+        <w:rPr>
+          <w:rFonts w:hint="eastAsia"/>
+        </w:rPr>
+        <w:t>포트</w:t>
+      </w:r>
+      <w:r>
+        <w:t xml:space="preserve"> 번호는 0 ~ 65,535번까지 사용할 수 있다. 그 중에서 0 ~ 1023번까지의 포트 번호는 주요 통신을 위한 규약에 따라 이미 정해져 있다. 이렇게 규약을 통해 역할이 </w:t>
+      </w:r>
+      <w:proofErr w:type="spellStart"/>
+      <w:r>
+        <w:t>정해져있는</w:t>
+      </w:r>
+      <w:proofErr w:type="spellEnd"/>
+      <w:r>
+        <w:t xml:space="preserve"> 포트 번호를 보고 잘 알려진 포트(well-known port)라고 부른다. </w:t>
+      </w:r>
+    </w:p>
+    <w:p>
+      <w:pPr>
+        <w:rPr>
+          <w:rFonts w:hint="eastAsia"/>
+        </w:rPr>
+      </w:pPr>
+    </w:p>
+    <w:p>
+      <w:pPr>
+        <w:rPr>
+          <w:rFonts w:hint="eastAsia"/>
+        </w:rPr>
+      </w:pPr>
+      <w:r>
+        <w:rPr>
+          <w:rFonts w:hint="eastAsia"/>
+        </w:rPr>
+        <w:t>규약으로</w:t>
+      </w:r>
+      <w:r>
+        <w:t xml:space="preserve"> 정해져 있는 포트 번호 중 자주 사용되는 포트 번호에 대해서만 알아보자. </w:t>
+      </w:r>
+    </w:p>
+    <w:p>
+      <w:r>
+        <w:t>- 22번 (SSH, Secure Shell Protocol): 원격 접속을 위한 포트 번호</w:t>
+      </w:r>
+    </w:p>
+    <w:p>
+      <w:r>
+        <w:t xml:space="preserve">    - EC2 인스턴스에 연결할 때 22번 포트를 사용한다.</w:t>
+      </w:r>
+    </w:p>
+    <w:p>
+      <w:r>
+        <w:t>- 80번 (HTTP): HTTP로 통신을 할 때 사용</w:t>
+      </w:r>
+    </w:p>
+    <w:p>
+      <w:r>
+        <w:t>- 443번 (HTTPS): HTTPS로 통신을 할 때 사용</w:t>
+      </w:r>
+    </w:p>
+    <w:p/>
+    <w:p>
+      <w:pPr>
+        <w:rPr>
+          <w:rFonts w:hint="eastAsia"/>
+        </w:rPr>
+      </w:pPr>
+      <w:r>
+        <w:rPr>
+          <w:rFonts w:hint="eastAsia"/>
+        </w:rPr>
+        <w:t>여기서</w:t>
+      </w:r>
+      <w:r>
+        <w:t xml:space="preserve"> 착각하면 안 되는 점은 위에서 정해</w:t>
+      </w:r>
+      <w:r>
+        <w:rPr>
+          <w:rFonts w:hint="eastAsia"/>
+        </w:rPr>
+        <w:t xml:space="preserve"> </w:t>
+      </w:r>
+      <w:r>
+        <w:t xml:space="preserve">놓은 규약을 꼭 지키지 않아도 된다. 즉, 규약으로 정해져 있는 포트 번호와 다르게 사용해도 된다는 뜻이다. 예를 들어, 특정 서버와 HTTP 통신을 할 </w:t>
+      </w:r>
+      <w:r>
+        <w:lastRenderedPageBreak/>
+        <w:t>때 80번 포트를 쓰지 않고 3000번 포트나 8080번 포트를 써도 상관없다.</w:t>
+      </w:r>
+    </w:p>
+    <w:p>
+      <w:pPr>
+        <w:rPr>
+          <w:rFonts w:hint="eastAsia"/>
+        </w:rPr>
+      </w:pPr>
+    </w:p>
+    <w:p>
+      <w:pPr>
+        <w:pStyle w:val="1"/>
+      </w:pPr>
+      <w:r>
+        <w:rPr>
+          <w:rFonts w:hint="eastAsia"/>
+        </w:rPr>
+        <w:t>[실습]</w:t>
+      </w:r>
+      <w:r>
+        <w:t xml:space="preserve"> 4. EC2 </w:t>
+      </w:r>
+      <w:proofErr w:type="spellStart"/>
+      <w:r>
+        <w:rPr>
+          <w:rFonts w:hint="eastAsia"/>
+        </w:rPr>
+        <w:t>셋팅하기</w:t>
+      </w:r>
+      <w:proofErr w:type="spellEnd"/>
+      <w:r>
+        <w:rPr>
+          <w:rFonts w:hint="eastAsia"/>
+        </w:rPr>
+        <w:t xml:space="preserve"> </w:t>
+      </w:r>
+      <w:r>
+        <w:t xml:space="preserve">- </w:t>
+      </w:r>
+      <w:r>
+        <w:rPr>
+          <w:rFonts w:hint="eastAsia"/>
+        </w:rPr>
+        <w:t>스토리지 구성</w:t>
+      </w:r>
     </w:p>
     <w:p/>
     <w:p/>
     <w:p/>
     <w:p/>
-    <w:p>
-      <w:pPr>
-        <w:rPr>
-          <w:rFonts w:hint="eastAsia"/>
-        </w:rPr>
-      </w:pPr>
-    </w:p>
+    <w:p/>
+    <w:p/>
+    <w:p/>
+    <w:p/>
     <w:sectPr>
       <w:pgSz w:w="11906" w:h="16838"/>
       <w:pgMar w:top="1701" w:right="1440" w:bottom="1440" w:left="1440" w:header="851" w:footer="992" w:gutter="0"/>

</xml_diff>

<commit_message>
study aws section01 (11.04)
</commit_message>
<xml_diff>
--- a/비전공자도_이해할_수_있는_AWS_입문_실전/section01.docx
+++ b/비전공자도_이해할_수_있는_AWS_입문_실전/section01.docx
@@ -23,19 +23,11 @@
       </w:r>
     </w:p>
     <w:p>
-      <w:proofErr w:type="spellStart"/>
-      <w:r>
-        <w:rPr>
-          <w:rFonts w:hint="eastAsia"/>
-        </w:rPr>
-        <w:t>배포란</w:t>
-      </w:r>
-      <w:proofErr w:type="spellEnd"/>
-      <w:r>
-        <w:rPr>
-          <w:rFonts w:hint="eastAsia"/>
-        </w:rPr>
-        <w:t xml:space="preserve"> 다른 사용자들이 인터넷을 통해서 사용할 수 있게 만드는 것을 의미한다.</w:t>
+      <w:r>
+        <w:rPr>
+          <w:rFonts w:hint="eastAsia"/>
+        </w:rPr>
+        <w:t>배포란 다른 사용자들이 인터넷을 통해서 사용할 수 있게 만드는 것을 의미한다.</w:t>
       </w:r>
       <w:r>
         <w:t xml:space="preserve"> </w:t>
@@ -110,15 +102,7 @@
         <w:t>7</w:t>
       </w:r>
       <w:r>
-        <w:t xml:space="preserve">.16.2.1)나 도메인(ex. www.naver.com)과 같이 고유의 주소를 </w:t>
-      </w:r>
-      <w:proofErr w:type="spellStart"/>
-      <w:r>
-        <w:t>부여받게</w:t>
-      </w:r>
-      <w:proofErr w:type="spellEnd"/>
-      <w:r>
-        <w:t xml:space="preserve"> 되고, 다른 컴퓨터에서 그 주소로 접속할 수 있게 된다. 이게 바로 배포다.</w:t>
+        <w:t>.16.2.1)나 도메인(ex. www.naver.com)과 같이 고유의 주소를 부여받게 되고, 다른 컴퓨터에서 그 주소로 접속할 수 있게 된다. 이게 바로 배포다.</w:t>
       </w:r>
     </w:p>
     <w:p>
@@ -159,67 +143,118 @@
         <w:t>란?</w:t>
       </w:r>
       <w:r>
+        <w:t xml:space="preserve"> / EC2</w:t>
+      </w:r>
+      <w:r>
+        <w:rPr>
+          <w:rFonts w:hint="eastAsia"/>
+        </w:rPr>
+        <w:t>를 왜 배울까?</w:t>
+      </w:r>
+      <w:r>
+        <w:t xml:space="preserve"> / </w:t>
+      </w:r>
+      <w:r>
+        <w:rPr>
+          <w:rFonts w:hint="eastAsia"/>
+        </w:rPr>
+        <w:t xml:space="preserve">현업에서 </w:t>
+      </w:r>
+      <w:r>
+        <w:t>EC2</w:t>
+      </w:r>
+      <w:r>
+        <w:rPr>
+          <w:rFonts w:hint="eastAsia"/>
+        </w:rPr>
+        <w:t>는 주로 언제 사용할까?</w:t>
+      </w:r>
+    </w:p>
+    <w:p>
+      <w:r>
+        <w:rPr>
+          <w:rFonts w:hint="eastAsia"/>
+        </w:rPr>
+        <w:t>E</w:t>
+      </w:r>
+      <w:r>
+        <w:t>C2(Clastic Compute Cloud)</w:t>
+      </w:r>
+      <w:r>
+        <w:rPr>
+          <w:rFonts w:hint="eastAsia"/>
+        </w:rPr>
+        <w:t>란 하나의 컴퓨터를 의미하며,</w:t>
+      </w:r>
+      <w:r>
         <w:t xml:space="preserve"> </w:t>
       </w:r>
-      <w:proofErr w:type="gramStart"/>
-      <w:r>
-        <w:t>/ EC</w:t>
-      </w:r>
-      <w:proofErr w:type="gramEnd"/>
-      <w:r>
-        <w:t>2</w:t>
-      </w:r>
-      <w:r>
-        <w:rPr>
-          <w:rFonts w:hint="eastAsia"/>
-        </w:rPr>
-        <w:t>를 왜 배울까?</w:t>
+      <w:r>
+        <w:rPr>
+          <w:rFonts w:hint="eastAsia"/>
+        </w:rPr>
+        <w:t>컴퓨터를 빌려서 원격으로 접속해 사용하는 서비스이다.</w:t>
+      </w:r>
+    </w:p>
+    <w:p>
+      <w:r>
+        <w:rPr>
+          <w:rFonts w:hint="eastAsia"/>
+        </w:rPr>
+        <w:t>서버를 배포하기 위해서는 컴퓨터가 필요하다.</w:t>
       </w:r>
       <w:r>
         <w:t xml:space="preserve"> </w:t>
       </w:r>
-      <w:proofErr w:type="gramStart"/>
-      <w:r>
-        <w:t xml:space="preserve">/ </w:t>
-      </w:r>
-      <w:r>
-        <w:rPr>
-          <w:rFonts w:hint="eastAsia"/>
-        </w:rPr>
-        <w:t>현업에서</w:t>
-      </w:r>
-      <w:proofErr w:type="gramEnd"/>
-      <w:r>
-        <w:rPr>
-          <w:rFonts w:hint="eastAsia"/>
-        </w:rPr>
+      <w:r>
+        <w:rPr>
+          <w:rFonts w:hint="eastAsia"/>
+        </w:rPr>
+        <w:t>내가 가진 컴퓨터에서 서버를 배포해 다른 사용자들이 인터넷에 접근할 수 있게 만들 수 있지만,</w:t>
+      </w:r>
+      <w:r>
+        <w:t xml:space="preserve"> 24</w:t>
+      </w:r>
+      <w:r>
+        <w:rPr>
+          <w:rFonts w:hint="eastAsia"/>
+        </w:rPr>
+        <w:t>시간 동안 컴퓨터를 켜놔야 하고,</w:t>
+      </w:r>
+      <w:r>
         <w:t xml:space="preserve"> </w:t>
       </w:r>
       <w:r>
+        <w:rPr>
+          <w:rFonts w:hint="eastAsia"/>
+        </w:rPr>
+        <w:t xml:space="preserve">인터넷을 통해 내 컴퓨터에 접근할 수 있게 만들다보니 보안적으로도 위험할 수 있다. 이러한 불편함 때문에 </w:t>
+      </w:r>
+      <w:r>
+        <w:t>AWS EC2</w:t>
+      </w:r>
+      <w:r>
+        <w:rPr>
+          <w:rFonts w:hint="eastAsia"/>
+        </w:rPr>
+        <w:t>라는 컴퓨터를 빌려서 사용하는 것이다.</w:t>
+      </w:r>
+    </w:p>
+    <w:p>
+      <w:r>
+        <w:rPr>
+          <w:rFonts w:hint="eastAsia"/>
+        </w:rPr>
+        <w:t xml:space="preserve">현업에서도 실제 백엔드 서버를 배포할 때 </w:t>
+      </w:r>
+      <w:r>
         <w:t>EC2</w:t>
       </w:r>
       <w:r>
         <w:rPr>
           <w:rFonts w:hint="eastAsia"/>
         </w:rPr>
-        <w:t>는 주로 언제 사용할까?</w:t>
-      </w:r>
-    </w:p>
-    <w:p>
-      <w:r>
-        <w:rPr>
-          <w:rFonts w:hint="eastAsia"/>
-        </w:rPr>
-        <w:t>E</w:t>
-      </w:r>
-      <w:r>
-        <w:t>C2(Clastic Compute Cloud)</w:t>
-      </w:r>
-      <w:r>
-        <w:rPr>
-          <w:rFonts w:hint="eastAsia"/>
-        </w:rPr>
-        <w:t>란 하나의 컴퓨터를 의미하며,</w:t>
+        <w:t>를 많이 사용한다.</w:t>
       </w:r>
       <w:r>
         <w:t xml:space="preserve"> </w:t>
@@ -228,127 +263,7 @@
         <w:rPr>
           <w:rFonts w:hint="eastAsia"/>
         </w:rPr>
-        <w:t>컴퓨터를 빌려서 원격으로 접속해 사용하는 서비스이다.</w:t>
-      </w:r>
-    </w:p>
-    <w:p>
-      <w:r>
-        <w:rPr>
-          <w:rFonts w:hint="eastAsia"/>
-        </w:rPr>
-        <w:t>서버를 배포하기 위해서는 컴퓨터가 필요하다.</w:t>
-      </w:r>
-      <w:r>
-        <w:t xml:space="preserve"> </w:t>
-      </w:r>
-      <w:r>
-        <w:rPr>
-          <w:rFonts w:hint="eastAsia"/>
-        </w:rPr>
-        <w:t>내가 가진 컴퓨터에서 서버를 배포해 다른 사용자들이 인터넷에 접근할 수 있게 만들 수 있지만,</w:t>
-      </w:r>
-      <w:r>
-        <w:t xml:space="preserve"> 24</w:t>
-      </w:r>
-      <w:r>
-        <w:rPr>
-          <w:rFonts w:hint="eastAsia"/>
-        </w:rPr>
-        <w:t xml:space="preserve">시간 동안 컴퓨터를 </w:t>
-      </w:r>
-      <w:proofErr w:type="spellStart"/>
-      <w:r>
-        <w:rPr>
-          <w:rFonts w:hint="eastAsia"/>
-        </w:rPr>
-        <w:t>켜놔야</w:t>
-      </w:r>
-      <w:proofErr w:type="spellEnd"/>
-      <w:r>
-        <w:rPr>
-          <w:rFonts w:hint="eastAsia"/>
-        </w:rPr>
-        <w:t xml:space="preserve"> 하고,</w:t>
-      </w:r>
-      <w:r>
-        <w:t xml:space="preserve"> </w:t>
-      </w:r>
-      <w:r>
-        <w:rPr>
-          <w:rFonts w:hint="eastAsia"/>
-        </w:rPr>
-        <w:t xml:space="preserve">인터넷을 통해 내 컴퓨터에 접근할 수 있게 </w:t>
-      </w:r>
-      <w:proofErr w:type="spellStart"/>
-      <w:r>
-        <w:rPr>
-          <w:rFonts w:hint="eastAsia"/>
-        </w:rPr>
-        <w:t>만들다보니</w:t>
-      </w:r>
-      <w:proofErr w:type="spellEnd"/>
-      <w:r>
-        <w:rPr>
-          <w:rFonts w:hint="eastAsia"/>
-        </w:rPr>
-        <w:t xml:space="preserve"> 보안적으로도 위험할 수 있다. 이러한 불편함 때문에 </w:t>
-      </w:r>
-      <w:r>
-        <w:t>AWS EC2</w:t>
-      </w:r>
-      <w:r>
-        <w:rPr>
-          <w:rFonts w:hint="eastAsia"/>
-        </w:rPr>
-        <w:t>라는 컴퓨터를 빌려서 사용하는 것이다.</w:t>
-      </w:r>
-    </w:p>
-    <w:p>
-      <w:r>
-        <w:rPr>
-          <w:rFonts w:hint="eastAsia"/>
-        </w:rPr>
-        <w:t xml:space="preserve">현업에서도 실제 </w:t>
-      </w:r>
-      <w:proofErr w:type="spellStart"/>
-      <w:r>
-        <w:rPr>
-          <w:rFonts w:hint="eastAsia"/>
-        </w:rPr>
-        <w:t>백엔드</w:t>
-      </w:r>
-      <w:proofErr w:type="spellEnd"/>
-      <w:r>
-        <w:rPr>
-          <w:rFonts w:hint="eastAsia"/>
-        </w:rPr>
-        <w:t xml:space="preserve"> 서버를 배포할 때 </w:t>
-      </w:r>
-      <w:r>
-        <w:t>EC2</w:t>
-      </w:r>
-      <w:r>
-        <w:rPr>
-          <w:rFonts w:hint="eastAsia"/>
-        </w:rPr>
-        <w:t>를 많이 사용한다.</w:t>
-      </w:r>
-      <w:r>
-        <w:t xml:space="preserve"> </w:t>
-      </w:r>
-      <w:proofErr w:type="spellStart"/>
-      <w:r>
-        <w:rPr>
-          <w:rFonts w:hint="eastAsia"/>
-        </w:rPr>
-        <w:t>프론트엔드</w:t>
-      </w:r>
-      <w:proofErr w:type="spellEnd"/>
-      <w:r>
-        <w:rPr>
-          <w:rFonts w:hint="eastAsia"/>
-        </w:rPr>
-        <w:t xml:space="preserve"> 웹 페이지를 사용할 </w:t>
+        <w:t xml:space="preserve">프론트엔드 웹 페이지를 사용할 </w:t>
       </w:r>
       <w:r>
         <w:rPr>
@@ -366,21 +281,8 @@
         </w:rPr>
         <w:t xml:space="preserve">주로 </w:t>
       </w:r>
-      <w:proofErr w:type="spellStart"/>
-      <w:r>
-        <w:t>vercel</w:t>
-      </w:r>
-      <w:proofErr w:type="spellEnd"/>
-      <w:r>
-        <w:t xml:space="preserve">, </w:t>
-      </w:r>
-      <w:proofErr w:type="spellStart"/>
-      <w:r>
-        <w:t>netlify</w:t>
-      </w:r>
-      <w:proofErr w:type="spellEnd"/>
-      <w:r>
-        <w:t xml:space="preserve"> </w:t>
+      <w:r>
+        <w:t xml:space="preserve">vercel, netlify </w:t>
       </w:r>
       <w:r>
         <w:rPr>
@@ -412,19 +314,11 @@
       <w:r>
         <w:t xml:space="preserve">] 1. </w:t>
       </w:r>
-      <w:proofErr w:type="spellStart"/>
-      <w:r>
-        <w:rPr>
-          <w:rFonts w:hint="eastAsia"/>
-        </w:rPr>
-        <w:t>리전</w:t>
-      </w:r>
-      <w:proofErr w:type="spellEnd"/>
-      <w:r>
-        <w:rPr>
-          <w:rFonts w:hint="eastAsia"/>
-        </w:rPr>
-        <w:t>(</w:t>
+      <w:r>
+        <w:rPr>
+          <w:rFonts w:hint="eastAsia"/>
+        </w:rPr>
+        <w:t>리전(</w:t>
       </w:r>
       <w:r>
         <w:t xml:space="preserve">Region) </w:t>
@@ -459,21 +353,7 @@
         <w:rPr>
           <w:rFonts w:hint="eastAsia"/>
         </w:rPr>
-        <w:t xml:space="preserve"> 서비스로 들어가서 </w:t>
-      </w:r>
-      <w:proofErr w:type="spellStart"/>
-      <w:r>
-        <w:rPr>
-          <w:rFonts w:hint="eastAsia"/>
-        </w:rPr>
-        <w:t>리전을</w:t>
-      </w:r>
-      <w:proofErr w:type="spellEnd"/>
-      <w:r>
-        <w:rPr>
-          <w:rFonts w:hint="eastAsia"/>
-        </w:rPr>
-        <w:t xml:space="preserve"> 선택한다.</w:t>
+        <w:t xml:space="preserve"> 서비스로 들어가서 리전을 선택한다.</w:t>
       </w:r>
     </w:p>
     <w:p>
@@ -532,21 +412,7 @@
         <w:rPr>
           <w:rFonts w:hint="eastAsia"/>
         </w:rPr>
-        <w:t xml:space="preserve">를 시작하기 위해서는 우선적으로 </w:t>
-      </w:r>
-      <w:proofErr w:type="spellStart"/>
-      <w:r>
-        <w:rPr>
-          <w:rFonts w:hint="eastAsia"/>
-        </w:rPr>
-        <w:t>리전을</w:t>
-      </w:r>
-      <w:proofErr w:type="spellEnd"/>
-      <w:r>
-        <w:rPr>
-          <w:rFonts w:hint="eastAsia"/>
-        </w:rPr>
-        <w:t xml:space="preserve"> 먼저 선택해야 한다.</w:t>
+        <w:t>를 시작하기 위해서는 우선적으로 리전을 먼저 선택해야 한다.</w:t>
       </w:r>
     </w:p>
     <w:p>
@@ -600,21 +466,7 @@
         <w:rPr>
           <w:rFonts w:hint="eastAsia"/>
         </w:rPr>
-        <w:t xml:space="preserve">를 통해 빌려서 쓸 수 있는 컴퓨터들이 전 세계적으로 다양하게 </w:t>
-      </w:r>
-      <w:proofErr w:type="spellStart"/>
-      <w:r>
-        <w:rPr>
-          <w:rFonts w:hint="eastAsia"/>
-        </w:rPr>
-        <w:t>분포해있다</w:t>
-      </w:r>
-      <w:proofErr w:type="spellEnd"/>
-      <w:r>
-        <w:rPr>
-          <w:rFonts w:hint="eastAsia"/>
-        </w:rPr>
-        <w:t>.</w:t>
+        <w:t>를 통해 빌려서 쓸 수 있는 컴퓨터들이 전 세계적으로 다양하게 분포해있다.</w:t>
       </w:r>
       <w:r>
         <w:t xml:space="preserve"> </w:t>
@@ -639,19 +491,11 @@
       <w:pPr>
         <w:pStyle w:val="2"/>
       </w:pPr>
-      <w:proofErr w:type="spellStart"/>
-      <w:r>
-        <w:rPr>
-          <w:rFonts w:hint="eastAsia"/>
-        </w:rPr>
-        <w:t>리전의</w:t>
-      </w:r>
-      <w:proofErr w:type="spellEnd"/>
-      <w:r>
-        <w:rPr>
-          <w:rFonts w:hint="eastAsia"/>
-        </w:rPr>
-        <w:t xml:space="preserve"> 특징</w:t>
+      <w:r>
+        <w:rPr>
+          <w:rFonts w:hint="eastAsia"/>
+        </w:rPr>
+        <w:t>리전의 특징</w:t>
       </w:r>
     </w:p>
     <w:p>
@@ -676,21 +520,7 @@
         <w:rPr>
           <w:rFonts w:hint="eastAsia"/>
         </w:rPr>
-        <w:t xml:space="preserve">는 전 세계적으로 다양한 </w:t>
-      </w:r>
-      <w:proofErr w:type="spellStart"/>
-      <w:r>
-        <w:rPr>
-          <w:rFonts w:hint="eastAsia"/>
-        </w:rPr>
-        <w:t>리전을</w:t>
-      </w:r>
-      <w:proofErr w:type="spellEnd"/>
-      <w:r>
-        <w:rPr>
-          <w:rFonts w:hint="eastAsia"/>
-        </w:rPr>
-        <w:t xml:space="preserve"> 보유하고 있다.</w:t>
+        <w:t>는 전 세계적으로 다양한 리전을 보유하고 있다.</w:t>
       </w:r>
       <w:r>
         <w:br/>
@@ -763,21 +593,7 @@
         <w:rPr>
           <w:rFonts w:hint="eastAsia"/>
         </w:rPr>
-        <w:t xml:space="preserve">각 </w:t>
-      </w:r>
-      <w:proofErr w:type="spellStart"/>
-      <w:r>
-        <w:rPr>
-          <w:rFonts w:hint="eastAsia"/>
-        </w:rPr>
-        <w:t>리전은</w:t>
-      </w:r>
-      <w:proofErr w:type="spellEnd"/>
-      <w:r>
-        <w:rPr>
-          <w:rFonts w:hint="eastAsia"/>
-        </w:rPr>
-        <w:t xml:space="preserve"> 고유의 이름을 가지고 있다.</w:t>
+        <w:t>각 리전은 고유의 이름을 가지고 있다.</w:t>
       </w:r>
       <w:r>
         <w:br/>
@@ -793,19 +609,11 @@
         </w:numPr>
         <w:ind w:leftChars="0"/>
       </w:pPr>
-      <w:proofErr w:type="spellStart"/>
-      <w:r>
-        <w:rPr>
-          <w:rFonts w:hint="eastAsia"/>
-        </w:rPr>
-        <w:t>리전은</w:t>
-      </w:r>
-      <w:proofErr w:type="spellEnd"/>
-      <w:r>
-        <w:rPr>
-          <w:rFonts w:hint="eastAsia"/>
-        </w:rPr>
-        <w:t xml:space="preserve"> 어떤 기준으로 선택할까?</w:t>
+      <w:r>
+        <w:rPr>
+          <w:rFonts w:hint="eastAsia"/>
+        </w:rPr>
+        <w:t>리전은 어떤 기준으로 선택할까?</w:t>
       </w:r>
       <w:r>
         <w:br/>
@@ -841,21 +649,7 @@
         <w:rPr>
           <w:rFonts w:hint="eastAsia"/>
         </w:rPr>
-        <w:t xml:space="preserve">따라서 애플리케이션의 주된 사용자들의 위치와 지리적으로 가까운 </w:t>
-      </w:r>
-      <w:proofErr w:type="spellStart"/>
-      <w:r>
-        <w:rPr>
-          <w:rFonts w:hint="eastAsia"/>
-        </w:rPr>
-        <w:t>리전을</w:t>
-      </w:r>
-      <w:proofErr w:type="spellEnd"/>
-      <w:r>
-        <w:rPr>
-          <w:rFonts w:hint="eastAsia"/>
-        </w:rPr>
-        <w:t xml:space="preserve"> 사용하는 것이 유리하다.</w:t>
+        <w:t>따라서 애플리케이션의 주된 사용자들의 위치와 지리적으로 가까운 리전을 사용하는 것이 유리하다.</w:t>
       </w:r>
       <w:r>
         <w:br/>
@@ -873,35 +667,7 @@
         <w:rPr>
           <w:rFonts w:hint="eastAsia"/>
         </w:rPr>
-        <w:t xml:space="preserve">한국 유저들이 주로 사용하는 서비스를 </w:t>
-      </w:r>
-      <w:proofErr w:type="spellStart"/>
-      <w:r>
-        <w:rPr>
-          <w:rFonts w:hint="eastAsia"/>
-        </w:rPr>
-        <w:t>만들거라면</w:t>
-      </w:r>
-      <w:proofErr w:type="spellEnd"/>
-      <w:r>
-        <w:rPr>
-          <w:rFonts w:hint="eastAsia"/>
-        </w:rPr>
-        <w:t xml:space="preserve"> </w:t>
-      </w:r>
-      <w:proofErr w:type="spellStart"/>
-      <w:r>
-        <w:rPr>
-          <w:rFonts w:hint="eastAsia"/>
-        </w:rPr>
-        <w:t>리전을</w:t>
-      </w:r>
-      <w:proofErr w:type="spellEnd"/>
-      <w:r>
-        <w:rPr>
-          <w:rFonts w:hint="eastAsia"/>
-        </w:rPr>
-        <w:t xml:space="preserve"> 아시아 태평양(서울)로 선택하면 된다.</w:t>
+        <w:t>한국 유저들이 주로 사용하는 서비스를 만들거라면 리전을 아시아 태평양(서울)로 선택하면 된다.</w:t>
       </w:r>
     </w:p>
     <w:p>
@@ -944,21 +710,7 @@
         <w:rPr>
           <w:rFonts w:hint="eastAsia"/>
         </w:rPr>
-        <w:t xml:space="preserve">를 </w:t>
-      </w:r>
-      <w:proofErr w:type="spellStart"/>
-      <w:r>
-        <w:rPr>
-          <w:rFonts w:hint="eastAsia"/>
-        </w:rPr>
-        <w:t>생성해놓고</w:t>
-      </w:r>
-      <w:proofErr w:type="spellEnd"/>
-      <w:r>
-        <w:rPr>
-          <w:rFonts w:hint="eastAsia"/>
-        </w:rPr>
-        <w:t>,</w:t>
+        <w:t>를 생성해놓고,</w:t>
       </w:r>
       <w:r>
         <w:t xml:space="preserve"> </w:t>
@@ -972,19 +724,11 @@
       <w:r>
         <w:t xml:space="preserve"> </w:t>
       </w:r>
-      <w:proofErr w:type="spellStart"/>
-      <w:r>
-        <w:rPr>
-          <w:rFonts w:hint="eastAsia"/>
-        </w:rPr>
-        <w:t>리전에</w:t>
-      </w:r>
-      <w:proofErr w:type="spellEnd"/>
-      <w:r>
-        <w:rPr>
-          <w:rFonts w:hint="eastAsia"/>
-        </w:rPr>
-        <w:t xml:space="preserve"> 들어가서 생성한 </w:t>
+      <w:r>
+        <w:rPr>
+          <w:rFonts w:hint="eastAsia"/>
+        </w:rPr>
+        <w:t xml:space="preserve">리전에 들어가서 생성한 </w:t>
       </w:r>
       <w:r>
         <w:t>EC2</w:t>
@@ -1037,19 +781,11 @@
       <w:r>
         <w:t xml:space="preserve">C2 </w:t>
       </w:r>
-      <w:proofErr w:type="spellStart"/>
-      <w:r>
-        <w:rPr>
-          <w:rFonts w:hint="eastAsia"/>
-        </w:rPr>
-        <w:t>셋팅하기</w:t>
-      </w:r>
-      <w:proofErr w:type="spellEnd"/>
-      <w:r>
-        <w:rPr>
-          <w:rFonts w:hint="eastAsia"/>
-        </w:rPr>
-        <w:t xml:space="preserve"> </w:t>
+      <w:r>
+        <w:rPr>
+          <w:rFonts w:hint="eastAsia"/>
+        </w:rPr>
+        <w:t xml:space="preserve">셋팅하기 </w:t>
       </w:r>
       <w:r>
         <w:t xml:space="preserve">- </w:t>
@@ -1468,19 +1204,11 @@
       <w:r>
         <w:t xml:space="preserve"> </w:t>
       </w:r>
-      <w:proofErr w:type="spellStart"/>
-      <w:r>
-        <w:rPr>
-          <w:rFonts w:hint="eastAsia"/>
-        </w:rPr>
-        <w:t>인스턴스란</w:t>
-      </w:r>
-      <w:proofErr w:type="spellEnd"/>
-      <w:r>
-        <w:rPr>
-          <w:rFonts w:hint="eastAsia"/>
-        </w:rPr>
-        <w:t>,</w:t>
+      <w:r>
+        <w:rPr>
+          <w:rFonts w:hint="eastAsia"/>
+        </w:rPr>
+        <w:t>인스턴스란,</w:t>
       </w:r>
       <w:r>
         <w:t xml:space="preserve"> AWS </w:t>
@@ -1550,21 +1278,7 @@
         <w:rPr>
           <w:rFonts w:hint="eastAsia"/>
         </w:rPr>
-        <w:t xml:space="preserve">많이 오해하는 게 </w:t>
-      </w:r>
-      <w:proofErr w:type="spellStart"/>
-      <w:r>
-        <w:rPr>
-          <w:rFonts w:hint="eastAsia"/>
-        </w:rPr>
-        <w:t>프리티어가</w:t>
-      </w:r>
-      <w:proofErr w:type="spellEnd"/>
-      <w:r>
-        <w:rPr>
-          <w:rFonts w:hint="eastAsia"/>
-        </w:rPr>
-        <w:t xml:space="preserve"> 붙어있는 것들은 학습할 때나 테스트할 때만 쓰는 안 좋은 사양의 컴퓨터라고 생각한다.</w:t>
+        <w:t>많이 오해하는 게 프리티어가 붙어있는 것들은 학습할 때나 테스트할 때만 쓰는 안 좋은 사양의 컴퓨터라고 생각한다.</w:t>
       </w:r>
       <w:r>
         <w:t xml:space="preserve"> </w:t>
@@ -1743,7 +1457,6 @@
       <w:r>
         <w:t>SA</w:t>
       </w:r>
-      <w:proofErr w:type="gramStart"/>
       <w:r>
         <w:rPr>
           <w:rFonts w:hint="eastAsia"/>
@@ -1751,14 +1464,8 @@
         <w:t xml:space="preserve">와 </w:t>
       </w:r>
       <w:r>
-        <w:t>.</w:t>
-      </w:r>
-      <w:proofErr w:type="spellStart"/>
-      <w:r>
-        <w:t>pem</w:t>
-      </w:r>
-      <w:proofErr w:type="spellEnd"/>
-      <w:proofErr w:type="gramEnd"/>
+        <w:t>.pem</w:t>
+      </w:r>
       <w:r>
         <w:rPr>
           <w:rFonts w:hint="eastAsia"/>
@@ -1772,51 +1479,16 @@
         <w:rPr>
           <w:rFonts w:hint="eastAsia"/>
         </w:rPr>
-        <w:t xml:space="preserve">가 </w:t>
-      </w:r>
-      <w:proofErr w:type="spellStart"/>
-      <w:r>
-        <w:rPr>
-          <w:rFonts w:hint="eastAsia"/>
-        </w:rPr>
-        <w:t>뭔지</w:t>
-      </w:r>
-      <w:proofErr w:type="spellEnd"/>
-      <w:proofErr w:type="gramStart"/>
-      <w:r>
-        <w:rPr>
-          <w:rFonts w:hint="eastAsia"/>
-        </w:rPr>
-        <w:t>,</w:t>
-      </w:r>
-      <w:r>
-        <w:t xml:space="preserve"> .</w:t>
-      </w:r>
-      <w:proofErr w:type="spellStart"/>
-      <w:r>
-        <w:t>ppk</w:t>
-      </w:r>
-      <w:proofErr w:type="spellEnd"/>
-      <w:proofErr w:type="gramEnd"/>
-      <w:r>
-        <w:rPr>
-          <w:rFonts w:hint="eastAsia"/>
-        </w:rPr>
-        <w:t xml:space="preserve">가 </w:t>
-      </w:r>
-      <w:proofErr w:type="spellStart"/>
-      <w:r>
-        <w:rPr>
-          <w:rFonts w:hint="eastAsia"/>
-        </w:rPr>
-        <w:t>뭔지는</w:t>
-      </w:r>
-      <w:proofErr w:type="spellEnd"/>
-      <w:r>
-        <w:rPr>
-          <w:rFonts w:hint="eastAsia"/>
-        </w:rPr>
-        <w:t xml:space="preserve"> 몰라도 된다.</w:t>
+        <w:t>가 뭔지,</w:t>
+      </w:r>
+      <w:r>
+        <w:t xml:space="preserve"> .ppk</w:t>
+      </w:r>
+      <w:r>
+        <w:rPr>
+          <w:rFonts w:hint="eastAsia"/>
+        </w:rPr>
+        <w:t>가 뭔지는 몰라도 된다.</w:t>
       </w:r>
       <w:r>
         <w:t xml:space="preserve"> </w:t>
@@ -1833,21 +1505,7 @@
         <w:rPr>
           <w:rFonts w:hint="eastAsia"/>
         </w:rPr>
-        <w:t xml:space="preserve">키 페어를 생성하면 파일이 하나 </w:t>
-      </w:r>
-      <w:proofErr w:type="spellStart"/>
-      <w:r>
-        <w:rPr>
-          <w:rFonts w:hint="eastAsia"/>
-        </w:rPr>
-        <w:t>다운받아질텐데</w:t>
-      </w:r>
-      <w:proofErr w:type="spellEnd"/>
-      <w:r>
-        <w:rPr>
-          <w:rFonts w:hint="eastAsia"/>
-        </w:rPr>
-        <w:t>,</w:t>
+        <w:t>키 페어를 생성하면 파일이 하나 다운받아질텐데,</w:t>
       </w:r>
       <w:r>
         <w:t xml:space="preserve"> </w:t>
@@ -1856,21 +1514,7 @@
         <w:rPr>
           <w:rFonts w:hint="eastAsia"/>
         </w:rPr>
-        <w:t xml:space="preserve">그 파일은 잃어버리면 안 되니 잘 </w:t>
-      </w:r>
-      <w:proofErr w:type="spellStart"/>
-      <w:r>
-        <w:rPr>
-          <w:rFonts w:hint="eastAsia"/>
-        </w:rPr>
-        <w:t>보관해놔야</w:t>
-      </w:r>
-      <w:proofErr w:type="spellEnd"/>
-      <w:r>
-        <w:rPr>
-          <w:rFonts w:hint="eastAsia"/>
-        </w:rPr>
-        <w:t xml:space="preserve"> 한다.</w:t>
+        <w:t>그 파일은 잃어버리면 안 되니 잘 보관해놔야 한다.</w:t>
       </w:r>
       <w:r>
         <w:t xml:space="preserve"> </w:t>
@@ -1908,15 +1552,7 @@
       </w:pPr>
       <w:r>
         <w:lastRenderedPageBreak/>
-        <w:t xml:space="preserve">[실습] 3. EC2 </w:t>
-      </w:r>
-      <w:proofErr w:type="spellStart"/>
-      <w:r>
-        <w:t>셋팅하기</w:t>
-      </w:r>
-      <w:proofErr w:type="spellEnd"/>
-      <w:r>
-        <w:t xml:space="preserve"> - 보안그룹 설정</w:t>
+        <w:t>[실습] 3. EC2 셋팅하기 - 보안그룹 설정</w:t>
       </w:r>
     </w:p>
     <w:p>
@@ -2247,21 +1883,7 @@
         <w:rPr>
           <w:rFonts w:hint="eastAsia"/>
         </w:rPr>
-        <w:t xml:space="preserve">보안 그룹은 집 바깥 쪽에서 </w:t>
-      </w:r>
-      <w:proofErr w:type="spellStart"/>
-      <w:r>
-        <w:rPr>
-          <w:rFonts w:hint="eastAsia"/>
-        </w:rPr>
-        <w:t>쳐져있는</w:t>
-      </w:r>
-      <w:proofErr w:type="spellEnd"/>
-      <w:r>
-        <w:rPr>
-          <w:rFonts w:hint="eastAsia"/>
-        </w:rPr>
-        <w:t xml:space="preserve"> 울타리와 대문이라고 생각하면 된다.</w:t>
+        <w:t>보안 그룹은 집 바깥 쪽에서 쳐져있는 울타리와 대문이라고 생각하면 된다.</w:t>
       </w:r>
       <w:r>
         <w:t xml:space="preserve"> </w:t>
@@ -2314,21 +1936,7 @@
         <w:rPr>
           <w:rFonts w:hint="eastAsia"/>
         </w:rPr>
-        <w:t xml:space="preserve">이 보안 규칙에는 </w:t>
-      </w:r>
-      <w:proofErr w:type="spellStart"/>
-      <w:r>
-        <w:rPr>
-          <w:rFonts w:hint="eastAsia"/>
-        </w:rPr>
-        <w:t>인바운드</w:t>
-      </w:r>
-      <w:proofErr w:type="spellEnd"/>
-      <w:r>
-        <w:rPr>
-          <w:rFonts w:hint="eastAsia"/>
-        </w:rPr>
-        <w:t xml:space="preserve"> 트래픽(즉,</w:t>
+        <w:t>이 보안 규칙에는 인바운드 트래픽(즉,</w:t>
       </w:r>
       <w:r>
         <w:t xml:space="preserve"> </w:t>
@@ -2351,19 +1959,11 @@
       <w:r>
         <w:t xml:space="preserve"> </w:t>
       </w:r>
-      <w:proofErr w:type="spellStart"/>
-      <w:r>
-        <w:rPr>
-          <w:rFonts w:hint="eastAsia"/>
-        </w:rPr>
-        <w:t>아웃바운드</w:t>
-      </w:r>
-      <w:proofErr w:type="spellEnd"/>
-      <w:r>
-        <w:rPr>
-          <w:rFonts w:hint="eastAsia"/>
-        </w:rPr>
-        <w:t xml:space="preserve"> 트래픽(즉,</w:t>
+      <w:r>
+        <w:rPr>
+          <w:rFonts w:hint="eastAsia"/>
+        </w:rPr>
+        <w:t>아웃바운드 트래픽(즉,</w:t>
       </w:r>
       <w:r>
         <w:t xml:space="preserve"> EC2 </w:t>
@@ -2451,21 +2051,7 @@
         <w:rPr>
           <w:rFonts w:hint="eastAsia"/>
         </w:rPr>
-        <w:t xml:space="preserve">가지에 대해 </w:t>
-      </w:r>
-      <w:proofErr w:type="spellStart"/>
-      <w:r>
-        <w:rPr>
-          <w:rFonts w:hint="eastAsia"/>
-        </w:rPr>
-        <w:t>인바운드</w:t>
-      </w:r>
-      <w:proofErr w:type="spellEnd"/>
-      <w:r>
-        <w:rPr>
-          <w:rFonts w:hint="eastAsia"/>
-        </w:rPr>
-        <w:t xml:space="preserve"> 보안 그룹 규칙을 추가했다.</w:t>
+        <w:t>가지에 대해 인바운드 보안 그룹 규칙을 추가했다.</w:t>
       </w:r>
       <w:r>
         <w:t xml:space="preserve"> </w:t>
@@ -2501,21 +2087,7 @@
         <w:rPr>
           <w:rFonts w:hint="eastAsia"/>
         </w:rPr>
-        <w:t xml:space="preserve">번 포트에는 </w:t>
-      </w:r>
-      <w:proofErr w:type="spellStart"/>
-      <w:r>
-        <w:rPr>
-          <w:rFonts w:hint="eastAsia"/>
-        </w:rPr>
-        <w:t>백엔드</w:t>
-      </w:r>
-      <w:proofErr w:type="spellEnd"/>
-      <w:r>
-        <w:rPr>
-          <w:rFonts w:hint="eastAsia"/>
-        </w:rPr>
-        <w:t xml:space="preserve"> 서버를 띄울 예정이기 때문이다.</w:t>
+        <w:t>번 포트에는 백엔드 서버를 띄울 예정이기 때문이다.</w:t>
       </w:r>
       <w:r>
         <w:t xml:space="preserve"> </w:t>
@@ -2686,11 +2258,6 @@
       </w:r>
     </w:p>
     <w:p>
-      <w:pPr>
-        <w:rPr>
-          <w:rFonts w:hint="eastAsia"/>
-        </w:rPr>
-      </w:pPr>
       <w:r>
         <w:rPr>
           <w:noProof/>
@@ -2803,11 +2370,6 @@
       </w:r>
     </w:p>
     <w:p>
-      <w:pPr>
-        <w:rPr>
-          <w:rFonts w:hint="eastAsia"/>
-        </w:rPr>
-      </w:pPr>
       <w:r>
         <w:rPr>
           <w:rFonts w:hint="eastAsia"/>
@@ -2815,23 +2377,7 @@
         <w:t>한</w:t>
       </w:r>
       <w:r>
-        <w:t xml:space="preserve"> 컴퓨터 내에서 여러 프로그램이 실행되고 있을 것이다. 내가 지금 사용하고 있는 노트북만 보더라도 크롬, 카카오톡, </w:t>
-      </w:r>
-      <w:proofErr w:type="spellStart"/>
-      <w:r>
-        <w:t>슬랙</w:t>
-      </w:r>
-      <w:proofErr w:type="spellEnd"/>
-      <w:r>
-        <w:t xml:space="preserve">, </w:t>
-      </w:r>
-      <w:proofErr w:type="spellStart"/>
-      <w:r>
-        <w:t>VSCode</w:t>
-      </w:r>
-      <w:proofErr w:type="spellEnd"/>
-      <w:r>
-        <w:t xml:space="preserve"> 등 여러가지 프로그램이 동시에 실행되고 있다. 실제 서버를 운영하는 컴퓨터도 동일하다. 하나의 컴퓨터에서 여러가지의 프로그램이 실행된다. </w:t>
+        <w:t xml:space="preserve"> 컴퓨터 내에서 여러 프로그램이 실행되고 있을 것이다. 내가 지금 사용하고 있는 노트북만 보더라도 크롬, 카카오톡, 슬랙, VSCode 등 여러가지 프로그램이 동시에 실행되고 있다. 실제 서버를 운영하는 컴퓨터도 동일하다. 하나의 컴퓨터에서 여러가지의 프로그램이 실행된다. </w:t>
       </w:r>
     </w:p>
     <w:p>
@@ -2865,11 +2411,7 @@
         <w:t>위</w:t>
       </w:r>
       <w:r>
-        <w:t xml:space="preserve"> 설명에서 분명 특정 서버와 통신하기 위해서는 IP 주소와 포트 번호를 둘 다 알아야 된다고 했다. 도메인 주소를 통해서 알 수 있는 건 IP </w:t>
-      </w:r>
-      <w:proofErr w:type="gramStart"/>
-      <w:r>
-        <w:t>주소</w:t>
+        <w:t xml:space="preserve"> 설명에서 분명 특정 서버와 통신하기 위해서는 IP 주소와 포트 번호를 둘 다 알아야 된다고 했다. 도메인 주소를 통해서 알 수 있는 건 IP 주소</w:t>
       </w:r>
       <w:r>
         <w:rPr>
@@ -2878,11 +2420,7 @@
         <w:t xml:space="preserve"> </w:t>
       </w:r>
       <w:r>
-        <w:t>뿐이다</w:t>
-      </w:r>
-      <w:proofErr w:type="gramEnd"/>
-      <w:r>
-        <w:t>. 그럼 포트 번호를 입력해주지도 않았는데 어떻게 정상적으로 통신을 한 걸까?</w:t>
+        <w:t>뿐이다. 그럼 포트 번호를 입력해주지도 않았는데 어떻게 정상적으로 통신을 한 걸까?</w:t>
       </w:r>
     </w:p>
     <w:p>
@@ -2948,15 +2486,7 @@
         <w:t>주소창에</w:t>
       </w:r>
       <w:r>
-        <w:t xml:space="preserve"> 도메인 주소를 입력해서 </w:t>
-      </w:r>
-      <w:proofErr w:type="spellStart"/>
-      <w:r>
-        <w:t>엔터를</w:t>
-      </w:r>
-      <w:proofErr w:type="spellEnd"/>
-      <w:r>
-        <w:t xml:space="preserve"> 누르면, 브라우저(크롬, 익스플로러 등)는 기본적으로 80번 포트로 통신을 보내게 설정되어 있다. 그래서 포트 번호를 입력해주지 않아도 통신이 잘 됐던 것이었다. 만약 80번 포트로 통신하고 싶지 않고, 3000번 포트로 통신하고 싶다면 아래와 같이 주소창에 입력해야 한다.</w:t>
+        <w:t xml:space="preserve"> 도메인 주소를 입력해서 엔터를 누르면, 브라우저(크롬, 익스플로러 등)는 기본적으로 80번 포트로 통신을 보내게 설정되어 있다. 그래서 포트 번호를 입력해주지 않아도 통신이 잘 됐던 것이었다. 만약 80번 포트로 통신하고 싶지 않고, 3000번 포트로 통신하고 싶다면 아래와 같이 주소창에 입력해야 한다.</w:t>
       </w:r>
     </w:p>
     <w:p>
@@ -3043,30 +2573,11 @@
         <w:t>포트</w:t>
       </w:r>
       <w:r>
-        <w:t xml:space="preserve"> 번호는 0 ~ 65,535번까지 사용할 수 있다. 그 중에서 0 ~ 1023번까지의 포트 번호는 주요 통신을 위한 규약에 따라 이미 정해져 있다. 이렇게 규약을 통해 역할이 </w:t>
-      </w:r>
-      <w:proofErr w:type="spellStart"/>
-      <w:r>
-        <w:t>정해져있는</w:t>
-      </w:r>
-      <w:proofErr w:type="spellEnd"/>
-      <w:r>
-        <w:t xml:space="preserve"> 포트 번호를 보고 잘 알려진 포트(well-known port)라고 부른다. </w:t>
-      </w:r>
-    </w:p>
-    <w:p>
-      <w:pPr>
-        <w:rPr>
-          <w:rFonts w:hint="eastAsia"/>
-        </w:rPr>
-      </w:pPr>
-    </w:p>
-    <w:p>
-      <w:pPr>
-        <w:rPr>
-          <w:rFonts w:hint="eastAsia"/>
-        </w:rPr>
-      </w:pPr>
+        <w:t xml:space="preserve"> 번호는 0 ~ 65,535번까지 사용할 수 있다. 그 중에서 0 ~ 1023번까지의 포트 번호는 주요 통신을 위한 규약에 따라 이미 정해져 있다. 이렇게 규약을 통해 역할이 정해져있는 포트 번호를 보고 잘 알려진 포트(well-known port)라고 부른다. </w:t>
+      </w:r>
+    </w:p>
+    <w:p/>
+    <w:p>
       <w:r>
         <w:rPr>
           <w:rFonts w:hint="eastAsia"/>
@@ -3099,11 +2610,6 @@
     </w:p>
     <w:p/>
     <w:p>
-      <w:pPr>
-        <w:rPr>
-          <w:rFonts w:hint="eastAsia"/>
-        </w:rPr>
-      </w:pPr>
       <w:r>
         <w:rPr>
           <w:rFonts w:hint="eastAsia"/>
@@ -3127,13 +2633,7 @@
         <w:t>때 80번 포트를 쓰지 않고 3000번 포트나 8080번 포트를 써도 상관없다.</w:t>
       </w:r>
     </w:p>
-    <w:p>
-      <w:pPr>
-        <w:rPr>
-          <w:rFonts w:hint="eastAsia"/>
-        </w:rPr>
-      </w:pPr>
-    </w:p>
+    <w:p/>
     <w:p>
       <w:pPr>
         <w:pStyle w:val="1"/>
@@ -3147,33 +2647,2980 @@
       <w:r>
         <w:t xml:space="preserve"> 4. EC2 </w:t>
       </w:r>
-      <w:proofErr w:type="spellStart"/>
-      <w:r>
-        <w:rPr>
-          <w:rFonts w:hint="eastAsia"/>
-        </w:rPr>
-        <w:t>셋팅하기</w:t>
-      </w:r>
-      <w:proofErr w:type="spellEnd"/>
-      <w:r>
-        <w:rPr>
-          <w:rFonts w:hint="eastAsia"/>
-        </w:rPr>
+      <w:r>
+        <w:rPr>
+          <w:rFonts w:hint="eastAsia"/>
+        </w:rPr>
+        <w:t xml:space="preserve">셋팅하기 </w:t>
+      </w:r>
+      <w:r>
+        <w:t xml:space="preserve">- </w:t>
+      </w:r>
+      <w:r>
+        <w:rPr>
+          <w:rFonts w:hint="eastAsia"/>
+        </w:rPr>
+        <w:t>스토리지 구성</w:t>
+      </w:r>
+    </w:p>
+    <w:p>
+      <w:pPr>
+        <w:pStyle w:val="2"/>
+      </w:pPr>
+      <w:r>
+        <w:rPr>
+          <w:rFonts w:hint="eastAsia"/>
+        </w:rPr>
+        <w:t>스토리지 구성</w:t>
+      </w:r>
+    </w:p>
+    <w:p>
+      <w:r>
+        <w:rPr>
+          <w:noProof/>
+        </w:rPr>
+        <w:drawing>
+          <wp:inline distT="0" distB="0" distL="0" distR="0" wp14:anchorId="70D90F41" wp14:editId="3E7E7F09">
+            <wp:extent cx="5731510" cy="1863725"/>
+            <wp:effectExtent l="0" t="0" r="2540" b="3175"/>
+            <wp:docPr id="1225781078" name="그림 1"/>
+            <wp:cNvGraphicFramePr>
+              <a:graphicFrameLocks xmlns:a="http://schemas.openxmlformats.org/drawingml/2006/main" noChangeAspect="1"/>
+            </wp:cNvGraphicFramePr>
+            <a:graphic xmlns:a="http://schemas.openxmlformats.org/drawingml/2006/main">
+              <a:graphicData uri="http://schemas.openxmlformats.org/drawingml/2006/picture">
+                <pic:pic xmlns:pic="http://schemas.openxmlformats.org/drawingml/2006/picture">
+                  <pic:nvPicPr>
+                    <pic:cNvPr id="0" name="Picture 1"/>
+                    <pic:cNvPicPr>
+                      <a:picLocks noChangeAspect="1" noChangeArrowheads="1"/>
+                    </pic:cNvPicPr>
+                  </pic:nvPicPr>
+                  <pic:blipFill>
+                    <a:blip r:embed="rId22" cstate="print">
+                      <a:extLst>
+                        <a:ext uri="{28A0092B-C50C-407E-A947-70E740481C1C}">
+                          <a14:useLocalDpi xmlns:a14="http://schemas.microsoft.com/office/drawing/2010/main" val="0"/>
+                        </a:ext>
+                      </a:extLst>
+                    </a:blip>
+                    <a:srcRect/>
+                    <a:stretch>
+                      <a:fillRect/>
+                    </a:stretch>
+                  </pic:blipFill>
+                  <pic:spPr bwMode="auto">
+                    <a:xfrm>
+                      <a:off x="0" y="0"/>
+                      <a:ext cx="5731510" cy="1863725"/>
+                    </a:xfrm>
+                    <a:prstGeom prst="rect">
+                      <a:avLst/>
+                    </a:prstGeom>
+                    <a:noFill/>
+                    <a:ln>
+                      <a:noFill/>
+                    </a:ln>
+                  </pic:spPr>
+                </pic:pic>
+              </a:graphicData>
+            </a:graphic>
+          </wp:inline>
+        </w:drawing>
+      </w:r>
+    </w:p>
+    <w:p>
+      <w:r>
+        <w:rPr>
+          <w:noProof/>
+        </w:rPr>
+        <w:drawing>
+          <wp:inline distT="0" distB="0" distL="0" distR="0" wp14:anchorId="295C4BD0" wp14:editId="2ABAB114">
+            <wp:extent cx="5731510" cy="2529205"/>
+            <wp:effectExtent l="0" t="0" r="2540" b="4445"/>
+            <wp:docPr id="1624949689" name="그림 2"/>
+            <wp:cNvGraphicFramePr>
+              <a:graphicFrameLocks xmlns:a="http://schemas.openxmlformats.org/drawingml/2006/main" noChangeAspect="1"/>
+            </wp:cNvGraphicFramePr>
+            <a:graphic xmlns:a="http://schemas.openxmlformats.org/drawingml/2006/main">
+              <a:graphicData uri="http://schemas.openxmlformats.org/drawingml/2006/picture">
+                <pic:pic xmlns:pic="http://schemas.openxmlformats.org/drawingml/2006/picture">
+                  <pic:nvPicPr>
+                    <pic:cNvPr id="0" name="Picture 3"/>
+                    <pic:cNvPicPr>
+                      <a:picLocks noChangeAspect="1" noChangeArrowheads="1"/>
+                    </pic:cNvPicPr>
+                  </pic:nvPicPr>
+                  <pic:blipFill>
+                    <a:blip r:embed="rId23" cstate="print">
+                      <a:extLst>
+                        <a:ext uri="{28A0092B-C50C-407E-A947-70E740481C1C}">
+                          <a14:useLocalDpi xmlns:a14="http://schemas.microsoft.com/office/drawing/2010/main" val="0"/>
+                        </a:ext>
+                      </a:extLst>
+                    </a:blip>
+                    <a:srcRect/>
+                    <a:stretch>
+                      <a:fillRect/>
+                    </a:stretch>
+                  </pic:blipFill>
+                  <pic:spPr bwMode="auto">
+                    <a:xfrm>
+                      <a:off x="0" y="0"/>
+                      <a:ext cx="5731510" cy="2529205"/>
+                    </a:xfrm>
+                    <a:prstGeom prst="rect">
+                      <a:avLst/>
+                    </a:prstGeom>
+                    <a:noFill/>
+                    <a:ln>
+                      <a:noFill/>
+                    </a:ln>
+                  </pic:spPr>
+                </pic:pic>
+              </a:graphicData>
+            </a:graphic>
+          </wp:inline>
+        </w:drawing>
+      </w:r>
+    </w:p>
+    <w:p>
+      <w:r>
+        <w:rPr>
+          <w:rFonts w:hint="eastAsia"/>
+        </w:rPr>
+        <w:t>우리가 쓰고 있는 컴퓨터나 노트북은 전부 디스크를 가지고 있다.</w:t>
+      </w:r>
+      <w:r>
         <w:t xml:space="preserve"> </w:t>
       </w:r>
       <w:r>
-        <w:t xml:space="preserve">- </w:t>
-      </w:r>
-      <w:r>
-        <w:rPr>
-          <w:rFonts w:hint="eastAsia"/>
-        </w:rPr>
-        <w:t>스토리지 구성</w:t>
+        <w:rPr>
+          <w:rFonts w:hint="eastAsia"/>
+        </w:rPr>
+        <w:t>디스크는 컴퓨터에서 파일을 저장하는 공간이다.</w:t>
+      </w:r>
+      <w:r>
+        <w:t xml:space="preserve"> EC2</w:t>
+      </w:r>
+      <w:r>
+        <w:rPr>
+          <w:rFonts w:hint="eastAsia"/>
+        </w:rPr>
+        <w:t>도 하나의 컴퓨터이다보니 여러 파일들을 저장할 저장 공간이 필요하다.</w:t>
+      </w:r>
+      <w:r>
+        <w:t xml:space="preserve"> </w:t>
+      </w:r>
+      <w:r>
+        <w:rPr>
+          <w:rFonts w:hint="eastAsia"/>
+        </w:rPr>
+        <w:t xml:space="preserve">이 저장 공간을 보고 </w:t>
+      </w:r>
+      <w:r>
+        <w:t>EBS(Elastic Block Storage)</w:t>
+      </w:r>
+      <w:r>
+        <w:rPr>
+          <w:rFonts w:hint="eastAsia"/>
+        </w:rPr>
+        <w:t>라고 부른다.</w:t>
+      </w:r>
+      <w:r>
+        <w:t xml:space="preserve"> </w:t>
+      </w:r>
+      <w:r>
+        <w:rPr>
+          <w:rFonts w:hint="eastAsia"/>
+        </w:rPr>
+        <w:t>즉,</w:t>
+      </w:r>
+      <w:r>
+        <w:t xml:space="preserve"> EBS</w:t>
+      </w:r>
+      <w:r>
+        <w:rPr>
+          <w:rFonts w:hint="eastAsia"/>
+        </w:rPr>
+        <w:t xml:space="preserve">란 </w:t>
+      </w:r>
+      <w:r>
+        <w:t xml:space="preserve">EC2 </w:t>
+      </w:r>
+      <w:r>
+        <w:rPr>
+          <w:rFonts w:hint="eastAsia"/>
+        </w:rPr>
+        <w:t>안에 부착되어 있는 일종의 디스크라고 생각하면 된다.</w:t>
+      </w:r>
+      <w:r>
+        <w:t xml:space="preserve"> EBS</w:t>
+      </w:r>
+      <w:r>
+        <w:rPr>
+          <w:rFonts w:hint="eastAsia"/>
+        </w:rPr>
+        <w:t>와 같은 저장 공간을 조금 더 포괄적인 용어로 스토리지(</w:t>
+      </w:r>
+      <w:r>
+        <w:t xml:space="preserve">Storage), </w:t>
+      </w:r>
+      <w:r>
+        <w:rPr>
+          <w:rFonts w:hint="eastAsia"/>
+        </w:rPr>
+        <w:t>볼륨(</w:t>
+      </w:r>
+      <w:r>
+        <w:t>Volume)</w:t>
+      </w:r>
+      <w:r>
+        <w:rPr>
+          <w:rFonts w:hint="eastAsia"/>
+        </w:rPr>
+        <w:t>이라고 부른다.</w:t>
+      </w:r>
+    </w:p>
+    <w:p>
+      <w:pPr>
+        <w:pStyle w:val="2"/>
+      </w:pPr>
+      <w:r>
+        <w:rPr>
+          <w:rFonts w:hint="eastAsia"/>
+        </w:rPr>
+        <w:lastRenderedPageBreak/>
+        <w:t>셋팅</w:t>
+      </w:r>
+    </w:p>
+    <w:p>
+      <w:r>
+        <w:rPr>
+          <w:noProof/>
+        </w:rPr>
+        <w:drawing>
+          <wp:inline distT="0" distB="0" distL="0" distR="0" wp14:anchorId="2D9E7B38" wp14:editId="61891FF8">
+            <wp:extent cx="5731510" cy="1818005"/>
+            <wp:effectExtent l="0" t="0" r="2540" b="0"/>
+            <wp:docPr id="2103916229" name="그림 1"/>
+            <wp:cNvGraphicFramePr>
+              <a:graphicFrameLocks xmlns:a="http://schemas.openxmlformats.org/drawingml/2006/main" noChangeAspect="1"/>
+            </wp:cNvGraphicFramePr>
+            <a:graphic xmlns:a="http://schemas.openxmlformats.org/drawingml/2006/main">
+              <a:graphicData uri="http://schemas.openxmlformats.org/drawingml/2006/picture">
+                <pic:pic xmlns:pic="http://schemas.openxmlformats.org/drawingml/2006/picture">
+                  <pic:nvPicPr>
+                    <pic:cNvPr id="2103916229" name=""/>
+                    <pic:cNvPicPr/>
+                  </pic:nvPicPr>
+                  <pic:blipFill>
+                    <a:blip r:embed="rId24"/>
+                    <a:stretch>
+                      <a:fillRect/>
+                    </a:stretch>
+                  </pic:blipFill>
+                  <pic:spPr>
+                    <a:xfrm>
+                      <a:off x="0" y="0"/>
+                      <a:ext cx="5731510" cy="1818005"/>
+                    </a:xfrm>
+                    <a:prstGeom prst="rect">
+                      <a:avLst/>
+                    </a:prstGeom>
+                  </pic:spPr>
+                </pic:pic>
+              </a:graphicData>
+            </a:graphic>
+          </wp:inline>
+        </w:drawing>
+      </w:r>
+    </w:p>
+    <w:p>
+      <w:r>
+        <w:rPr>
+          <w:rFonts w:hint="eastAsia"/>
+        </w:rPr>
+        <w:t>스토리지의</w:t>
+      </w:r>
+      <w:r>
+        <w:t xml:space="preserve"> 종류를 보면 gp3 이외에도 여러가지 종류의 스토리지가 있다. 하지만 가성비가 좋은 gp3를 선택해주자. 용량을 30GiB를 설정한 이유는 프리 티어에서 30GiB까지 무료로 제공해주기 때문이다. 이 스토리지의 크기는 추후에 늘릴 수도 있으므로 처음 설정할 때 너무 큰 고민을 할 필요는 없다.</w:t>
       </w:r>
     </w:p>
     <w:p/>
+    <w:p>
+      <w:r>
+        <w:rPr>
+          <w:rFonts w:hint="eastAsia"/>
+        </w:rPr>
+        <w:t>이후 인스턴스 시작을 눌러 인스턴스를 생성한다.</w:t>
+      </w:r>
+    </w:p>
+    <w:p>
+      <w:r>
+        <w:rPr>
+          <w:noProof/>
+        </w:rPr>
+        <w:drawing>
+          <wp:inline distT="0" distB="0" distL="0" distR="0" wp14:anchorId="07CEAECF" wp14:editId="3BA6C683">
+            <wp:extent cx="5731510" cy="1829435"/>
+            <wp:effectExtent l="0" t="0" r="2540" b="0"/>
+            <wp:docPr id="23852557" name="그림 1"/>
+            <wp:cNvGraphicFramePr>
+              <a:graphicFrameLocks xmlns:a="http://schemas.openxmlformats.org/drawingml/2006/main" noChangeAspect="1"/>
+            </wp:cNvGraphicFramePr>
+            <a:graphic xmlns:a="http://schemas.openxmlformats.org/drawingml/2006/main">
+              <a:graphicData uri="http://schemas.openxmlformats.org/drawingml/2006/picture">
+                <pic:pic xmlns:pic="http://schemas.openxmlformats.org/drawingml/2006/picture">
+                  <pic:nvPicPr>
+                    <pic:cNvPr id="23852557" name=""/>
+                    <pic:cNvPicPr/>
+                  </pic:nvPicPr>
+                  <pic:blipFill>
+                    <a:blip r:embed="rId25"/>
+                    <a:stretch>
+                      <a:fillRect/>
+                    </a:stretch>
+                  </pic:blipFill>
+                  <pic:spPr>
+                    <a:xfrm>
+                      <a:off x="0" y="0"/>
+                      <a:ext cx="5731510" cy="1829435"/>
+                    </a:xfrm>
+                    <a:prstGeom prst="rect">
+                      <a:avLst/>
+                    </a:prstGeom>
+                  </pic:spPr>
+                </pic:pic>
+              </a:graphicData>
+            </a:graphic>
+          </wp:inline>
+        </w:drawing>
+      </w:r>
+    </w:p>
+    <w:p>
+      <w:r>
+        <w:rPr>
+          <w:rFonts w:hint="eastAsia"/>
+        </w:rPr>
+        <w:t>그렇다면 다음과 같이 인스턴스가 생성된 것을 확인할 수 있다.</w:t>
+      </w:r>
+    </w:p>
     <w:p/>
+    <w:p>
+      <w:pPr>
+        <w:pStyle w:val="1"/>
+      </w:pPr>
+      <w:r>
+        <w:rPr>
+          <w:rFonts w:hint="eastAsia"/>
+        </w:rPr>
+        <w:t>[실습]</w:t>
+      </w:r>
+      <w:r>
+        <w:t xml:space="preserve"> 5. EC2 </w:t>
+      </w:r>
+      <w:r>
+        <w:rPr>
+          <w:rFonts w:hint="eastAsia"/>
+        </w:rPr>
+        <w:t>접속하기</w:t>
+      </w:r>
+    </w:p>
+    <w:p>
+      <w:r>
+        <w:rPr>
+          <w:rFonts w:hint="eastAsia"/>
+        </w:rPr>
+        <w:t>인스턴스 안에 들어가면 세부 정보들을 확인할 수 있다.</w:t>
+      </w:r>
+    </w:p>
+    <w:p>
+      <w:pPr>
+        <w:pStyle w:val="2"/>
+      </w:pPr>
+      <w:r>
+        <w:rPr>
+          <w:rFonts w:hint="eastAsia"/>
+        </w:rPr>
+        <w:lastRenderedPageBreak/>
+        <w:t>세부 정보</w:t>
+      </w:r>
+    </w:p>
+    <w:p>
+      <w:r>
+        <w:rPr>
+          <w:noProof/>
+        </w:rPr>
+        <w:drawing>
+          <wp:inline distT="0" distB="0" distL="0" distR="0" wp14:anchorId="3BFFD33A" wp14:editId="0A31AF63">
+            <wp:extent cx="5731510" cy="2713990"/>
+            <wp:effectExtent l="0" t="0" r="2540" b="0"/>
+            <wp:docPr id="408078385" name="그림 1"/>
+            <wp:cNvGraphicFramePr>
+              <a:graphicFrameLocks xmlns:a="http://schemas.openxmlformats.org/drawingml/2006/main" noChangeAspect="1"/>
+            </wp:cNvGraphicFramePr>
+            <a:graphic xmlns:a="http://schemas.openxmlformats.org/drawingml/2006/main">
+              <a:graphicData uri="http://schemas.openxmlformats.org/drawingml/2006/picture">
+                <pic:pic xmlns:pic="http://schemas.openxmlformats.org/drawingml/2006/picture">
+                  <pic:nvPicPr>
+                    <pic:cNvPr id="408078385" name=""/>
+                    <pic:cNvPicPr/>
+                  </pic:nvPicPr>
+                  <pic:blipFill>
+                    <a:blip r:embed="rId26"/>
+                    <a:stretch>
+                      <a:fillRect/>
+                    </a:stretch>
+                  </pic:blipFill>
+                  <pic:spPr>
+                    <a:xfrm>
+                      <a:off x="0" y="0"/>
+                      <a:ext cx="5731510" cy="2713990"/>
+                    </a:xfrm>
+                    <a:prstGeom prst="rect">
+                      <a:avLst/>
+                    </a:prstGeom>
+                  </pic:spPr>
+                </pic:pic>
+              </a:graphicData>
+            </a:graphic>
+          </wp:inline>
+        </w:drawing>
+      </w:r>
+    </w:p>
+    <w:p>
+      <w:r>
+        <w:rPr>
+          <w:rFonts w:hint="eastAsia"/>
+        </w:rPr>
+        <w:t xml:space="preserve">이 중 퍼블릭 </w:t>
+      </w:r>
+      <w:r>
+        <w:t xml:space="preserve">IPv4 </w:t>
+      </w:r>
+      <w:r>
+        <w:rPr>
+          <w:rFonts w:hint="eastAsia"/>
+        </w:rPr>
+        <w:t>주소,</w:t>
+      </w:r>
+      <w:r>
+        <w:t xml:space="preserve"> </w:t>
+      </w:r>
+      <w:r>
+        <w:rPr>
+          <w:rFonts w:hint="eastAsia"/>
+        </w:rPr>
+        <w:t>인스턴스 상태 정도만 보고 넘어가자.</w:t>
+      </w:r>
+    </w:p>
+    <w:p>
+      <w:pPr>
+        <w:pStyle w:val="a3"/>
+        <w:numPr>
+          <w:ilvl w:val="0"/>
+          <w:numId w:val="6"/>
+        </w:numPr>
+        <w:ind w:leftChars="0"/>
+      </w:pPr>
+      <w:r>
+        <w:rPr>
+          <w:rFonts w:hint="eastAsia"/>
+        </w:rPr>
+        <w:t xml:space="preserve">퍼블릭 </w:t>
+      </w:r>
+      <w:r>
+        <w:t xml:space="preserve">IPv4 </w:t>
+      </w:r>
+      <w:r>
+        <w:rPr>
+          <w:rFonts w:hint="eastAsia"/>
+        </w:rPr>
+        <w:t>주소:</w:t>
+      </w:r>
+      <w:r>
+        <w:t xml:space="preserve"> </w:t>
+      </w:r>
+      <w:r>
+        <w:rPr>
+          <w:rFonts w:hint="eastAsia"/>
+        </w:rPr>
+        <w:t>E</w:t>
+      </w:r>
+      <w:r>
+        <w:t xml:space="preserve">C2 </w:t>
+      </w:r>
+      <w:r>
+        <w:rPr>
+          <w:rFonts w:hint="eastAsia"/>
+        </w:rPr>
+        <w:t xml:space="preserve">인스턴스가 생성되면서 부여받은 </w:t>
+      </w:r>
+      <w:r>
+        <w:t xml:space="preserve">IP </w:t>
+      </w:r>
+      <w:r>
+        <w:rPr>
+          <w:rFonts w:hint="eastAsia"/>
+        </w:rPr>
+        <w:t>주소이다.</w:t>
+      </w:r>
+      <w:r>
+        <w:t xml:space="preserve"> EC2 </w:t>
+      </w:r>
+      <w:r>
+        <w:rPr>
+          <w:rFonts w:hint="eastAsia"/>
+        </w:rPr>
+        <w:t xml:space="preserve">인스턴스에 접근하려면 이 </w:t>
+      </w:r>
+      <w:r>
+        <w:t xml:space="preserve">IPO </w:t>
+      </w:r>
+      <w:r>
+        <w:rPr>
+          <w:rFonts w:hint="eastAsia"/>
+        </w:rPr>
+        <w:t>주소로 접근하면 된다.</w:t>
+      </w:r>
+    </w:p>
+    <w:p>
+      <w:pPr>
+        <w:pStyle w:val="a3"/>
+        <w:numPr>
+          <w:ilvl w:val="0"/>
+          <w:numId w:val="6"/>
+        </w:numPr>
+        <w:ind w:leftChars="0"/>
+      </w:pPr>
+      <w:r>
+        <w:rPr>
+          <w:rFonts w:hint="eastAsia"/>
+        </w:rPr>
+        <w:t>인스턴스 상태:</w:t>
+      </w:r>
+      <w:r>
+        <w:t xml:space="preserve"> EC2</w:t>
+      </w:r>
+      <w:r>
+        <w:rPr>
+          <w:rFonts w:hint="eastAsia"/>
+        </w:rPr>
+        <w:t xml:space="preserve"> 인스턴스가 실행 중인지 확인할 수 있다.</w:t>
+      </w:r>
+      <w:r>
+        <w:br/>
+      </w:r>
+      <w:r>
+        <w:rPr>
+          <w:noProof/>
+        </w:rPr>
+        <w:drawing>
+          <wp:inline distT="0" distB="0" distL="0" distR="0" wp14:anchorId="4A466889" wp14:editId="0A253D65">
+            <wp:extent cx="1933845" cy="1781424"/>
+            <wp:effectExtent l="0" t="0" r="9525" b="9525"/>
+            <wp:docPr id="1498574691" name="그림 1"/>
+            <wp:cNvGraphicFramePr>
+              <a:graphicFrameLocks xmlns:a="http://schemas.openxmlformats.org/drawingml/2006/main" noChangeAspect="1"/>
+            </wp:cNvGraphicFramePr>
+            <a:graphic xmlns:a="http://schemas.openxmlformats.org/drawingml/2006/main">
+              <a:graphicData uri="http://schemas.openxmlformats.org/drawingml/2006/picture">
+                <pic:pic xmlns:pic="http://schemas.openxmlformats.org/drawingml/2006/picture">
+                  <pic:nvPicPr>
+                    <pic:cNvPr id="1498574691" name=""/>
+                    <pic:cNvPicPr/>
+                  </pic:nvPicPr>
+                  <pic:blipFill>
+                    <a:blip r:embed="rId27"/>
+                    <a:stretch>
+                      <a:fillRect/>
+                    </a:stretch>
+                  </pic:blipFill>
+                  <pic:spPr>
+                    <a:xfrm>
+                      <a:off x="0" y="0"/>
+                      <a:ext cx="1933845" cy="1781424"/>
+                    </a:xfrm>
+                    <a:prstGeom prst="rect">
+                      <a:avLst/>
+                    </a:prstGeom>
+                  </pic:spPr>
+                </pic:pic>
+              </a:graphicData>
+            </a:graphic>
+          </wp:inline>
+        </w:drawing>
+      </w:r>
+      <w:r>
+        <w:br/>
+      </w:r>
+      <w:r>
+        <w:t>EC2 인스턴스를 중지, 재부팅, 종료도 할 수 있다. 우리가 쓰는 컴퓨터와 아주 유사하다. 재부팅은 말그대로 컴퓨터를 재시작시키는 걸 의미하고, 중지는 컴퓨터를 잠시 꺼놓는 걸 의미한다. 종료는 컴퓨터를 아예 삭제시킨다는 걸 의미한다. EC2 인스턴스를 한 번 종료하면 도중에 취소할 수 없으니 조심해야 한다.</w:t>
+      </w:r>
+    </w:p>
+    <w:p>
+      <w:pPr>
+        <w:pStyle w:val="2"/>
+      </w:pPr>
+      <w:r>
+        <w:rPr>
+          <w:rFonts w:hint="eastAsia"/>
+        </w:rPr>
+        <w:lastRenderedPageBreak/>
+        <w:t>보안 그룹</w:t>
+      </w:r>
+    </w:p>
+    <w:p>
+      <w:r>
+        <w:rPr>
+          <w:noProof/>
+        </w:rPr>
+        <w:drawing>
+          <wp:inline distT="0" distB="0" distL="0" distR="0" wp14:anchorId="1B7FEA95" wp14:editId="49443041">
+            <wp:extent cx="5731510" cy="2173605"/>
+            <wp:effectExtent l="0" t="0" r="2540" b="0"/>
+            <wp:docPr id="1581361793" name="그림 1"/>
+            <wp:cNvGraphicFramePr>
+              <a:graphicFrameLocks xmlns:a="http://schemas.openxmlformats.org/drawingml/2006/main" noChangeAspect="1"/>
+            </wp:cNvGraphicFramePr>
+            <a:graphic xmlns:a="http://schemas.openxmlformats.org/drawingml/2006/main">
+              <a:graphicData uri="http://schemas.openxmlformats.org/drawingml/2006/picture">
+                <pic:pic xmlns:pic="http://schemas.openxmlformats.org/drawingml/2006/picture">
+                  <pic:nvPicPr>
+                    <pic:cNvPr id="1581361793" name=""/>
+                    <pic:cNvPicPr/>
+                  </pic:nvPicPr>
+                  <pic:blipFill>
+                    <a:blip r:embed="rId28"/>
+                    <a:stretch>
+                      <a:fillRect/>
+                    </a:stretch>
+                  </pic:blipFill>
+                  <pic:spPr>
+                    <a:xfrm>
+                      <a:off x="0" y="0"/>
+                      <a:ext cx="5731510" cy="2173605"/>
+                    </a:xfrm>
+                    <a:prstGeom prst="rect">
+                      <a:avLst/>
+                    </a:prstGeom>
+                  </pic:spPr>
+                </pic:pic>
+              </a:graphicData>
+            </a:graphic>
+          </wp:inline>
+        </w:drawing>
+      </w:r>
+    </w:p>
+    <w:p>
+      <w:r>
+        <w:rPr>
+          <w:rFonts w:hint="eastAsia"/>
+        </w:rPr>
+        <w:t>인스턴스 생성 시 설정한 보안 그룹에 대한 정보를 확인할 수 있다.</w:t>
+      </w:r>
+    </w:p>
+    <w:p>
+      <w:pPr>
+        <w:pStyle w:val="2"/>
+      </w:pPr>
+      <w:r>
+        <w:rPr>
+          <w:rFonts w:hint="eastAsia"/>
+        </w:rPr>
+        <w:t>스토리지</w:t>
+      </w:r>
+    </w:p>
+    <w:p>
+      <w:r>
+        <w:rPr>
+          <w:noProof/>
+        </w:rPr>
+        <w:drawing>
+          <wp:inline distT="0" distB="0" distL="0" distR="0" wp14:anchorId="3B8153DE" wp14:editId="72757042">
+            <wp:extent cx="5731510" cy="1072515"/>
+            <wp:effectExtent l="0" t="0" r="2540" b="0"/>
+            <wp:docPr id="1918564718" name="그림 1"/>
+            <wp:cNvGraphicFramePr>
+              <a:graphicFrameLocks xmlns:a="http://schemas.openxmlformats.org/drawingml/2006/main" noChangeAspect="1"/>
+            </wp:cNvGraphicFramePr>
+            <a:graphic xmlns:a="http://schemas.openxmlformats.org/drawingml/2006/main">
+              <a:graphicData uri="http://schemas.openxmlformats.org/drawingml/2006/picture">
+                <pic:pic xmlns:pic="http://schemas.openxmlformats.org/drawingml/2006/picture">
+                  <pic:nvPicPr>
+                    <pic:cNvPr id="1918564718" name=""/>
+                    <pic:cNvPicPr/>
+                  </pic:nvPicPr>
+                  <pic:blipFill>
+                    <a:blip r:embed="rId29"/>
+                    <a:stretch>
+                      <a:fillRect/>
+                    </a:stretch>
+                  </pic:blipFill>
+                  <pic:spPr>
+                    <a:xfrm>
+                      <a:off x="0" y="0"/>
+                      <a:ext cx="5731510" cy="1072515"/>
+                    </a:xfrm>
+                    <a:prstGeom prst="rect">
+                      <a:avLst/>
+                    </a:prstGeom>
+                  </pic:spPr>
+                </pic:pic>
+              </a:graphicData>
+            </a:graphic>
+          </wp:inline>
+        </w:drawing>
+      </w:r>
+    </w:p>
+    <w:p>
+      <w:r>
+        <w:rPr>
+          <w:rFonts w:hint="eastAsia"/>
+        </w:rPr>
+        <w:t>인스턴스 생성 시 설정한 스토리지에 대한 정보가 나온다.</w:t>
+      </w:r>
+    </w:p>
+    <w:p>
+      <w:pPr>
+        <w:pStyle w:val="2"/>
+      </w:pPr>
+      <w:r>
+        <w:rPr>
+          <w:rFonts w:hint="eastAsia"/>
+        </w:rPr>
+        <w:t>모니터링</w:t>
+      </w:r>
+    </w:p>
+    <w:p>
+      <w:r>
+        <w:t>EC2 인스턴스에 관련한 여러가지 정보를 볼 수 있는 창이다. AWS를 처음 입문할 때는 자주 볼 일이 없는 창이지만, 나중에 실제 서버를 운영할 때는 자주 보게되는 창이다. EC2 인스턴스가 정상적으로 작동하고 있는 지, EC2 인스턴스의 성능을 향상시켜주어야 하는 건 아닌 지 아래 지표를 통해 파악할 수 있다.</w:t>
+      </w:r>
+    </w:p>
+    <w:p>
+      <w:r>
+        <w:rPr>
+          <w:noProof/>
+        </w:rPr>
+        <w:drawing>
+          <wp:inline distT="0" distB="0" distL="0" distR="0" wp14:anchorId="7CD9FEB1" wp14:editId="46DDB9B9">
+            <wp:extent cx="5731510" cy="2030730"/>
+            <wp:effectExtent l="0" t="0" r="2540" b="7620"/>
+            <wp:docPr id="438209600" name="그림 1"/>
+            <wp:cNvGraphicFramePr>
+              <a:graphicFrameLocks xmlns:a="http://schemas.openxmlformats.org/drawingml/2006/main" noChangeAspect="1"/>
+            </wp:cNvGraphicFramePr>
+            <a:graphic xmlns:a="http://schemas.openxmlformats.org/drawingml/2006/main">
+              <a:graphicData uri="http://schemas.openxmlformats.org/drawingml/2006/picture">
+                <pic:pic xmlns:pic="http://schemas.openxmlformats.org/drawingml/2006/picture">
+                  <pic:nvPicPr>
+                    <pic:cNvPr id="438209600" name=""/>
+                    <pic:cNvPicPr/>
+                  </pic:nvPicPr>
+                  <pic:blipFill>
+                    <a:blip r:embed="rId30"/>
+                    <a:stretch>
+                      <a:fillRect/>
+                    </a:stretch>
+                  </pic:blipFill>
+                  <pic:spPr>
+                    <a:xfrm>
+                      <a:off x="0" y="0"/>
+                      <a:ext cx="5731510" cy="2030730"/>
+                    </a:xfrm>
+                    <a:prstGeom prst="rect">
+                      <a:avLst/>
+                    </a:prstGeom>
+                  </pic:spPr>
+                </pic:pic>
+              </a:graphicData>
+            </a:graphic>
+          </wp:inline>
+        </w:drawing>
+      </w:r>
+    </w:p>
+    <w:p>
+      <w:pPr>
+        <w:pStyle w:val="2"/>
+      </w:pPr>
+      <w:r>
+        <w:rPr>
+          <w:rFonts w:hint="eastAsia"/>
+        </w:rPr>
+        <w:lastRenderedPageBreak/>
+        <w:t>E</w:t>
+      </w:r>
+      <w:r>
+        <w:t>C2</w:t>
+      </w:r>
+      <w:r>
+        <w:rPr>
+          <w:rFonts w:hint="eastAsia"/>
+        </w:rPr>
+        <w:t>에 접속하기</w:t>
+      </w:r>
+    </w:p>
+    <w:p>
+      <w:r>
+        <w:rPr>
+          <w:noProof/>
+        </w:rPr>
+        <w:drawing>
+          <wp:inline distT="0" distB="0" distL="0" distR="0" wp14:anchorId="06283A1D" wp14:editId="40A8F295">
+            <wp:extent cx="5731510" cy="2182495"/>
+            <wp:effectExtent l="0" t="0" r="2540" b="8255"/>
+            <wp:docPr id="1252478405" name="그림 1"/>
+            <wp:cNvGraphicFramePr>
+              <a:graphicFrameLocks xmlns:a="http://schemas.openxmlformats.org/drawingml/2006/main" noChangeAspect="1"/>
+            </wp:cNvGraphicFramePr>
+            <a:graphic xmlns:a="http://schemas.openxmlformats.org/drawingml/2006/main">
+              <a:graphicData uri="http://schemas.openxmlformats.org/drawingml/2006/picture">
+                <pic:pic xmlns:pic="http://schemas.openxmlformats.org/drawingml/2006/picture">
+                  <pic:nvPicPr>
+                    <pic:cNvPr id="1252478405" name=""/>
+                    <pic:cNvPicPr/>
+                  </pic:nvPicPr>
+                  <pic:blipFill>
+                    <a:blip r:embed="rId31"/>
+                    <a:stretch>
+                      <a:fillRect/>
+                    </a:stretch>
+                  </pic:blipFill>
+                  <pic:spPr>
+                    <a:xfrm>
+                      <a:off x="0" y="0"/>
+                      <a:ext cx="5731510" cy="2182495"/>
+                    </a:xfrm>
+                    <a:prstGeom prst="rect">
+                      <a:avLst/>
+                    </a:prstGeom>
+                  </pic:spPr>
+                </pic:pic>
+              </a:graphicData>
+            </a:graphic>
+          </wp:inline>
+        </w:drawing>
+      </w:r>
+    </w:p>
+    <w:p>
+      <w:r>
+        <w:rPr>
+          <w:rFonts w:hint="eastAsia"/>
+        </w:rPr>
+        <w:t>연결 버튼을 클릭하면 다음과 같은 창으로 넘어가게 된다.</w:t>
+      </w:r>
+    </w:p>
+    <w:p>
+      <w:r>
+        <w:rPr>
+          <w:noProof/>
+        </w:rPr>
+        <w:drawing>
+          <wp:inline distT="0" distB="0" distL="0" distR="0" wp14:anchorId="04F6E35F" wp14:editId="5C0A4E5B">
+            <wp:extent cx="5731510" cy="2096770"/>
+            <wp:effectExtent l="0" t="0" r="2540" b="0"/>
+            <wp:docPr id="328641087" name="그림 1"/>
+            <wp:cNvGraphicFramePr>
+              <a:graphicFrameLocks xmlns:a="http://schemas.openxmlformats.org/drawingml/2006/main" noChangeAspect="1"/>
+            </wp:cNvGraphicFramePr>
+            <a:graphic xmlns:a="http://schemas.openxmlformats.org/drawingml/2006/main">
+              <a:graphicData uri="http://schemas.openxmlformats.org/drawingml/2006/picture">
+                <pic:pic xmlns:pic="http://schemas.openxmlformats.org/drawingml/2006/picture">
+                  <pic:nvPicPr>
+                    <pic:cNvPr id="328641087" name=""/>
+                    <pic:cNvPicPr/>
+                  </pic:nvPicPr>
+                  <pic:blipFill>
+                    <a:blip r:embed="rId32"/>
+                    <a:stretch>
+                      <a:fillRect/>
+                    </a:stretch>
+                  </pic:blipFill>
+                  <pic:spPr>
+                    <a:xfrm>
+                      <a:off x="0" y="0"/>
+                      <a:ext cx="5731510" cy="2096770"/>
+                    </a:xfrm>
+                    <a:prstGeom prst="rect">
+                      <a:avLst/>
+                    </a:prstGeom>
+                  </pic:spPr>
+                </pic:pic>
+              </a:graphicData>
+            </a:graphic>
+          </wp:inline>
+        </w:drawing>
+      </w:r>
+    </w:p>
+    <w:p>
+      <w:r>
+        <w:rPr>
+          <w:rFonts w:hint="eastAsia"/>
+        </w:rPr>
+        <w:t xml:space="preserve">설정을 유지한 채 연결을 누르면 </w:t>
+      </w:r>
+      <w:r>
+        <w:t xml:space="preserve">EC2 </w:t>
+      </w:r>
+      <w:r>
+        <w:rPr>
+          <w:rFonts w:hint="eastAsia"/>
+        </w:rPr>
+        <w:t>인스턴스에 접속하게 된다.</w:t>
+      </w:r>
+    </w:p>
+    <w:p>
+      <w:r>
+        <w:rPr>
+          <w:noProof/>
+        </w:rPr>
+        <w:drawing>
+          <wp:inline distT="0" distB="0" distL="0" distR="0" wp14:anchorId="7D68A01E" wp14:editId="3DF8757F">
+            <wp:extent cx="5731510" cy="2696845"/>
+            <wp:effectExtent l="0" t="0" r="2540" b="8255"/>
+            <wp:docPr id="1211539738" name="그림 1"/>
+            <wp:cNvGraphicFramePr>
+              <a:graphicFrameLocks xmlns:a="http://schemas.openxmlformats.org/drawingml/2006/main" noChangeAspect="1"/>
+            </wp:cNvGraphicFramePr>
+            <a:graphic xmlns:a="http://schemas.openxmlformats.org/drawingml/2006/main">
+              <a:graphicData uri="http://schemas.openxmlformats.org/drawingml/2006/picture">
+                <pic:pic xmlns:pic="http://schemas.openxmlformats.org/drawingml/2006/picture">
+                  <pic:nvPicPr>
+                    <pic:cNvPr id="1211539738" name=""/>
+                    <pic:cNvPicPr/>
+                  </pic:nvPicPr>
+                  <pic:blipFill>
+                    <a:blip r:embed="rId33"/>
+                    <a:stretch>
+                      <a:fillRect/>
+                    </a:stretch>
+                  </pic:blipFill>
+                  <pic:spPr>
+                    <a:xfrm>
+                      <a:off x="0" y="0"/>
+                      <a:ext cx="5731510" cy="2696845"/>
+                    </a:xfrm>
+                    <a:prstGeom prst="rect">
+                      <a:avLst/>
+                    </a:prstGeom>
+                  </pic:spPr>
+                </pic:pic>
+              </a:graphicData>
+            </a:graphic>
+          </wp:inline>
+        </w:drawing>
+      </w:r>
+    </w:p>
     <w:p/>
+    <w:p>
+      <w:pPr>
+        <w:pStyle w:val="1"/>
+      </w:pPr>
+      <w:r>
+        <w:rPr>
+          <w:rFonts w:hint="eastAsia"/>
+        </w:rPr>
+        <w:lastRenderedPageBreak/>
+        <w:t>[실습</w:t>
+      </w:r>
+      <w:r>
+        <w:t xml:space="preserve">] 6. </w:t>
+      </w:r>
+      <w:r>
+        <w:rPr>
+          <w:rFonts w:hint="eastAsia"/>
+        </w:rPr>
+        <w:t xml:space="preserve">탄력적 </w:t>
+      </w:r>
+      <w:r>
+        <w:t xml:space="preserve">IP </w:t>
+      </w:r>
+      <w:r>
+        <w:rPr>
+          <w:rFonts w:hint="eastAsia"/>
+        </w:rPr>
+        <w:t>연결하기</w:t>
+      </w:r>
+    </w:p>
+    <w:p>
+      <w:pPr>
+        <w:pStyle w:val="2"/>
+      </w:pPr>
+      <w:r>
+        <w:rPr>
+          <w:rFonts w:hint="eastAsia"/>
+        </w:rPr>
+        <w:t xml:space="preserve">탄력적 </w:t>
+      </w:r>
+      <w:r>
+        <w:t>IP</w:t>
+      </w:r>
+      <w:r>
+        <w:rPr>
+          <w:rFonts w:hint="eastAsia"/>
+        </w:rPr>
+        <w:t>가 필요한 이유</w:t>
+      </w:r>
+    </w:p>
+    <w:p>
+      <w:r>
+        <w:t>EC2 인스턴스를 생성하면 IP를 할당받는다. 하지만 이렇게 할당받은 IP는 임시적인 IP이다. EC2 인스턴스를 잠깐 중지시켰다가 다시 실행시켜보면 IP가 바뀌어있다. EC2 인스턴스를 중지시켰다가 다시 실행시킬 때마다 IP가 바뀌면 굉장히 불편하다. 그래서 중지시켰다가 다시 실행시켜도 바뀌지 않는 고정 IP를 할당받아야 한다.</w:t>
+      </w:r>
+    </w:p>
+    <w:p>
+      <w:r>
+        <w:t>그게 바로 탄력적 IP이다.</w:t>
+      </w:r>
+    </w:p>
+    <w:p>
+      <w:r>
+        <w:rPr>
+          <w:rFonts w:hint="eastAsia"/>
+        </w:rPr>
+        <w:t>현업에서도</w:t>
+      </w:r>
+      <w:r>
+        <w:t xml:space="preserve"> EC2 인스턴스를 생성하면 탄력적 IP를 대부분 필수적으로 설정한다.</w:t>
+      </w:r>
+    </w:p>
+    <w:p/>
+    <w:p>
+      <w:pPr>
+        <w:pStyle w:val="2"/>
+      </w:pPr>
+      <w:r>
+        <w:rPr>
+          <w:rFonts w:hint="eastAsia"/>
+        </w:rPr>
+        <w:t xml:space="preserve">임시적으로 </w:t>
+      </w:r>
+      <w:r>
+        <w:t>IP</w:t>
+      </w:r>
+      <w:r>
+        <w:rPr>
+          <w:rFonts w:hint="eastAsia"/>
+        </w:rPr>
+        <w:t>를 발급해주는 이유</w:t>
+      </w:r>
+    </w:p>
+    <w:p>
+      <w:r>
+        <w:rPr>
+          <w:rFonts w:hint="eastAsia"/>
+        </w:rPr>
+        <w:t xml:space="preserve">임시 </w:t>
+      </w:r>
+      <w:r>
+        <w:t>IP</w:t>
+      </w:r>
+      <w:r>
+        <w:rPr>
+          <w:rFonts w:hint="eastAsia"/>
+        </w:rPr>
+        <w:t>로 발급해주는 이유는</w:t>
+      </w:r>
+      <w:r>
+        <w:t xml:space="preserve"> </w:t>
+      </w:r>
+      <w:r>
+        <w:rPr>
+          <w:rFonts w:hint="eastAsia"/>
+        </w:rPr>
+        <w:t xml:space="preserve">전 세계적으로 </w:t>
+      </w:r>
+      <w:r>
+        <w:t xml:space="preserve">IP </w:t>
+      </w:r>
+      <w:r>
+        <w:rPr>
+          <w:rFonts w:hint="eastAsia"/>
+        </w:rPr>
+        <w:t>개수가 모자라지고 있다.</w:t>
+      </w:r>
+      <w:r>
+        <w:t xml:space="preserve"> </w:t>
+      </w:r>
+      <w:r>
+        <w:rPr>
+          <w:rFonts w:hint="eastAsia"/>
+        </w:rPr>
+        <w:t>그렇기 때문에 인스턴스를 사용하지 않는다면 다른 사람에게 쓸 수 있도록 넘</w:t>
+      </w:r>
+      <w:r>
+        <w:rPr>
+          <w:rFonts w:hint="eastAsia"/>
+        </w:rPr>
+        <w:t>기도록 되어있다.</w:t>
+      </w:r>
+    </w:p>
+    <w:p/>
+    <w:p>
+      <w:pPr>
+        <w:pStyle w:val="2"/>
+      </w:pPr>
+      <w:r>
+        <w:rPr>
+          <w:rFonts w:hint="eastAsia"/>
+        </w:rPr>
+        <w:t xml:space="preserve">탄력적 </w:t>
+      </w:r>
+      <w:r>
+        <w:t xml:space="preserve">IP </w:t>
+      </w:r>
+      <w:r>
+        <w:rPr>
+          <w:rFonts w:hint="eastAsia"/>
+        </w:rPr>
+        <w:t>설정 방법</w:t>
+      </w:r>
+    </w:p>
+    <w:p>
+      <w:r>
+        <w:rPr>
+          <w:noProof/>
+        </w:rPr>
+        <w:drawing>
+          <wp:inline distT="0" distB="0" distL="0" distR="0" wp14:anchorId="659B4678" wp14:editId="4A4B349F">
+            <wp:extent cx="5731510" cy="2397125"/>
+            <wp:effectExtent l="0" t="0" r="2540" b="3175"/>
+            <wp:docPr id="1385356091" name="그림 1"/>
+            <wp:cNvGraphicFramePr>
+              <a:graphicFrameLocks xmlns:a="http://schemas.openxmlformats.org/drawingml/2006/main" noChangeAspect="1"/>
+            </wp:cNvGraphicFramePr>
+            <a:graphic xmlns:a="http://schemas.openxmlformats.org/drawingml/2006/main">
+              <a:graphicData uri="http://schemas.openxmlformats.org/drawingml/2006/picture">
+                <pic:pic xmlns:pic="http://schemas.openxmlformats.org/drawingml/2006/picture">
+                  <pic:nvPicPr>
+                    <pic:cNvPr id="1385356091" name=""/>
+                    <pic:cNvPicPr/>
+                  </pic:nvPicPr>
+                  <pic:blipFill>
+                    <a:blip r:embed="rId34"/>
+                    <a:stretch>
+                      <a:fillRect/>
+                    </a:stretch>
+                  </pic:blipFill>
+                  <pic:spPr>
+                    <a:xfrm>
+                      <a:off x="0" y="0"/>
+                      <a:ext cx="5731510" cy="2397125"/>
+                    </a:xfrm>
+                    <a:prstGeom prst="rect">
+                      <a:avLst/>
+                    </a:prstGeom>
+                  </pic:spPr>
+                </pic:pic>
+              </a:graphicData>
+            </a:graphic>
+          </wp:inline>
+        </w:drawing>
+      </w:r>
+    </w:p>
+    <w:p>
+      <w:r>
+        <w:rPr>
+          <w:rFonts w:hint="eastAsia"/>
+        </w:rPr>
+        <w:t xml:space="preserve">좌측 메뉴에서 네트워크 및 보안의 탄력적 </w:t>
+      </w:r>
+      <w:r>
+        <w:t>IP</w:t>
+      </w:r>
+      <w:r>
+        <w:rPr>
+          <w:rFonts w:hint="eastAsia"/>
+        </w:rPr>
+        <w:t>를 클릭한다.</w:t>
+      </w:r>
+      <w:r>
+        <w:t xml:space="preserve"> </w:t>
+      </w:r>
+      <w:r>
+        <w:rPr>
+          <w:rFonts w:hint="eastAsia"/>
+        </w:rPr>
+        <w:t xml:space="preserve">이후 탄력적 </w:t>
+      </w:r>
+      <w:r>
+        <w:t xml:space="preserve">IP </w:t>
+      </w:r>
+      <w:r>
+        <w:rPr>
+          <w:rFonts w:hint="eastAsia"/>
+        </w:rPr>
+        <w:t>주소 할당을 클릭한다.</w:t>
+      </w:r>
+    </w:p>
+    <w:p>
+      <w:r>
+        <w:rPr>
+          <w:noProof/>
+        </w:rPr>
+        <w:lastRenderedPageBreak/>
+        <w:drawing>
+          <wp:inline distT="0" distB="0" distL="0" distR="0" wp14:anchorId="4CF636CB" wp14:editId="2CFD0476">
+            <wp:extent cx="5731510" cy="2327910"/>
+            <wp:effectExtent l="0" t="0" r="2540" b="0"/>
+            <wp:docPr id="1966578625" name="그림 1"/>
+            <wp:cNvGraphicFramePr>
+              <a:graphicFrameLocks xmlns:a="http://schemas.openxmlformats.org/drawingml/2006/main" noChangeAspect="1"/>
+            </wp:cNvGraphicFramePr>
+            <a:graphic xmlns:a="http://schemas.openxmlformats.org/drawingml/2006/main">
+              <a:graphicData uri="http://schemas.openxmlformats.org/drawingml/2006/picture">
+                <pic:pic xmlns:pic="http://schemas.openxmlformats.org/drawingml/2006/picture">
+                  <pic:nvPicPr>
+                    <pic:cNvPr id="1966578625" name=""/>
+                    <pic:cNvPicPr/>
+                  </pic:nvPicPr>
+                  <pic:blipFill>
+                    <a:blip r:embed="rId35"/>
+                    <a:stretch>
+                      <a:fillRect/>
+                    </a:stretch>
+                  </pic:blipFill>
+                  <pic:spPr>
+                    <a:xfrm>
+                      <a:off x="0" y="0"/>
+                      <a:ext cx="5731510" cy="2327910"/>
+                    </a:xfrm>
+                    <a:prstGeom prst="rect">
+                      <a:avLst/>
+                    </a:prstGeom>
+                  </pic:spPr>
+                </pic:pic>
+              </a:graphicData>
+            </a:graphic>
+          </wp:inline>
+        </w:drawing>
+      </w:r>
+    </w:p>
+    <w:p>
+      <w:r>
+        <w:rPr>
+          <w:rFonts w:hint="eastAsia"/>
+        </w:rPr>
+        <w:t>기본 설정값을 유지하며 할당을 클릭한다.</w:t>
+      </w:r>
+    </w:p>
+    <w:p>
+      <w:r>
+        <w:rPr>
+          <w:noProof/>
+        </w:rPr>
+        <w:drawing>
+          <wp:inline distT="0" distB="0" distL="0" distR="0" wp14:anchorId="1FCA2BCA" wp14:editId="696360AF">
+            <wp:extent cx="5731510" cy="2327910"/>
+            <wp:effectExtent l="0" t="0" r="2540" b="0"/>
+            <wp:docPr id="836782298" name="그림 1"/>
+            <wp:cNvGraphicFramePr>
+              <a:graphicFrameLocks xmlns:a="http://schemas.openxmlformats.org/drawingml/2006/main" noChangeAspect="1"/>
+            </wp:cNvGraphicFramePr>
+            <a:graphic xmlns:a="http://schemas.openxmlformats.org/drawingml/2006/main">
+              <a:graphicData uri="http://schemas.openxmlformats.org/drawingml/2006/picture">
+                <pic:pic xmlns:pic="http://schemas.openxmlformats.org/drawingml/2006/picture">
+                  <pic:nvPicPr>
+                    <pic:cNvPr id="836782298" name=""/>
+                    <pic:cNvPicPr/>
+                  </pic:nvPicPr>
+                  <pic:blipFill>
+                    <a:blip r:embed="rId35"/>
+                    <a:stretch>
+                      <a:fillRect/>
+                    </a:stretch>
+                  </pic:blipFill>
+                  <pic:spPr>
+                    <a:xfrm>
+                      <a:off x="0" y="0"/>
+                      <a:ext cx="5731510" cy="2327910"/>
+                    </a:xfrm>
+                    <a:prstGeom prst="rect">
+                      <a:avLst/>
+                    </a:prstGeom>
+                  </pic:spPr>
+                </pic:pic>
+              </a:graphicData>
+            </a:graphic>
+          </wp:inline>
+        </w:drawing>
+      </w:r>
+    </w:p>
+    <w:p>
+      <w:r>
+        <w:rPr>
+          <w:rFonts w:hint="eastAsia"/>
+        </w:rPr>
+        <w:t xml:space="preserve">그렇다면 다음과 같이 </w:t>
+      </w:r>
+      <w:r>
+        <w:t>IP</w:t>
+      </w:r>
+      <w:r>
+        <w:rPr>
+          <w:rFonts w:hint="eastAsia"/>
+        </w:rPr>
+        <w:t>가 할당되는 것을 확인할 수 있으며,</w:t>
+      </w:r>
+      <w:r>
+        <w:t xml:space="preserve"> </w:t>
+      </w:r>
+      <w:r>
+        <w:rPr>
+          <w:rFonts w:hint="eastAsia"/>
+        </w:rPr>
+        <w:t>이름은 본인이 사용하는 이름에 알맞게 변경한다.</w:t>
+      </w:r>
+    </w:p>
+    <w:p>
+      <w:r>
+        <w:rPr>
+          <w:noProof/>
+        </w:rPr>
+        <w:drawing>
+          <wp:inline distT="0" distB="0" distL="0" distR="0" wp14:anchorId="7A1C42E2" wp14:editId="673436A3">
+            <wp:extent cx="5731510" cy="2671445"/>
+            <wp:effectExtent l="0" t="0" r="2540" b="0"/>
+            <wp:docPr id="296211843" name="그림 1"/>
+            <wp:cNvGraphicFramePr>
+              <a:graphicFrameLocks xmlns:a="http://schemas.openxmlformats.org/drawingml/2006/main" noChangeAspect="1"/>
+            </wp:cNvGraphicFramePr>
+            <a:graphic xmlns:a="http://schemas.openxmlformats.org/drawingml/2006/main">
+              <a:graphicData uri="http://schemas.openxmlformats.org/drawingml/2006/picture">
+                <pic:pic xmlns:pic="http://schemas.openxmlformats.org/drawingml/2006/picture">
+                  <pic:nvPicPr>
+                    <pic:cNvPr id="296211843" name=""/>
+                    <pic:cNvPicPr/>
+                  </pic:nvPicPr>
+                  <pic:blipFill>
+                    <a:blip r:embed="rId36"/>
+                    <a:stretch>
+                      <a:fillRect/>
+                    </a:stretch>
+                  </pic:blipFill>
+                  <pic:spPr>
+                    <a:xfrm>
+                      <a:off x="0" y="0"/>
+                      <a:ext cx="5731510" cy="2671445"/>
+                    </a:xfrm>
+                    <a:prstGeom prst="rect">
+                      <a:avLst/>
+                    </a:prstGeom>
+                  </pic:spPr>
+                </pic:pic>
+              </a:graphicData>
+            </a:graphic>
+          </wp:inline>
+        </w:drawing>
+      </w:r>
+    </w:p>
+    <w:p>
+      <w:r>
+        <w:rPr>
+          <w:rFonts w:hint="eastAsia"/>
+        </w:rPr>
+        <w:lastRenderedPageBreak/>
+        <w:t xml:space="preserve">상단의 작업을 누른 후 탄력적 </w:t>
+      </w:r>
+      <w:r>
+        <w:t xml:space="preserve">IP </w:t>
+      </w:r>
+      <w:r>
+        <w:rPr>
+          <w:rFonts w:hint="eastAsia"/>
+        </w:rPr>
+        <w:t>주소 연결을 클릭한다.</w:t>
+      </w:r>
+    </w:p>
+    <w:p>
+      <w:r>
+        <w:rPr>
+          <w:noProof/>
+        </w:rPr>
+        <w:drawing>
+          <wp:inline distT="0" distB="0" distL="0" distR="0" wp14:anchorId="4FFF0466" wp14:editId="0558AB21">
+            <wp:extent cx="2419688" cy="2686425"/>
+            <wp:effectExtent l="0" t="0" r="0" b="0"/>
+            <wp:docPr id="856813488" name="그림 1"/>
+            <wp:cNvGraphicFramePr>
+              <a:graphicFrameLocks xmlns:a="http://schemas.openxmlformats.org/drawingml/2006/main" noChangeAspect="1"/>
+            </wp:cNvGraphicFramePr>
+            <a:graphic xmlns:a="http://schemas.openxmlformats.org/drawingml/2006/main">
+              <a:graphicData uri="http://schemas.openxmlformats.org/drawingml/2006/picture">
+                <pic:pic xmlns:pic="http://schemas.openxmlformats.org/drawingml/2006/picture">
+                  <pic:nvPicPr>
+                    <pic:cNvPr id="856813488" name=""/>
+                    <pic:cNvPicPr/>
+                  </pic:nvPicPr>
+                  <pic:blipFill>
+                    <a:blip r:embed="rId37"/>
+                    <a:stretch>
+                      <a:fillRect/>
+                    </a:stretch>
+                  </pic:blipFill>
+                  <pic:spPr>
+                    <a:xfrm>
+                      <a:off x="0" y="0"/>
+                      <a:ext cx="2419688" cy="2686425"/>
+                    </a:xfrm>
+                    <a:prstGeom prst="rect">
+                      <a:avLst/>
+                    </a:prstGeom>
+                  </pic:spPr>
+                </pic:pic>
+              </a:graphicData>
+            </a:graphic>
+          </wp:inline>
+        </w:drawing>
+      </w:r>
+    </w:p>
+    <w:p>
+      <w:r>
+        <w:rPr>
+          <w:rFonts w:hint="eastAsia"/>
+        </w:rPr>
+        <w:t>본인이 적용시킬 인스턴스를 선택한 후 연결을 클릭한다.</w:t>
+      </w:r>
+    </w:p>
+    <w:p>
+      <w:r>
+        <w:rPr>
+          <w:noProof/>
+        </w:rPr>
+        <w:drawing>
+          <wp:inline distT="0" distB="0" distL="0" distR="0" wp14:anchorId="23202324" wp14:editId="6046C8CD">
+            <wp:extent cx="5731510" cy="2075180"/>
+            <wp:effectExtent l="0" t="0" r="2540" b="1270"/>
+            <wp:docPr id="2006947731" name="그림 1"/>
+            <wp:cNvGraphicFramePr>
+              <a:graphicFrameLocks xmlns:a="http://schemas.openxmlformats.org/drawingml/2006/main" noChangeAspect="1"/>
+            </wp:cNvGraphicFramePr>
+            <a:graphic xmlns:a="http://schemas.openxmlformats.org/drawingml/2006/main">
+              <a:graphicData uri="http://schemas.openxmlformats.org/drawingml/2006/picture">
+                <pic:pic xmlns:pic="http://schemas.openxmlformats.org/drawingml/2006/picture">
+                  <pic:nvPicPr>
+                    <pic:cNvPr id="2006947731" name=""/>
+                    <pic:cNvPicPr/>
+                  </pic:nvPicPr>
+                  <pic:blipFill>
+                    <a:blip r:embed="rId38"/>
+                    <a:stretch>
+                      <a:fillRect/>
+                    </a:stretch>
+                  </pic:blipFill>
+                  <pic:spPr>
+                    <a:xfrm>
+                      <a:off x="0" y="0"/>
+                      <a:ext cx="5731510" cy="2075180"/>
+                    </a:xfrm>
+                    <a:prstGeom prst="rect">
+                      <a:avLst/>
+                    </a:prstGeom>
+                  </pic:spPr>
+                </pic:pic>
+              </a:graphicData>
+            </a:graphic>
+          </wp:inline>
+        </w:drawing>
+      </w:r>
+    </w:p>
+    <w:p>
+      <w:r>
+        <w:rPr>
+          <w:rFonts w:hint="eastAsia"/>
+        </w:rPr>
+        <w:t xml:space="preserve">인스턴스로 돌아가 퍼블릭 </w:t>
+      </w:r>
+      <w:r>
+        <w:t xml:space="preserve">IPv4 </w:t>
+      </w:r>
+      <w:r>
+        <w:rPr>
+          <w:rFonts w:hint="eastAsia"/>
+        </w:rPr>
+        <w:t xml:space="preserve">주소를 확인해보면 탄력적 </w:t>
+      </w:r>
+      <w:r>
+        <w:t xml:space="preserve">IP </w:t>
+      </w:r>
+      <w:r>
+        <w:rPr>
+          <w:rFonts w:hint="eastAsia"/>
+        </w:rPr>
+        <w:t>주소로 변경된 것을 확인할 수 있다.</w:t>
+      </w:r>
+    </w:p>
+    <w:p>
+      <w:r>
+        <w:rPr>
+          <w:noProof/>
+        </w:rPr>
+        <w:drawing>
+          <wp:inline distT="0" distB="0" distL="0" distR="0" wp14:anchorId="35FB8F90" wp14:editId="492A8DF8">
+            <wp:extent cx="5731510" cy="2378075"/>
+            <wp:effectExtent l="0" t="0" r="2540" b="3175"/>
+            <wp:docPr id="1438317162" name="그림 1"/>
+            <wp:cNvGraphicFramePr>
+              <a:graphicFrameLocks xmlns:a="http://schemas.openxmlformats.org/drawingml/2006/main" noChangeAspect="1"/>
+            </wp:cNvGraphicFramePr>
+            <a:graphic xmlns:a="http://schemas.openxmlformats.org/drawingml/2006/main">
+              <a:graphicData uri="http://schemas.openxmlformats.org/drawingml/2006/picture">
+                <pic:pic xmlns:pic="http://schemas.openxmlformats.org/drawingml/2006/picture">
+                  <pic:nvPicPr>
+                    <pic:cNvPr id="1438317162" name=""/>
+                    <pic:cNvPicPr/>
+                  </pic:nvPicPr>
+                  <pic:blipFill>
+                    <a:blip r:embed="rId39"/>
+                    <a:stretch>
+                      <a:fillRect/>
+                    </a:stretch>
+                  </pic:blipFill>
+                  <pic:spPr>
+                    <a:xfrm>
+                      <a:off x="0" y="0"/>
+                      <a:ext cx="5731510" cy="2378075"/>
+                    </a:xfrm>
+                    <a:prstGeom prst="rect">
+                      <a:avLst/>
+                    </a:prstGeom>
+                  </pic:spPr>
+                </pic:pic>
+              </a:graphicData>
+            </a:graphic>
+          </wp:inline>
+        </w:drawing>
+      </w:r>
+    </w:p>
+    <w:p/>
+    <w:p>
+      <w:pPr>
+        <w:pStyle w:val="1"/>
+      </w:pPr>
+      <w:r>
+        <w:rPr>
+          <w:rFonts w:hint="eastAsia"/>
+        </w:rPr>
+        <w:t>[실습</w:t>
+      </w:r>
+      <w:r>
+        <w:t xml:space="preserve">] 7. Express </w:t>
+      </w:r>
+      <w:r>
+        <w:rPr>
+          <w:rFonts w:hint="eastAsia"/>
+        </w:rPr>
+        <w:t xml:space="preserve">서버를 </w:t>
+      </w:r>
+      <w:r>
+        <w:t>EC2</w:t>
+      </w:r>
+      <w:r>
+        <w:rPr>
+          <w:rFonts w:hint="eastAsia"/>
+        </w:rPr>
+        <w:t>에 배포하기</w:t>
+      </w:r>
+    </w:p>
+    <w:p>
+      <w:pPr>
+        <w:pStyle w:val="2"/>
+      </w:pPr>
+      <w:r>
+        <w:rPr>
+          <w:rFonts w:hint="eastAsia"/>
+        </w:rPr>
+        <w:t>U</w:t>
+      </w:r>
+      <w:r>
+        <w:t xml:space="preserve">buntu </w:t>
+      </w:r>
+      <w:r>
+        <w:rPr>
+          <w:rFonts w:hint="eastAsia"/>
+        </w:rPr>
+        <w:t xml:space="preserve">환경에서 </w:t>
+      </w:r>
+      <w:r>
+        <w:t xml:space="preserve">Node.js </w:t>
+      </w:r>
+      <w:r>
+        <w:rPr>
+          <w:rFonts w:hint="eastAsia"/>
+        </w:rPr>
+        <w:t>설치하는 방법</w:t>
+      </w:r>
+    </w:p>
+    <w:p>
+      <w:r>
+        <w:t>Ubuntu 환경에서 Express 서버를 실행시키려면 Node.js가 설치되어 있어야 한다. 그래서 Ubuntu에 우선 Node.js를 설치해보자.</w:t>
+      </w:r>
+    </w:p>
+    <w:p>
+      <w:r>
+        <w:rPr>
+          <w:rFonts w:hint="eastAsia"/>
+        </w:rPr>
+        <w:t>다음 명령어를 E</w:t>
+      </w:r>
+      <w:r>
+        <w:t xml:space="preserve">C2 </w:t>
+      </w:r>
+      <w:r>
+        <w:rPr>
+          <w:rFonts w:hint="eastAsia"/>
+        </w:rPr>
+        <w:t>콘솔창에서 실행한다.</w:t>
+      </w:r>
+    </w:p>
+    <w:p>
+      <w:r>
+        <w:t xml:space="preserve">$ </w:t>
+      </w:r>
+      <w:r>
+        <w:t>sudo su</w:t>
+      </w:r>
+    </w:p>
+    <w:p>
+      <w:r>
+        <w:t xml:space="preserve">$ </w:t>
+      </w:r>
+      <w:r>
+        <w:t>apt-get update &amp;&amp; /</w:t>
+      </w:r>
+    </w:p>
+    <w:p>
+      <w:r>
+        <w:t>apt-get install -y ca-certificates curl gnupg &amp;&amp; /</w:t>
+      </w:r>
+    </w:p>
+    <w:p>
+      <w:r>
+        <w:t>mkdir -p /etc/apt/keyrings &amp;&amp; /</w:t>
+      </w:r>
+    </w:p>
+    <w:p>
+      <w:r>
+        <w:t>curl -fsSL https://deb.nodesource.com/gpgkey/nodesource-repo.gpg.key | sudo gpg --dearmor -o /etc/apt/keyrings/nodesource.gpg &amp;&amp; /</w:t>
+      </w:r>
+    </w:p>
+    <w:p>
+      <w:r>
+        <w:t>NODE_MAJOR=20 &amp;&amp; /</w:t>
+      </w:r>
+    </w:p>
+    <w:p>
+      <w:r>
+        <w:t>echo "deb [signed-by=/etc/apt/keyrings/nodesource.gpg] https://deb.nodesource.com/node_$NODE_MAJOR.x nodistro main" | sudo tee /etc/apt/sources.list.d/nodesource.list &amp;&amp; /</w:t>
+      </w:r>
+    </w:p>
+    <w:p>
+      <w:r>
+        <w:t>apt-get update &amp;&amp; /</w:t>
+      </w:r>
+    </w:p>
+    <w:p>
+      <w:r>
+        <w:t>apt-get install nodejs -y</w:t>
+      </w:r>
+    </w:p>
+    <w:p/>
+    <w:p>
+      <w:pPr>
+        <w:pStyle w:val="2"/>
+      </w:pPr>
+      <w:r>
+        <w:rPr>
+          <w:rFonts w:hint="eastAsia"/>
+        </w:rPr>
+        <w:t>잘 설치됐는지 확인하기</w:t>
+      </w:r>
+    </w:p>
+    <w:p>
+      <w:r>
+        <w:rPr>
+          <w:rFonts w:hint="eastAsia"/>
+        </w:rPr>
+        <w:t xml:space="preserve">이후 </w:t>
+      </w:r>
+      <w:r>
+        <w:t xml:space="preserve">node -v </w:t>
+      </w:r>
+      <w:r>
+        <w:rPr>
+          <w:rFonts w:hint="eastAsia"/>
+        </w:rPr>
+        <w:t>명령어를 통해 설치가 잘 되었는지 확인한다.</w:t>
+      </w:r>
+    </w:p>
+    <w:p>
+      <w:r>
+        <w:t>$ node -v</w:t>
+      </w:r>
+    </w:p>
+    <w:p>
+      <w:r>
+        <w:rPr>
+          <w:noProof/>
+        </w:rPr>
+        <w:drawing>
+          <wp:inline distT="0" distB="0" distL="0" distR="0" wp14:anchorId="341922A3" wp14:editId="4352A6C0">
+            <wp:extent cx="3696216" cy="476316"/>
+            <wp:effectExtent l="0" t="0" r="0" b="0"/>
+            <wp:docPr id="1148678961" name="그림 1"/>
+            <wp:cNvGraphicFramePr>
+              <a:graphicFrameLocks xmlns:a="http://schemas.openxmlformats.org/drawingml/2006/main" noChangeAspect="1"/>
+            </wp:cNvGraphicFramePr>
+            <a:graphic xmlns:a="http://schemas.openxmlformats.org/drawingml/2006/main">
+              <a:graphicData uri="http://schemas.openxmlformats.org/drawingml/2006/picture">
+                <pic:pic xmlns:pic="http://schemas.openxmlformats.org/drawingml/2006/picture">
+                  <pic:nvPicPr>
+                    <pic:cNvPr id="1148678961" name=""/>
+                    <pic:cNvPicPr/>
+                  </pic:nvPicPr>
+                  <pic:blipFill>
+                    <a:blip r:embed="rId40"/>
+                    <a:stretch>
+                      <a:fillRect/>
+                    </a:stretch>
+                  </pic:blipFill>
+                  <pic:spPr>
+                    <a:xfrm>
+                      <a:off x="0" y="0"/>
+                      <a:ext cx="3696216" cy="476316"/>
+                    </a:xfrm>
+                    <a:prstGeom prst="rect">
+                      <a:avLst/>
+                    </a:prstGeom>
+                  </pic:spPr>
+                </pic:pic>
+              </a:graphicData>
+            </a:graphic>
+          </wp:inline>
+        </w:drawing>
+      </w:r>
+    </w:p>
+    <w:p/>
+    <w:p>
+      <w:pPr>
+        <w:pStyle w:val="2"/>
+      </w:pPr>
+      <w:r>
+        <w:rPr>
+          <w:rFonts w:hint="eastAsia"/>
+        </w:rPr>
+        <w:t>G</w:t>
+      </w:r>
+      <w:r>
+        <w:t>ithub</w:t>
+      </w:r>
+      <w:r>
+        <w:rPr>
+          <w:rFonts w:hint="eastAsia"/>
+        </w:rPr>
+        <w:t xml:space="preserve">에서 </w:t>
+      </w:r>
+      <w:r>
+        <w:t xml:space="preserve">Express </w:t>
+      </w:r>
+      <w:r>
+        <w:rPr>
+          <w:rFonts w:hint="eastAsia"/>
+        </w:rPr>
+        <w:t xml:space="preserve">프로젝트 </w:t>
+      </w:r>
+      <w:r>
+        <w:t>clone</w:t>
+      </w:r>
+      <w:r>
+        <w:rPr>
+          <w:rFonts w:hint="eastAsia"/>
+        </w:rPr>
+        <w:t>하기</w:t>
+      </w:r>
+    </w:p>
+    <w:p>
+      <w:r>
+        <w:rPr>
+          <w:rFonts w:hint="eastAsia"/>
+        </w:rPr>
+        <w:t xml:space="preserve">다음 명령어를 통하여 </w:t>
+      </w:r>
+      <w:r>
+        <w:t>Github</w:t>
+      </w:r>
+      <w:r>
+        <w:rPr>
+          <w:rFonts w:hint="eastAsia"/>
+        </w:rPr>
+        <w:t xml:space="preserve">으로부터 미리 생성되어 있는 </w:t>
+      </w:r>
+      <w:r>
+        <w:t xml:space="preserve">Express </w:t>
+      </w:r>
+      <w:r>
+        <w:rPr>
+          <w:rFonts w:hint="eastAsia"/>
+        </w:rPr>
+        <w:t xml:space="preserve">프로젝트를 </w:t>
+      </w:r>
+      <w:r>
+        <w:t>clone</w:t>
+      </w:r>
+      <w:r>
+        <w:rPr>
+          <w:rFonts w:hint="eastAsia"/>
+        </w:rPr>
+        <w:t>한다.</w:t>
+      </w:r>
+      <w:r>
+        <w:t xml:space="preserve"> </w:t>
+      </w:r>
+      <w:r>
+        <w:rPr>
+          <w:rFonts w:hint="eastAsia"/>
+        </w:rPr>
+        <w:t xml:space="preserve">해당 </w:t>
+      </w:r>
+      <w:r>
+        <w:rPr>
+          <w:rFonts w:hint="eastAsia"/>
+        </w:rPr>
+        <w:lastRenderedPageBreak/>
+        <w:t xml:space="preserve">프로젝트는 </w:t>
+      </w:r>
+      <w:r>
+        <w:t>80</w:t>
+      </w:r>
+      <w:r>
+        <w:rPr>
+          <w:rFonts w:hint="eastAsia"/>
+        </w:rPr>
+        <w:t xml:space="preserve">번 포트에 </w:t>
+      </w:r>
+      <w:r>
+        <w:t xml:space="preserve">express </w:t>
+      </w:r>
+      <w:r>
+        <w:rPr>
+          <w:rFonts w:hint="eastAsia"/>
+        </w:rPr>
+        <w:t>서버를 실행하는 간단한 코드이다.</w:t>
+      </w:r>
+    </w:p>
+    <w:p>
+      <w:r>
+        <w:t>$ git clone https://github.com/JSCODE-EDU/ec2-express-sample</w:t>
+      </w:r>
+    </w:p>
+    <w:p>
+      <w:r>
+        <w:t>$ cd ec2-express-sample</w:t>
+      </w:r>
+    </w:p>
+    <w:p>
+      <w:r>
+        <w:t>$ npm i</w:t>
+      </w:r>
+    </w:p>
+    <w:p/>
+    <w:p>
+      <w:pPr>
+        <w:pStyle w:val="2"/>
+      </w:pPr>
+      <w:r>
+        <w:rPr>
+          <w:rFonts w:hint="eastAsia"/>
+        </w:rPr>
+        <w:t>.</w:t>
+      </w:r>
+      <w:r>
+        <w:t xml:space="preserve">env </w:t>
+      </w:r>
+      <w:r>
+        <w:rPr>
+          <w:rFonts w:hint="eastAsia"/>
+        </w:rPr>
+        <w:t>파일 직접 만들기</w:t>
+      </w:r>
+    </w:p>
+    <w:p>
+      <w:r>
+        <w:t>.env와 같은 민감한 파일은 Git으로 버전 관리를 하지 않는게 일반적이다. 따라서 .env 파일은 별도로 EC2 인스턴스에 올려주어야 한다. 하지만 .env 파일을 EC2 인스턴스에 올리는 작업보다는, .env 파일을 직접 만드는 게 훨씬 간단하다.</w:t>
+      </w:r>
+      <w:r>
+        <w:t xml:space="preserve"> </w:t>
+      </w:r>
+      <w:r>
+        <w:rPr>
+          <w:rFonts w:hint="eastAsia"/>
+        </w:rPr>
+        <w:t xml:space="preserve">텍스트 편집기인 </w:t>
+      </w:r>
+      <w:r>
+        <w:t>vim(vi)</w:t>
+      </w:r>
+      <w:r>
+        <w:rPr>
+          <w:rFonts w:hint="eastAsia"/>
+        </w:rPr>
+        <w:t xml:space="preserve">를 사용하여 </w:t>
+      </w:r>
+      <w:r>
+        <w:t>.nev</w:t>
+      </w:r>
+      <w:r>
+        <w:rPr>
+          <w:rFonts w:hint="eastAsia"/>
+        </w:rPr>
+        <w:t>를 만들어보자.</w:t>
+      </w:r>
+    </w:p>
+    <w:p>
+      <w:r>
+        <w:rPr>
+          <w:rFonts w:hint="eastAsia"/>
+        </w:rPr>
+        <w:t>$</w:t>
+      </w:r>
+      <w:r>
+        <w:t xml:space="preserve"> </w:t>
+      </w:r>
+      <w:r>
+        <w:rPr>
+          <w:rFonts w:hint="eastAsia"/>
+        </w:rPr>
+        <w:t>v</w:t>
+      </w:r>
+      <w:r>
+        <w:t>i .env</w:t>
+      </w:r>
+    </w:p>
+    <w:p>
+      <w:r>
+        <w:rPr>
+          <w:noProof/>
+        </w:rPr>
+        <w:drawing>
+          <wp:inline distT="0" distB="0" distL="0" distR="0" wp14:anchorId="4DC3A5CC" wp14:editId="65BC61F7">
+            <wp:extent cx="5534797" cy="857370"/>
+            <wp:effectExtent l="0" t="0" r="0" b="0"/>
+            <wp:docPr id="1651398125" name="그림 1"/>
+            <wp:cNvGraphicFramePr>
+              <a:graphicFrameLocks xmlns:a="http://schemas.openxmlformats.org/drawingml/2006/main" noChangeAspect="1"/>
+            </wp:cNvGraphicFramePr>
+            <a:graphic xmlns:a="http://schemas.openxmlformats.org/drawingml/2006/main">
+              <a:graphicData uri="http://schemas.openxmlformats.org/drawingml/2006/picture">
+                <pic:pic xmlns:pic="http://schemas.openxmlformats.org/drawingml/2006/picture">
+                  <pic:nvPicPr>
+                    <pic:cNvPr id="1651398125" name=""/>
+                    <pic:cNvPicPr/>
+                  </pic:nvPicPr>
+                  <pic:blipFill>
+                    <a:blip r:embed="rId41"/>
+                    <a:stretch>
+                      <a:fillRect/>
+                    </a:stretch>
+                  </pic:blipFill>
+                  <pic:spPr>
+                    <a:xfrm>
+                      <a:off x="0" y="0"/>
+                      <a:ext cx="5534797" cy="857370"/>
+                    </a:xfrm>
+                    <a:prstGeom prst="rect">
+                      <a:avLst/>
+                    </a:prstGeom>
+                  </pic:spPr>
+                </pic:pic>
+              </a:graphicData>
+            </a:graphic>
+          </wp:inline>
+        </w:drawing>
+      </w:r>
+    </w:p>
+    <w:p>
+      <w:r>
+        <w:t>DATABASE_NAME=my_database</w:t>
+      </w:r>
+    </w:p>
+    <w:p>
+      <w:r>
+        <w:rPr>
+          <w:noProof/>
+        </w:rPr>
+        <w:drawing>
+          <wp:inline distT="0" distB="0" distL="0" distR="0" wp14:anchorId="1E754AD6" wp14:editId="14C4AEA4">
+            <wp:extent cx="2229161" cy="371527"/>
+            <wp:effectExtent l="0" t="0" r="0" b="9525"/>
+            <wp:docPr id="1608689033" name="그림 1"/>
+            <wp:cNvGraphicFramePr>
+              <a:graphicFrameLocks xmlns:a="http://schemas.openxmlformats.org/drawingml/2006/main" noChangeAspect="1"/>
+            </wp:cNvGraphicFramePr>
+            <a:graphic xmlns:a="http://schemas.openxmlformats.org/drawingml/2006/main">
+              <a:graphicData uri="http://schemas.openxmlformats.org/drawingml/2006/picture">
+                <pic:pic xmlns:pic="http://schemas.openxmlformats.org/drawingml/2006/picture">
+                  <pic:nvPicPr>
+                    <pic:cNvPr id="1608689033" name=""/>
+                    <pic:cNvPicPr/>
+                  </pic:nvPicPr>
+                  <pic:blipFill>
+                    <a:blip r:embed="rId42"/>
+                    <a:stretch>
+                      <a:fillRect/>
+                    </a:stretch>
+                  </pic:blipFill>
+                  <pic:spPr>
+                    <a:xfrm>
+                      <a:off x="0" y="0"/>
+                      <a:ext cx="2229161" cy="371527"/>
+                    </a:xfrm>
+                    <a:prstGeom prst="rect">
+                      <a:avLst/>
+                    </a:prstGeom>
+                  </pic:spPr>
+                </pic:pic>
+              </a:graphicData>
+            </a:graphic>
+          </wp:inline>
+        </w:drawing>
+      </w:r>
+    </w:p>
+    <w:p>
+      <w:r>
+        <w:rPr>
+          <w:rFonts w:hint="eastAsia"/>
+        </w:rPr>
+        <w:t xml:space="preserve">작성 후 나가기 위해선 </w:t>
+      </w:r>
+      <w:r>
+        <w:t>esc</w:t>
+      </w:r>
+      <w:r>
+        <w:rPr>
+          <w:rFonts w:hint="eastAsia"/>
+        </w:rPr>
+        <w:t xml:space="preserve">를 한 번 눌러준 후 </w:t>
+      </w:r>
+      <w:r>
+        <w:t>:wq</w:t>
+      </w:r>
+      <w:r>
+        <w:rPr>
+          <w:rFonts w:hint="eastAsia"/>
+        </w:rPr>
+        <w:t>를 입력하여 나간다.</w:t>
+      </w:r>
+    </w:p>
+    <w:p/>
+    <w:p>
+      <w:pPr>
+        <w:pStyle w:val="2"/>
+      </w:pPr>
+      <w:r>
+        <w:rPr>
+          <w:rFonts w:hint="eastAsia"/>
+        </w:rPr>
+        <w:t>p</w:t>
+      </w:r>
+      <w:r>
+        <w:t xml:space="preserve">m2 </w:t>
+      </w:r>
+      <w:r>
+        <w:rPr>
+          <w:rFonts w:hint="eastAsia"/>
+        </w:rPr>
+        <w:t>설치해서 서버 실행시키기</w:t>
+      </w:r>
+    </w:p>
+    <w:p>
+      <w:r>
+        <w:t>Node 기반의 서버는 pm2를 활용해서 많이 실행시킨다. 서비스를 운영하는 데 있어서 유용한 기능들을 pm2가 많이 가지고 있기 때문이다.</w:t>
+      </w:r>
+    </w:p>
+    <w:p>
+      <w:r>
+        <w:t>$ sudo npm i -g pm2</w:t>
+      </w:r>
+    </w:p>
+    <w:p>
+      <w:r>
+        <w:t>$ sudo pm2 start app.js</w:t>
+      </w:r>
+    </w:p>
+    <w:p>
+      <w:r>
+        <w:rPr>
+          <w:rFonts w:hint="eastAsia"/>
+        </w:rPr>
+        <w:t>p</w:t>
+      </w:r>
+      <w:r>
+        <w:t>m2</w:t>
+      </w:r>
+      <w:r>
+        <w:rPr>
+          <w:rFonts w:hint="eastAsia"/>
+        </w:rPr>
+        <w:t>를 설치하고 실행하게 된다면 다음과 같은 화면이 출력된다.</w:t>
+      </w:r>
+    </w:p>
+    <w:p>
+      <w:r>
+        <w:rPr>
+          <w:noProof/>
+        </w:rPr>
+        <w:lastRenderedPageBreak/>
+        <w:drawing>
+          <wp:inline distT="0" distB="0" distL="0" distR="0" wp14:anchorId="152F0398" wp14:editId="7BE2D782">
+            <wp:extent cx="5731510" cy="2936875"/>
+            <wp:effectExtent l="0" t="0" r="2540" b="0"/>
+            <wp:docPr id="326184607" name="그림 1"/>
+            <wp:cNvGraphicFramePr>
+              <a:graphicFrameLocks xmlns:a="http://schemas.openxmlformats.org/drawingml/2006/main" noChangeAspect="1"/>
+            </wp:cNvGraphicFramePr>
+            <a:graphic xmlns:a="http://schemas.openxmlformats.org/drawingml/2006/main">
+              <a:graphicData uri="http://schemas.openxmlformats.org/drawingml/2006/picture">
+                <pic:pic xmlns:pic="http://schemas.openxmlformats.org/drawingml/2006/picture">
+                  <pic:nvPicPr>
+                    <pic:cNvPr id="326184607" name=""/>
+                    <pic:cNvPicPr/>
+                  </pic:nvPicPr>
+                  <pic:blipFill>
+                    <a:blip r:embed="rId43"/>
+                    <a:stretch>
+                      <a:fillRect/>
+                    </a:stretch>
+                  </pic:blipFill>
+                  <pic:spPr>
+                    <a:xfrm>
+                      <a:off x="0" y="0"/>
+                      <a:ext cx="5731510" cy="2936875"/>
+                    </a:xfrm>
+                    <a:prstGeom prst="rect">
+                      <a:avLst/>
+                    </a:prstGeom>
+                  </pic:spPr>
+                </pic:pic>
+              </a:graphicData>
+            </a:graphic>
+          </wp:inline>
+        </w:drawing>
+      </w:r>
+    </w:p>
+    <w:p>
+      <w:r>
+        <w:rPr>
+          <w:rFonts w:hint="eastAsia"/>
+        </w:rPr>
+        <w:t xml:space="preserve">실행이 되었다면 자신의 </w:t>
+      </w:r>
+      <w:r>
+        <w:t>EC2</w:t>
+      </w:r>
+      <w:r>
+        <w:rPr>
+          <w:rFonts w:hint="eastAsia"/>
+        </w:rPr>
+        <w:t xml:space="preserve">의 </w:t>
+      </w:r>
+      <w:r>
+        <w:t xml:space="preserve">IP </w:t>
+      </w:r>
+      <w:r>
+        <w:rPr>
+          <w:rFonts w:hint="eastAsia"/>
+        </w:rPr>
+        <w:t>주소를 인터넷 브라우저를 통해 접속해보자.</w:t>
+      </w:r>
+      <w:r>
+        <w:t xml:space="preserve"> </w:t>
+      </w:r>
+      <w:r>
+        <w:rPr>
+          <w:rFonts w:hint="eastAsia"/>
+        </w:rPr>
+        <w:t>그렇다면 내용과 함께 화면이 나오는 것을 확인할 수 있다.</w:t>
+      </w:r>
+    </w:p>
+    <w:p>
+      <w:r>
+        <w:rPr>
+          <w:noProof/>
+        </w:rPr>
+        <w:drawing>
+          <wp:inline distT="0" distB="0" distL="0" distR="0" wp14:anchorId="129F8C1C" wp14:editId="0DCED91B">
+            <wp:extent cx="2629267" cy="752580"/>
+            <wp:effectExtent l="0" t="0" r="0" b="9525"/>
+            <wp:docPr id="943143053" name="그림 1"/>
+            <wp:cNvGraphicFramePr>
+              <a:graphicFrameLocks xmlns:a="http://schemas.openxmlformats.org/drawingml/2006/main" noChangeAspect="1"/>
+            </wp:cNvGraphicFramePr>
+            <a:graphic xmlns:a="http://schemas.openxmlformats.org/drawingml/2006/main">
+              <a:graphicData uri="http://schemas.openxmlformats.org/drawingml/2006/picture">
+                <pic:pic xmlns:pic="http://schemas.openxmlformats.org/drawingml/2006/picture">
+                  <pic:nvPicPr>
+                    <pic:cNvPr id="943143053" name=""/>
+                    <pic:cNvPicPr/>
+                  </pic:nvPicPr>
+                  <pic:blipFill>
+                    <a:blip r:embed="rId44"/>
+                    <a:stretch>
+                      <a:fillRect/>
+                    </a:stretch>
+                  </pic:blipFill>
+                  <pic:spPr>
+                    <a:xfrm>
+                      <a:off x="0" y="0"/>
+                      <a:ext cx="2629267" cy="752580"/>
+                    </a:xfrm>
+                    <a:prstGeom prst="rect">
+                      <a:avLst/>
+                    </a:prstGeom>
+                  </pic:spPr>
+                </pic:pic>
+              </a:graphicData>
+            </a:graphic>
+          </wp:inline>
+        </w:drawing>
+      </w:r>
+    </w:p>
+    <w:p/>
+    <w:p>
+      <w:pPr>
+        <w:pStyle w:val="1"/>
+      </w:pPr>
+      <w:r>
+        <w:rPr>
+          <w:rFonts w:hint="eastAsia"/>
+        </w:rPr>
+        <w:t>[참고 자료]</w:t>
+      </w:r>
+      <w:r>
+        <w:t xml:space="preserve"> AWS EC2</w:t>
+      </w:r>
+      <w:r>
+        <w:rPr>
+          <w:rFonts w:hint="eastAsia"/>
+        </w:rPr>
+        <w:t>가 멈추거나 버벅거릴 경우 대처 방법</w:t>
+      </w:r>
+    </w:p>
+    <w:p>
+      <w:r>
+        <w:rPr>
+          <w:rFonts w:hint="eastAsia"/>
+        </w:rPr>
+        <w:t>E</w:t>
+      </w:r>
+      <w:r>
+        <w:t xml:space="preserve">C2 </w:t>
+      </w:r>
+      <w:r>
+        <w:rPr>
+          <w:rFonts w:hint="eastAsia"/>
+        </w:rPr>
+        <w:t xml:space="preserve">인스턴스의 사양이 부족하여 </w:t>
+      </w:r>
+      <w:r>
+        <w:t>EC2</w:t>
+      </w:r>
+      <w:r>
+        <w:rPr>
+          <w:rFonts w:hint="eastAsia"/>
+        </w:rPr>
+        <w:t>가 멈추거나 버벅거리거나 빌드 작업이 끝나지 않는 현상들이 발생할 수 있다.</w:t>
+      </w:r>
+      <w:r>
+        <w:t xml:space="preserve"> </w:t>
+      </w:r>
+      <w:r>
+        <w:rPr>
+          <w:rFonts w:hint="eastAsia"/>
+        </w:rPr>
+        <w:t>그럴 경우 아래 링크를 참고하여 대처하는 것을 추천한다.</w:t>
+      </w:r>
+    </w:p>
+    <w:p>
+      <w:r>
+        <w:t>https://velog.io/@shawnhansh/AWS-EC2-%EB%A9%94%EB%AA%A8%EB%A6%AC-%EC%8A%A4%EC%99%91</w:t>
+      </w:r>
+    </w:p>
+    <w:p/>
+    <w:p>
+      <w:pPr>
+        <w:pStyle w:val="1"/>
+      </w:pPr>
+      <w:r>
+        <w:rPr>
+          <w:rFonts w:hint="eastAsia"/>
+        </w:rPr>
+        <w:t>[보충 강의</w:t>
+      </w:r>
+      <w:r>
+        <w:t xml:space="preserve">] 7-2. Spring Boot </w:t>
+      </w:r>
+      <w:r>
+        <w:rPr>
+          <w:rFonts w:hint="eastAsia"/>
+        </w:rPr>
+        <w:t xml:space="preserve">서버를 </w:t>
+      </w:r>
+      <w:r>
+        <w:t>EC2</w:t>
+      </w:r>
+      <w:r>
+        <w:rPr>
+          <w:rFonts w:hint="eastAsia"/>
+        </w:rPr>
+        <w:t>에 배포하기</w:t>
+      </w:r>
+    </w:p>
+    <w:p>
+      <w:pPr>
+        <w:pStyle w:val="2"/>
+      </w:pPr>
+      <w:r>
+        <w:rPr>
+          <w:rFonts w:hint="eastAsia"/>
+        </w:rPr>
+        <w:t>U</w:t>
+      </w:r>
+      <w:r>
+        <w:t xml:space="preserve">buntu </w:t>
+      </w:r>
+      <w:r>
+        <w:rPr>
+          <w:rFonts w:hint="eastAsia"/>
+        </w:rPr>
+        <w:t xml:space="preserve">환경에서 </w:t>
+      </w:r>
+      <w:r>
+        <w:t xml:space="preserve">JDK </w:t>
+      </w:r>
+      <w:r>
+        <w:rPr>
+          <w:rFonts w:hint="eastAsia"/>
+        </w:rPr>
+        <w:t>설치하기</w:t>
+      </w:r>
+    </w:p>
+    <w:p>
+      <w:r>
+        <w:t>Spring Boot는 3.x.x 버전을 사용할 예정이고, JDK는 17버전을 사용할 예정이다. 그에 맞게 환경을 설치해보자.</w:t>
+      </w:r>
+    </w:p>
+    <w:p>
+      <w:r>
+        <w:t xml:space="preserve">$ sudo apt update &amp;&amp; / </w:t>
+      </w:r>
+    </w:p>
+    <w:p>
+      <w:r>
+        <w:t>sudo apt install openjdk-17-jdk -y</w:t>
+      </w:r>
+    </w:p>
+    <w:p/>
+    <w:p>
+      <w:pPr>
+        <w:pStyle w:val="2"/>
+      </w:pPr>
+      <w:r>
+        <w:rPr>
+          <w:rFonts w:hint="eastAsia"/>
+        </w:rPr>
+        <w:t>설치 확인하기</w:t>
+      </w:r>
+    </w:p>
+    <w:p>
+      <w:r>
+        <w:t>$ java -version</w:t>
+      </w:r>
+    </w:p>
+    <w:p>
+      <w:r>
+        <w:drawing>
+          <wp:inline distT="0" distB="0" distL="0" distR="0" wp14:anchorId="646656CC" wp14:editId="18FCA63C">
+            <wp:extent cx="5731510" cy="608330"/>
+            <wp:effectExtent l="0" t="0" r="2540" b="1270"/>
+            <wp:docPr id="1089167447" name="그림 1"/>
+            <wp:cNvGraphicFramePr>
+              <a:graphicFrameLocks xmlns:a="http://schemas.openxmlformats.org/drawingml/2006/main" noChangeAspect="1"/>
+            </wp:cNvGraphicFramePr>
+            <a:graphic xmlns:a="http://schemas.openxmlformats.org/drawingml/2006/main">
+              <a:graphicData uri="http://schemas.openxmlformats.org/drawingml/2006/picture">
+                <pic:pic xmlns:pic="http://schemas.openxmlformats.org/drawingml/2006/picture">
+                  <pic:nvPicPr>
+                    <pic:cNvPr id="1089167447" name=""/>
+                    <pic:cNvPicPr/>
+                  </pic:nvPicPr>
+                  <pic:blipFill>
+                    <a:blip r:embed="rId45"/>
+                    <a:stretch>
+                      <a:fillRect/>
+                    </a:stretch>
+                  </pic:blipFill>
+                  <pic:spPr>
+                    <a:xfrm>
+                      <a:off x="0" y="0"/>
+                      <a:ext cx="5731510" cy="608330"/>
+                    </a:xfrm>
+                    <a:prstGeom prst="rect">
+                      <a:avLst/>
+                    </a:prstGeom>
+                  </pic:spPr>
+                </pic:pic>
+              </a:graphicData>
+            </a:graphic>
+          </wp:inline>
+        </w:drawing>
+      </w:r>
+    </w:p>
+    <w:p/>
+    <w:p>
+      <w:pPr>
+        <w:pStyle w:val="2"/>
+      </w:pPr>
+      <w:r>
+        <w:rPr>
+          <w:rFonts w:hint="eastAsia"/>
+        </w:rPr>
+        <w:t>G</w:t>
+      </w:r>
+      <w:r>
+        <w:t>ithub</w:t>
+      </w:r>
+      <w:r>
+        <w:rPr>
+          <w:rFonts w:hint="eastAsia"/>
+        </w:rPr>
+        <w:t xml:space="preserve">에서 </w:t>
+      </w:r>
+      <w:r>
+        <w:t xml:space="preserve">Spring Boot </w:t>
+      </w:r>
+      <w:r>
+        <w:rPr>
+          <w:rFonts w:hint="eastAsia"/>
+        </w:rPr>
+        <w:t xml:space="preserve">프로젝트 </w:t>
+      </w:r>
+      <w:r>
+        <w:t>clone</w:t>
+      </w:r>
+      <w:r>
+        <w:rPr>
+          <w:rFonts w:hint="eastAsia"/>
+        </w:rPr>
+        <w:t>하기</w:t>
+      </w:r>
+    </w:p>
+    <w:p>
+      <w:r>
+        <w:t>$ git clone https://github.com/JSCODE-EDU/ec2-spring-boot-sample.git</w:t>
+      </w:r>
+    </w:p>
+    <w:p>
+      <w:r>
+        <w:t>$ cd ec2-spring-boot-sample</w:t>
+      </w:r>
+    </w:p>
+    <w:p>
+      <w:r>
+        <w:drawing>
+          <wp:inline distT="0" distB="0" distL="0" distR="0" wp14:anchorId="25B34B6F" wp14:editId="31BBD7CA">
+            <wp:extent cx="5731510" cy="1360805"/>
+            <wp:effectExtent l="0" t="0" r="2540" b="0"/>
+            <wp:docPr id="641327436" name="그림 1"/>
+            <wp:cNvGraphicFramePr>
+              <a:graphicFrameLocks xmlns:a="http://schemas.openxmlformats.org/drawingml/2006/main" noChangeAspect="1"/>
+            </wp:cNvGraphicFramePr>
+            <a:graphic xmlns:a="http://schemas.openxmlformats.org/drawingml/2006/main">
+              <a:graphicData uri="http://schemas.openxmlformats.org/drawingml/2006/picture">
+                <pic:pic xmlns:pic="http://schemas.openxmlformats.org/drawingml/2006/picture">
+                  <pic:nvPicPr>
+                    <pic:cNvPr id="641327436" name=""/>
+                    <pic:cNvPicPr/>
+                  </pic:nvPicPr>
+                  <pic:blipFill>
+                    <a:blip r:embed="rId46"/>
+                    <a:stretch>
+                      <a:fillRect/>
+                    </a:stretch>
+                  </pic:blipFill>
+                  <pic:spPr>
+                    <a:xfrm>
+                      <a:off x="0" y="0"/>
+                      <a:ext cx="5731510" cy="1360805"/>
+                    </a:xfrm>
+                    <a:prstGeom prst="rect">
+                      <a:avLst/>
+                    </a:prstGeom>
+                  </pic:spPr>
+                </pic:pic>
+              </a:graphicData>
+            </a:graphic>
+          </wp:inline>
+        </w:drawing>
+      </w:r>
+    </w:p>
+    <w:p/>
+    <w:p>
+      <w:pPr>
+        <w:pStyle w:val="2"/>
+      </w:pPr>
+      <w:r>
+        <w:rPr>
+          <w:rFonts w:hint="eastAsia"/>
+        </w:rPr>
+        <w:t>a</w:t>
+      </w:r>
+      <w:r>
+        <w:t xml:space="preserve">pplication.yml </w:t>
+      </w:r>
+      <w:r>
+        <w:rPr>
+          <w:rFonts w:hint="eastAsia"/>
+        </w:rPr>
+        <w:t>파일 직접 만들기</w:t>
+      </w:r>
+    </w:p>
+    <w:p>
+      <w:r>
+        <w:t>application.yml와 같은 민감한 정보가 포함된 파일은 Git으로 버전 관리를 하지 않는게 일반적이다. 따라서 application.yml 파일은 별도로 EC2 인스턴스에 올려주어야 한다. 하지만 application.yml 파일을 EC2 인스턴스에 올리는 작업보다는, application.yml 파일을 직접 만드는 게 훨씬 간단하다.</w:t>
+      </w:r>
+    </w:p>
+    <w:p>
+      <w:r>
+        <w:t>src/main/resources/</w:t>
+      </w:r>
+      <w:r>
+        <w:t xml:space="preserve"> </w:t>
+      </w:r>
+      <w:r>
+        <w:rPr>
+          <w:rFonts w:hint="eastAsia"/>
+        </w:rPr>
+        <w:t xml:space="preserve">경로에 </w:t>
+      </w:r>
+      <w:r>
+        <w:t>application.yml</w:t>
+      </w:r>
+      <w:r>
+        <w:t xml:space="preserve"> </w:t>
+      </w:r>
+      <w:r>
+        <w:rPr>
+          <w:rFonts w:hint="eastAsia"/>
+        </w:rPr>
+        <w:t>파일을 만들어주도록 하자.</w:t>
+      </w:r>
+    </w:p>
+    <w:p>
+      <w:r>
+        <w:t>$ vi application.yml</w:t>
+      </w:r>
+    </w:p>
+    <w:p>
+      <w:r>
+        <w:t>server:</w:t>
+      </w:r>
+    </w:p>
+    <w:p>
+      <w:pPr>
+        <w:ind w:firstLine="195"/>
+        <w:rPr>
+          <w:rFonts w:hint="eastAsia"/>
+        </w:rPr>
+      </w:pPr>
+      <w:r>
+        <w:t>port: 80</w:t>
+      </w:r>
+    </w:p>
+    <w:p/>
+    <w:p>
+      <w:pPr>
+        <w:pStyle w:val="2"/>
+      </w:pPr>
+      <w:r>
+        <w:rPr>
+          <w:rFonts w:hint="eastAsia"/>
+        </w:rPr>
+        <w:t>서버 실행시키기</w:t>
+      </w:r>
+    </w:p>
+    <w:p>
+      <w:pPr>
+        <w:rPr>
+          <w:rFonts w:hint="eastAsia"/>
+        </w:rPr>
+      </w:pPr>
+      <w:r>
+        <w:rPr>
+          <w:rFonts w:hint="eastAsia"/>
+        </w:rPr>
+        <w:t>프로젝트 폴더 최상단으로 이동 후 아래 명령어들을 실행한다.</w:t>
+      </w:r>
+    </w:p>
+    <w:p>
+      <w:r>
+        <w:lastRenderedPageBreak/>
+        <w:t>$ ./gradlew clean build # 기존 빌드된 파일을 삭제하고 새롭게 JAR로 빌드</w:t>
+      </w:r>
+    </w:p>
+    <w:p>
+      <w:r>
+        <w:t>$ cd ~/ec2-spring-boot-sample/build/libs</w:t>
+      </w:r>
+    </w:p>
+    <w:p>
+      <w:r>
+        <w:t>$ sudo java -jar ec2-spring-boot-sample-0.0.1-SNAPSHOT.jar</w:t>
+      </w:r>
+    </w:p>
+    <w:p>
+      <w:r>
+        <w:drawing>
+          <wp:inline distT="0" distB="0" distL="0" distR="0" wp14:anchorId="26869FDA" wp14:editId="584ECA8F">
+            <wp:extent cx="5731510" cy="1676400"/>
+            <wp:effectExtent l="0" t="0" r="2540" b="0"/>
+            <wp:docPr id="571900775" name="그림 1"/>
+            <wp:cNvGraphicFramePr>
+              <a:graphicFrameLocks xmlns:a="http://schemas.openxmlformats.org/drawingml/2006/main" noChangeAspect="1"/>
+            </wp:cNvGraphicFramePr>
+            <a:graphic xmlns:a="http://schemas.openxmlformats.org/drawingml/2006/main">
+              <a:graphicData uri="http://schemas.openxmlformats.org/drawingml/2006/picture">
+                <pic:pic xmlns:pic="http://schemas.openxmlformats.org/drawingml/2006/picture">
+                  <pic:nvPicPr>
+                    <pic:cNvPr id="571900775" name=""/>
+                    <pic:cNvPicPr/>
+                  </pic:nvPicPr>
+                  <pic:blipFill>
+                    <a:blip r:embed="rId47"/>
+                    <a:stretch>
+                      <a:fillRect/>
+                    </a:stretch>
+                  </pic:blipFill>
+                  <pic:spPr>
+                    <a:xfrm>
+                      <a:off x="0" y="0"/>
+                      <a:ext cx="5731510" cy="1676400"/>
+                    </a:xfrm>
+                    <a:prstGeom prst="rect">
+                      <a:avLst/>
+                    </a:prstGeom>
+                  </pic:spPr>
+                </pic:pic>
+              </a:graphicData>
+            </a:graphic>
+          </wp:inline>
+        </w:drawing>
+      </w:r>
+    </w:p>
+    <w:p>
+      <w:r>
+        <w:rPr>
+          <w:rFonts w:hint="eastAsia"/>
+        </w:rPr>
+        <w:t>참고</w:t>
+      </w:r>
+      <w:r>
+        <w:t>) 백그라운드에서 Spring Boot 실행시키기</w:t>
+      </w:r>
+    </w:p>
+    <w:p>
+      <w:r>
+        <w:t>$ sudo nohup java -jar ec2-spring-boot-sample-0.0.1-SNAPSHOT.jar &amp;</w:t>
+      </w:r>
+    </w:p>
+    <w:p/>
+    <w:p>
+      <w:pPr>
+        <w:pStyle w:val="2"/>
+      </w:pPr>
+      <w:r>
+        <w:rPr>
+          <w:rFonts w:hint="eastAsia"/>
+        </w:rPr>
+        <w:t>작동 확인하기</w:t>
+      </w:r>
+    </w:p>
+    <w:p>
+      <w:pPr>
+        <w:rPr>
+          <w:rFonts w:hint="eastAsia"/>
+        </w:rPr>
+      </w:pPr>
+      <w:r>
+        <w:rPr>
+          <w:rFonts w:hint="eastAsia"/>
+        </w:rPr>
+        <w:t xml:space="preserve">실행이 되었다면 자신의 </w:t>
+      </w:r>
+      <w:r>
+        <w:t>EC2</w:t>
+      </w:r>
+      <w:r>
+        <w:rPr>
+          <w:rFonts w:hint="eastAsia"/>
+        </w:rPr>
+        <w:t xml:space="preserve">의 </w:t>
+      </w:r>
+      <w:r>
+        <w:t xml:space="preserve">IP </w:t>
+      </w:r>
+      <w:r>
+        <w:rPr>
+          <w:rFonts w:hint="eastAsia"/>
+        </w:rPr>
+        <w:t>주소를 인터넷 브라우저를 통해 접속해보자.</w:t>
+      </w:r>
+      <w:r>
+        <w:t xml:space="preserve"> </w:t>
+      </w:r>
+      <w:r>
+        <w:rPr>
+          <w:rFonts w:hint="eastAsia"/>
+        </w:rPr>
+        <w:t>그렇다면 내용과 함께 화면이 나오는 것을 확인할 수 있다.</w:t>
+      </w:r>
+    </w:p>
+    <w:p>
+      <w:pPr>
+        <w:rPr>
+          <w:rFonts w:hint="eastAsia"/>
+        </w:rPr>
+      </w:pPr>
+      <w:r>
+        <w:drawing>
+          <wp:inline distT="0" distB="0" distL="0" distR="0" wp14:anchorId="23BC2B8B" wp14:editId="459BC19E">
+            <wp:extent cx="5731510" cy="1711960"/>
+            <wp:effectExtent l="0" t="0" r="2540" b="2540"/>
+            <wp:docPr id="809572133" name="그림 1"/>
+            <wp:cNvGraphicFramePr>
+              <a:graphicFrameLocks xmlns:a="http://schemas.openxmlformats.org/drawingml/2006/main" noChangeAspect="1"/>
+            </wp:cNvGraphicFramePr>
+            <a:graphic xmlns:a="http://schemas.openxmlformats.org/drawingml/2006/main">
+              <a:graphicData uri="http://schemas.openxmlformats.org/drawingml/2006/picture">
+                <pic:pic xmlns:pic="http://schemas.openxmlformats.org/drawingml/2006/picture">
+                  <pic:nvPicPr>
+                    <pic:cNvPr id="809572133" name=""/>
+                    <pic:cNvPicPr/>
+                  </pic:nvPicPr>
+                  <pic:blipFill>
+                    <a:blip r:embed="rId48"/>
+                    <a:stretch>
+                      <a:fillRect/>
+                    </a:stretch>
+                  </pic:blipFill>
+                  <pic:spPr>
+                    <a:xfrm>
+                      <a:off x="0" y="0"/>
+                      <a:ext cx="5731510" cy="1711960"/>
+                    </a:xfrm>
+                    <a:prstGeom prst="rect">
+                      <a:avLst/>
+                    </a:prstGeom>
+                  </pic:spPr>
+                </pic:pic>
+              </a:graphicData>
+            </a:graphic>
+          </wp:inline>
+        </w:drawing>
+      </w:r>
+    </w:p>
+    <w:p/>
+    <w:p>
+      <w:pPr>
+        <w:pStyle w:val="1"/>
+      </w:pPr>
+      <w:r>
+        <w:rPr>
+          <w:rFonts w:hint="eastAsia"/>
+        </w:rPr>
+        <w:lastRenderedPageBreak/>
+        <w:t xml:space="preserve">비용 나가지 않게 </w:t>
+      </w:r>
+      <w:r>
+        <w:t xml:space="preserve">EC2 </w:t>
+      </w:r>
+      <w:r>
+        <w:rPr>
+          <w:rFonts w:hint="eastAsia"/>
+        </w:rPr>
+        <w:t>깔끔하게 종료하기</w:t>
+      </w:r>
+    </w:p>
+    <w:p>
+      <w:pPr>
+        <w:pStyle w:val="2"/>
+      </w:pPr>
+      <w:r>
+        <w:rPr>
+          <w:rFonts w:hint="eastAsia"/>
+        </w:rPr>
+        <w:t>E</w:t>
+      </w:r>
+      <w:r>
+        <w:t xml:space="preserve">C2 </w:t>
+      </w:r>
+      <w:r>
+        <w:rPr>
+          <w:rFonts w:hint="eastAsia"/>
+        </w:rPr>
+        <w:t>인스턴스 종료하기</w:t>
+      </w:r>
+    </w:p>
+    <w:p>
+      <w:r>
+        <w:drawing>
+          <wp:inline distT="0" distB="0" distL="0" distR="0" wp14:anchorId="09066210" wp14:editId="54ECB3E3">
+            <wp:extent cx="2095792" cy="1781424"/>
+            <wp:effectExtent l="0" t="0" r="0" b="9525"/>
+            <wp:docPr id="1172577921" name="그림 1"/>
+            <wp:cNvGraphicFramePr>
+              <a:graphicFrameLocks xmlns:a="http://schemas.openxmlformats.org/drawingml/2006/main" noChangeAspect="1"/>
+            </wp:cNvGraphicFramePr>
+            <a:graphic xmlns:a="http://schemas.openxmlformats.org/drawingml/2006/main">
+              <a:graphicData uri="http://schemas.openxmlformats.org/drawingml/2006/picture">
+                <pic:pic xmlns:pic="http://schemas.openxmlformats.org/drawingml/2006/picture">
+                  <pic:nvPicPr>
+                    <pic:cNvPr id="1172577921" name=""/>
+                    <pic:cNvPicPr/>
+                  </pic:nvPicPr>
+                  <pic:blipFill>
+                    <a:blip r:embed="rId49"/>
+                    <a:stretch>
+                      <a:fillRect/>
+                    </a:stretch>
+                  </pic:blipFill>
+                  <pic:spPr>
+                    <a:xfrm>
+                      <a:off x="0" y="0"/>
+                      <a:ext cx="2095792" cy="1781424"/>
+                    </a:xfrm>
+                    <a:prstGeom prst="rect">
+                      <a:avLst/>
+                    </a:prstGeom>
+                  </pic:spPr>
+                </pic:pic>
+              </a:graphicData>
+            </a:graphic>
+          </wp:inline>
+        </w:drawing>
+      </w:r>
+    </w:p>
+    <w:p/>
+    <w:p>
+      <w:pPr>
+        <w:pStyle w:val="2"/>
+      </w:pPr>
+      <w:r>
+        <w:rPr>
+          <w:rFonts w:hint="eastAsia"/>
+        </w:rPr>
+        <w:t xml:space="preserve">탄력적 </w:t>
+      </w:r>
+      <w:r>
+        <w:t xml:space="preserve">IP </w:t>
+      </w:r>
+      <w:r>
+        <w:rPr>
+          <w:rFonts w:hint="eastAsia"/>
+        </w:rPr>
+        <w:t>릴리스하기</w:t>
+      </w:r>
+    </w:p>
+    <w:p>
+      <w:r>
+        <w:drawing>
+          <wp:inline distT="0" distB="0" distL="0" distR="0" wp14:anchorId="3D6FA6FD" wp14:editId="7F66005D">
+            <wp:extent cx="2000529" cy="2600688"/>
+            <wp:effectExtent l="0" t="0" r="0" b="9525"/>
+            <wp:docPr id="955957475" name="그림 1"/>
+            <wp:cNvGraphicFramePr>
+              <a:graphicFrameLocks xmlns:a="http://schemas.openxmlformats.org/drawingml/2006/main" noChangeAspect="1"/>
+            </wp:cNvGraphicFramePr>
+            <a:graphic xmlns:a="http://schemas.openxmlformats.org/drawingml/2006/main">
+              <a:graphicData uri="http://schemas.openxmlformats.org/drawingml/2006/picture">
+                <pic:pic xmlns:pic="http://schemas.openxmlformats.org/drawingml/2006/picture">
+                  <pic:nvPicPr>
+                    <pic:cNvPr id="955957475" name=""/>
+                    <pic:cNvPicPr/>
+                  </pic:nvPicPr>
+                  <pic:blipFill>
+                    <a:blip r:embed="rId50"/>
+                    <a:stretch>
+                      <a:fillRect/>
+                    </a:stretch>
+                  </pic:blipFill>
+                  <pic:spPr>
+                    <a:xfrm>
+                      <a:off x="0" y="0"/>
+                      <a:ext cx="2000529" cy="2600688"/>
+                    </a:xfrm>
+                    <a:prstGeom prst="rect">
+                      <a:avLst/>
+                    </a:prstGeom>
+                  </pic:spPr>
+                </pic:pic>
+              </a:graphicData>
+            </a:graphic>
+          </wp:inline>
+        </w:drawing>
+      </w:r>
+    </w:p>
+    <w:p>
+      <w:pPr>
+        <w:rPr>
+          <w:rFonts w:hint="eastAsia"/>
+        </w:rPr>
+      </w:pPr>
+      <w:r>
+        <w:drawing>
+          <wp:inline distT="0" distB="0" distL="0" distR="0" wp14:anchorId="592C87E1" wp14:editId="6E8D8C8E">
+            <wp:extent cx="5731510" cy="1783080"/>
+            <wp:effectExtent l="0" t="0" r="2540" b="7620"/>
+            <wp:docPr id="1422609995" name="그림 1"/>
+            <wp:cNvGraphicFramePr>
+              <a:graphicFrameLocks xmlns:a="http://schemas.openxmlformats.org/drawingml/2006/main" noChangeAspect="1"/>
+            </wp:cNvGraphicFramePr>
+            <a:graphic xmlns:a="http://schemas.openxmlformats.org/drawingml/2006/main">
+              <a:graphicData uri="http://schemas.openxmlformats.org/drawingml/2006/picture">
+                <pic:pic xmlns:pic="http://schemas.openxmlformats.org/drawingml/2006/picture">
+                  <pic:nvPicPr>
+                    <pic:cNvPr id="1422609995" name=""/>
+                    <pic:cNvPicPr/>
+                  </pic:nvPicPr>
+                  <pic:blipFill>
+                    <a:blip r:embed="rId51"/>
+                    <a:stretch>
+                      <a:fillRect/>
+                    </a:stretch>
+                  </pic:blipFill>
+                  <pic:spPr>
+                    <a:xfrm>
+                      <a:off x="0" y="0"/>
+                      <a:ext cx="5731510" cy="1783080"/>
+                    </a:xfrm>
+                    <a:prstGeom prst="rect">
+                      <a:avLst/>
+                    </a:prstGeom>
+                  </pic:spPr>
+                </pic:pic>
+              </a:graphicData>
+            </a:graphic>
+          </wp:inline>
+        </w:drawing>
+      </w:r>
+    </w:p>
+    <w:p/>
+    <w:p>
+      <w:pPr>
+        <w:rPr>
+          <w:rFonts w:hint="eastAsia"/>
+        </w:rPr>
+      </w:pPr>
+    </w:p>
     <w:p/>
     <w:p/>
     <w:p/>
@@ -3304,6 +5751,119 @@
     </w:lvl>
   </w:abstractNum>
   <w:abstractNum w:abstractNumId="1" w15:restartNumberingAfterBreak="0">
+    <w:nsid w:val="1E8D367A"/>
+    <w:multiLevelType w:val="hybridMultilevel"/>
+    <w:tmpl w:val="274AAD22"/>
+    <w:lvl w:ilvl="0" w:tplc="04090001">
+      <w:start w:val="1"/>
+      <w:numFmt w:val="bullet"/>
+      <w:lvlText w:val=""/>
+      <w:lvlJc w:val="left"/>
+      <w:pPr>
+        <w:ind w:left="880" w:hanging="440"/>
+      </w:pPr>
+      <w:rPr>
+        <w:rFonts w:ascii="Wingdings" w:hAnsi="Wingdings" w:hint="default"/>
+      </w:rPr>
+    </w:lvl>
+    <w:lvl w:ilvl="1" w:tplc="04090003" w:tentative="1">
+      <w:start w:val="1"/>
+      <w:numFmt w:val="bullet"/>
+      <w:lvlText w:val=""/>
+      <w:lvlJc w:val="left"/>
+      <w:pPr>
+        <w:ind w:left="1320" w:hanging="440"/>
+      </w:pPr>
+      <w:rPr>
+        <w:rFonts w:ascii="Wingdings" w:hAnsi="Wingdings" w:hint="default"/>
+      </w:rPr>
+    </w:lvl>
+    <w:lvl w:ilvl="2" w:tplc="04090005" w:tentative="1">
+      <w:start w:val="1"/>
+      <w:numFmt w:val="bullet"/>
+      <w:lvlText w:val=""/>
+      <w:lvlJc w:val="left"/>
+      <w:pPr>
+        <w:ind w:left="1760" w:hanging="440"/>
+      </w:pPr>
+      <w:rPr>
+        <w:rFonts w:ascii="Wingdings" w:hAnsi="Wingdings" w:hint="default"/>
+      </w:rPr>
+    </w:lvl>
+    <w:lvl w:ilvl="3" w:tplc="04090001" w:tentative="1">
+      <w:start w:val="1"/>
+      <w:numFmt w:val="bullet"/>
+      <w:lvlText w:val=""/>
+      <w:lvlJc w:val="left"/>
+      <w:pPr>
+        <w:ind w:left="2200" w:hanging="440"/>
+      </w:pPr>
+      <w:rPr>
+        <w:rFonts w:ascii="Wingdings" w:hAnsi="Wingdings" w:hint="default"/>
+      </w:rPr>
+    </w:lvl>
+    <w:lvl w:ilvl="4" w:tplc="04090003" w:tentative="1">
+      <w:start w:val="1"/>
+      <w:numFmt w:val="bullet"/>
+      <w:lvlText w:val=""/>
+      <w:lvlJc w:val="left"/>
+      <w:pPr>
+        <w:ind w:left="2640" w:hanging="440"/>
+      </w:pPr>
+      <w:rPr>
+        <w:rFonts w:ascii="Wingdings" w:hAnsi="Wingdings" w:hint="default"/>
+      </w:rPr>
+    </w:lvl>
+    <w:lvl w:ilvl="5" w:tplc="04090005" w:tentative="1">
+      <w:start w:val="1"/>
+      <w:numFmt w:val="bullet"/>
+      <w:lvlText w:val=""/>
+      <w:lvlJc w:val="left"/>
+      <w:pPr>
+        <w:ind w:left="3080" w:hanging="440"/>
+      </w:pPr>
+      <w:rPr>
+        <w:rFonts w:ascii="Wingdings" w:hAnsi="Wingdings" w:hint="default"/>
+      </w:rPr>
+    </w:lvl>
+    <w:lvl w:ilvl="6" w:tplc="04090001" w:tentative="1">
+      <w:start w:val="1"/>
+      <w:numFmt w:val="bullet"/>
+      <w:lvlText w:val=""/>
+      <w:lvlJc w:val="left"/>
+      <w:pPr>
+        <w:ind w:left="3520" w:hanging="440"/>
+      </w:pPr>
+      <w:rPr>
+        <w:rFonts w:ascii="Wingdings" w:hAnsi="Wingdings" w:hint="default"/>
+      </w:rPr>
+    </w:lvl>
+    <w:lvl w:ilvl="7" w:tplc="04090003" w:tentative="1">
+      <w:start w:val="1"/>
+      <w:numFmt w:val="bullet"/>
+      <w:lvlText w:val=""/>
+      <w:lvlJc w:val="left"/>
+      <w:pPr>
+        <w:ind w:left="3960" w:hanging="440"/>
+      </w:pPr>
+      <w:rPr>
+        <w:rFonts w:ascii="Wingdings" w:hAnsi="Wingdings" w:hint="default"/>
+      </w:rPr>
+    </w:lvl>
+    <w:lvl w:ilvl="8" w:tplc="04090005" w:tentative="1">
+      <w:start w:val="1"/>
+      <w:numFmt w:val="bullet"/>
+      <w:lvlText w:val=""/>
+      <w:lvlJc w:val="left"/>
+      <w:pPr>
+        <w:ind w:left="4400" w:hanging="440"/>
+      </w:pPr>
+      <w:rPr>
+        <w:rFonts w:ascii="Wingdings" w:hAnsi="Wingdings" w:hint="default"/>
+      </w:rPr>
+    </w:lvl>
+  </w:abstractNum>
+  <w:abstractNum w:abstractNumId="2" w15:restartNumberingAfterBreak="0">
     <w:nsid w:val="24F8672C"/>
     <w:multiLevelType w:val="hybridMultilevel"/>
     <w:tmpl w:val="F368A258"/>
@@ -3392,7 +5952,7 @@
       </w:pPr>
     </w:lvl>
   </w:abstractNum>
-  <w:abstractNum w:abstractNumId="2" w15:restartNumberingAfterBreak="0">
+  <w:abstractNum w:abstractNumId="3" w15:restartNumberingAfterBreak="0">
     <w:nsid w:val="645B45D2"/>
     <w:multiLevelType w:val="hybridMultilevel"/>
     <w:tmpl w:val="11428168"/>
@@ -3481,7 +6041,7 @@
       </w:pPr>
     </w:lvl>
   </w:abstractNum>
-  <w:abstractNum w:abstractNumId="3" w15:restartNumberingAfterBreak="0">
+  <w:abstractNum w:abstractNumId="4" w15:restartNumberingAfterBreak="0">
     <w:nsid w:val="6C4E3AC8"/>
     <w:multiLevelType w:val="hybridMultilevel"/>
     <w:tmpl w:val="1F7A0E02"/>
@@ -3570,7 +6130,7 @@
       </w:pPr>
     </w:lvl>
   </w:abstractNum>
-  <w:abstractNum w:abstractNumId="4" w15:restartNumberingAfterBreak="0">
+  <w:abstractNum w:abstractNumId="5" w15:restartNumberingAfterBreak="0">
     <w:nsid w:val="6C6648B1"/>
     <w:multiLevelType w:val="hybridMultilevel"/>
     <w:tmpl w:val="D8C0018A"/>
@@ -3663,16 +6223,19 @@
     <w:abstractNumId w:val="0"/>
   </w:num>
   <w:num w:numId="2" w16cid:durableId="2050064200">
+    <w:abstractNumId w:val="5"/>
+  </w:num>
+  <w:num w:numId="3" w16cid:durableId="334042425">
+    <w:abstractNumId w:val="2"/>
+  </w:num>
+  <w:num w:numId="4" w16cid:durableId="1053312061">
     <w:abstractNumId w:val="4"/>
   </w:num>
-  <w:num w:numId="3" w16cid:durableId="334042425">
-    <w:abstractNumId w:val="1"/>
-  </w:num>
-  <w:num w:numId="4" w16cid:durableId="1053312061">
+  <w:num w:numId="5" w16cid:durableId="1921674037">
     <w:abstractNumId w:val="3"/>
   </w:num>
-  <w:num w:numId="5" w16cid:durableId="1921674037">
-    <w:abstractNumId w:val="2"/>
+  <w:num w:numId="6" w16cid:durableId="319040084">
+    <w:abstractNumId w:val="1"/>
   </w:num>
 </w:numbering>
 </file>
@@ -4076,7 +6639,7 @@
   <w:style w:type="paragraph" w:default="1" w:styleId="a">
     <w:name w:val="Normal"/>
     <w:qFormat/>
-    <w:rsid w:val="00D86AFD"/>
+    <w:rsid w:val="00613341"/>
     <w:pPr>
       <w:widowControl w:val="0"/>
       <w:wordWrap w:val="0"/>

</xml_diff>